<commit_message>
Prioritize lease path for vehicle sprint
</commit_message>
<xml_diff>
--- a/output/docx/VCC_Vehicle_Funding_Close_Packet_DRAFT.docx
+++ b/output/docx/VCC_Vehicle_Funding_Close_Packet_DRAFT.docx
@@ -1181,6 +1181,143 @@
                 <w:color w:val="1F2937"/>
                 <w:sz w:val="18"/>
               </w:rPr>
+              <w:t>Commercial lease preapproval</w:t>
+            </w:r>
+          </w:p>
+        </w:tc>
+        <w:tc>
+          <w:tcPr>
+            <w:tcW w:type="dxa" w:w="1440"/>
+            <w:vAlign w:val="center"/>
+            <w:tcMar>
+              <w:top w:w="80" w:type="dxa"/>
+              <w:start w:w="120" w:type="dxa"/>
+              <w:bottom w:w="80" w:type="dxa"/>
+              <w:end w:w="120" w:type="dxa"/>
+            </w:tcMar>
+          </w:tcPr>
+          <w:p>
+            <w:pPr>
+              <w:spacing w:after="0" w:line="276" w:lineRule="auto"/>
+            </w:pPr>
+            <w:r/>
+            <w:r>
+              <w:rPr>
+                <w:rFonts w:ascii="Calibri" w:hAnsi="Calibri"/>
+                <w:b w:val="0"/>
+                <w:color w:val="1F2937"/>
+                <w:sz w:val="18"/>
+              </w:rPr>
+              <w:t>$999-$1,399 monthly benchmark plus taxes, title, license, freight, insurance deposit, and delivery fees</w:t>
+            </w:r>
+          </w:p>
+        </w:tc>
+        <w:tc>
+          <w:tcPr>
+            <w:tcW w:type="dxa" w:w="2808"/>
+            <w:vAlign w:val="center"/>
+            <w:tcMar>
+              <w:top w:w="80" w:type="dxa"/>
+              <w:start w:w="120" w:type="dxa"/>
+              <w:bottom w:w="80" w:type="dxa"/>
+              <w:end w:w="120" w:type="dxa"/>
+            </w:tcMar>
+          </w:tcPr>
+          <w:p>
+            <w:pPr>
+              <w:spacing w:after="0" w:line="276" w:lineRule="auto"/>
+            </w:pPr>
+            <w:r/>
+            <w:r>
+              <w:rPr>
+                <w:rFonts w:ascii="Calibri" w:hAnsi="Calibri"/>
+                <w:b w:val="0"/>
+                <w:color w:val="1F2937"/>
+                <w:sz w:val="18"/>
+              </w:rPr>
+              <w:t>Written lease/preapproval response showing vehicle class, stock/VIN or available class, total due at delivery, monthly payment, mileage, term, guaranty, required documents, and funding timing</w:t>
+            </w:r>
+          </w:p>
+        </w:tc>
+        <w:tc>
+          <w:tcPr>
+            <w:tcW w:type="dxa" w:w="1440"/>
+            <w:vAlign w:val="center"/>
+            <w:tcMar>
+              <w:top w:w="80" w:type="dxa"/>
+              <w:start w:w="120" w:type="dxa"/>
+              <w:bottom w:w="80" w:type="dxa"/>
+              <w:end w:w="120" w:type="dxa"/>
+            </w:tcMar>
+          </w:tcPr>
+          <w:p>
+            <w:pPr>
+              <w:spacing w:after="0" w:line="276" w:lineRule="auto"/>
+            </w:pPr>
+            <w:r/>
+            <w:r>
+              <w:rPr>
+                <w:rFonts w:ascii="Calibri" w:hAnsi="Calibri"/>
+                <w:b w:val="0"/>
+                <w:color w:val="1F2937"/>
+                <w:sz w:val="18"/>
+              </w:rPr>
+              <w:t>Prepared/not committed</w:t>
+            </w:r>
+          </w:p>
+        </w:tc>
+        <w:tc>
+          <w:tcPr>
+            <w:tcW w:type="dxa" w:w="1872"/>
+            <w:vAlign w:val="center"/>
+            <w:tcMar>
+              <w:top w:w="80" w:type="dxa"/>
+              <w:start w:w="120" w:type="dxa"/>
+              <w:bottom w:w="80" w:type="dxa"/>
+              <w:end w:w="120" w:type="dxa"/>
+            </w:tcMar>
+          </w:tcPr>
+          <w:p>
+            <w:pPr>
+              <w:spacing w:after="0" w:line="276" w:lineRule="auto"/>
+            </w:pPr>
+            <w:r/>
+            <w:r>
+              <w:rPr>
+                <w:rFonts w:ascii="Calibri" w:hAnsi="Calibri"/>
+                <w:b w:val="0"/>
+                <w:color w:val="1F2937"/>
+                <w:sz w:val="18"/>
+              </w:rPr>
+              <w:t>Request preliminary fit and current availability before any application or credit pull.</w:t>
+            </w:r>
+          </w:p>
+        </w:tc>
+      </w:tr>
+      <w:tr>
+        <w:tc>
+          <w:tcPr>
+            <w:tcW w:type="dxa" w:w="1800"/>
+            <w:vAlign w:val="center"/>
+            <w:tcMar>
+              <w:top w:w="80" w:type="dxa"/>
+              <w:start w:w="120" w:type="dxa"/>
+              <w:bottom w:w="80" w:type="dxa"/>
+              <w:end w:w="120" w:type="dxa"/>
+            </w:tcMar>
+          </w:tcPr>
+          <w:p>
+            <w:pPr>
+              <w:spacing w:after="0" w:line="276" w:lineRule="auto"/>
+            </w:pPr>
+            <w:r/>
+            <w:r>
+              <w:rPr>
+                <w:rFonts w:ascii="Calibri" w:hAnsi="Calibri"/>
+                <w:b w:val="0"/>
+                <w:color w:val="1F2937"/>
+                <w:sz w:val="18"/>
+              </w:rPr>
               <w:t>Rental bridge support</w:t>
             </w:r>
           </w:p>
@@ -2264,6 +2401,334 @@
                 <w:color w:val="1F2937"/>
                 <w:sz w:val="18"/>
               </w:rPr>
+              <w:t>2A</w:t>
+            </w:r>
+          </w:p>
+        </w:tc>
+        <w:tc>
+          <w:tcPr>
+            <w:tcW w:type="dxa" w:w="1656"/>
+            <w:vAlign w:val="center"/>
+            <w:tcMar>
+              <w:top w:w="80" w:type="dxa"/>
+              <w:start w:w="120" w:type="dxa"/>
+              <w:bottom w:w="80" w:type="dxa"/>
+              <w:end w:w="120" w:type="dxa"/>
+            </w:tcMar>
+          </w:tcPr>
+          <w:p>
+            <w:pPr>
+              <w:spacing w:after="0" w:line="276" w:lineRule="auto"/>
+            </w:pPr>
+            <w:r/>
+            <w:r>
+              <w:rPr>
+                <w:rFonts w:ascii="Calibri" w:hAnsi="Calibri"/>
+                <w:b w:val="0"/>
+                <w:color w:val="1F2937"/>
+                <w:sz w:val="18"/>
+              </w:rPr>
+              <w:t>MobilityWorks Commercial</w:t>
+            </w:r>
+          </w:p>
+        </w:tc>
+        <w:tc>
+          <w:tcPr>
+            <w:tcW w:type="dxa" w:w="2088"/>
+            <w:vAlign w:val="center"/>
+            <w:tcMar>
+              <w:top w:w="80" w:type="dxa"/>
+              <w:start w:w="120" w:type="dxa"/>
+              <w:bottom w:w="80" w:type="dxa"/>
+              <w:end w:w="120" w:type="dxa"/>
+            </w:tcMar>
+          </w:tcPr>
+          <w:p>
+            <w:pPr>
+              <w:spacing w:after="0" w:line="276" w:lineRule="auto"/>
+            </w:pPr>
+            <w:r/>
+            <w:r>
+              <w:rPr>
+                <w:rFonts w:ascii="Calibri" w:hAnsi="Calibri"/>
+                <w:b w:val="0"/>
+                <w:color w:val="1F2937"/>
+                <w:sz w:val="18"/>
+              </w:rPr>
+              <w:t>2026 Chrysler Voyager commercial vehicle with BraunAbility rear-entry conversion</w:t>
+            </w:r>
+          </w:p>
+        </w:tc>
+        <w:tc>
+          <w:tcPr>
+            <w:tcW w:type="dxa" w:w="1656"/>
+            <w:vAlign w:val="center"/>
+            <w:tcMar>
+              <w:top w:w="80" w:type="dxa"/>
+              <w:start w:w="120" w:type="dxa"/>
+              <w:bottom w:w="80" w:type="dxa"/>
+              <w:end w:w="120" w:type="dxa"/>
+            </w:tcMar>
+          </w:tcPr>
+          <w:p>
+            <w:pPr>
+              <w:spacing w:after="0" w:line="276" w:lineRule="auto"/>
+            </w:pPr>
+            <w:r/>
+            <w:r>
+              <w:rPr>
+                <w:rFonts w:ascii="Calibri" w:hAnsi="Calibri"/>
+                <w:b w:val="0"/>
+                <w:color w:val="1F2937"/>
+                <w:sz w:val="18"/>
+              </w:rPr>
+              <w:t>Public disclosure lists starting lease benchmarks at $999/month for 48 months with 10,000 miles/year or $1,099/month for 48 months with 20,000 miles/year for well-qualified commercial customers; taxes, title, license, freight, and other fees due at delivery</w:t>
+            </w:r>
+          </w:p>
+        </w:tc>
+        <w:tc>
+          <w:tcPr>
+            <w:tcW w:type="dxa" w:w="1512"/>
+            <w:vAlign w:val="center"/>
+            <w:tcMar>
+              <w:top w:w="80" w:type="dxa"/>
+              <w:start w:w="120" w:type="dxa"/>
+              <w:bottom w:w="80" w:type="dxa"/>
+              <w:end w:w="120" w:type="dxa"/>
+            </w:tcMar>
+          </w:tcPr>
+          <w:p>
+            <w:pPr>
+              <w:spacing w:after="0" w:line="276" w:lineRule="auto"/>
+            </w:pPr>
+            <w:r/>
+            <w:r>
+              <w:rPr>
+                <w:rFonts w:ascii="Calibri" w:hAnsi="Calibri"/>
+                <w:b w:val="0"/>
+                <w:color w:val="1F2937"/>
+                <w:sz w:val="18"/>
+              </w:rPr>
+              <w:t>Lease/preapproval path if commercial credit, insurance, authority, and delivery timing line up by August 9</w:t>
+            </w:r>
+          </w:p>
+        </w:tc>
+        <w:tc>
+          <w:tcPr>
+            <w:tcW w:type="dxa" w:w="1656"/>
+            <w:vAlign w:val="center"/>
+            <w:tcMar>
+              <w:top w:w="80" w:type="dxa"/>
+              <w:start w:w="120" w:type="dxa"/>
+              <w:bottom w:w="80" w:type="dxa"/>
+              <w:end w:w="120" w:type="dxa"/>
+            </w:tcMar>
+          </w:tcPr>
+          <w:p>
+            <w:pPr>
+              <w:spacing w:after="0" w:line="276" w:lineRule="auto"/>
+            </w:pPr>
+            <w:r/>
+            <w:r>
+              <w:rPr>
+                <w:rFonts w:ascii="Calibri" w:hAnsi="Calibri"/>
+                <w:b w:val="0"/>
+                <w:color w:val="1F2937"/>
+                <w:sz w:val="18"/>
+              </w:rPr>
+              <w:t>Ask MobilityWorks Commercial for current Chrysler Voyager lease availability, total due at delivery, credit/preapproval sequence, business-use terms, and timing.</w:t>
+            </w:r>
+          </w:p>
+        </w:tc>
+      </w:tr>
+      <w:tr>
+        <w:tc>
+          <w:tcPr>
+            <w:tcW w:type="dxa" w:w="792"/>
+            <w:vAlign w:val="center"/>
+            <w:tcMar>
+              <w:top w:w="80" w:type="dxa"/>
+              <w:start w:w="120" w:type="dxa"/>
+              <w:bottom w:w="80" w:type="dxa"/>
+              <w:end w:w="120" w:type="dxa"/>
+            </w:tcMar>
+          </w:tcPr>
+          <w:p>
+            <w:pPr>
+              <w:spacing w:after="0" w:line="276" w:lineRule="auto"/>
+            </w:pPr>
+            <w:r/>
+            <w:r>
+              <w:rPr>
+                <w:rFonts w:ascii="Calibri" w:hAnsi="Calibri"/>
+                <w:b w:val="0"/>
+                <w:color w:val="1F2937"/>
+                <w:sz w:val="18"/>
+              </w:rPr>
+              <w:t>2B</w:t>
+            </w:r>
+          </w:p>
+        </w:tc>
+        <w:tc>
+          <w:tcPr>
+            <w:tcW w:type="dxa" w:w="1656"/>
+            <w:vAlign w:val="center"/>
+            <w:tcMar>
+              <w:top w:w="80" w:type="dxa"/>
+              <w:start w:w="120" w:type="dxa"/>
+              <w:bottom w:w="80" w:type="dxa"/>
+              <w:end w:w="120" w:type="dxa"/>
+            </w:tcMar>
+          </w:tcPr>
+          <w:p>
+            <w:pPr>
+              <w:spacing w:after="0" w:line="276" w:lineRule="auto"/>
+            </w:pPr>
+            <w:r/>
+            <w:r>
+              <w:rPr>
+                <w:rFonts w:ascii="Calibri" w:hAnsi="Calibri"/>
+                <w:b w:val="0"/>
+                <w:color w:val="1F2937"/>
+                <w:sz w:val="18"/>
+              </w:rPr>
+              <w:t>MobilityWorks Commercial</w:t>
+            </w:r>
+          </w:p>
+        </w:tc>
+        <w:tc>
+          <w:tcPr>
+            <w:tcW w:type="dxa" w:w="2088"/>
+            <w:vAlign w:val="center"/>
+            <w:tcMar>
+              <w:top w:w="80" w:type="dxa"/>
+              <w:start w:w="120" w:type="dxa"/>
+              <w:bottom w:w="80" w:type="dxa"/>
+              <w:end w:w="120" w:type="dxa"/>
+            </w:tcMar>
+          </w:tcPr>
+          <w:p>
+            <w:pPr>
+              <w:spacing w:after="0" w:line="276" w:lineRule="auto"/>
+            </w:pPr>
+            <w:r/>
+            <w:r>
+              <w:rPr>
+                <w:rFonts w:ascii="Calibri" w:hAnsi="Calibri"/>
+                <w:b w:val="0"/>
+                <w:color w:val="1F2937"/>
+                <w:sz w:val="18"/>
+              </w:rPr>
+              <w:t>2026 Ford Transit commercial vehicle with Driverge rear-entry or side-entry conversion</w:t>
+            </w:r>
+          </w:p>
+        </w:tc>
+        <w:tc>
+          <w:tcPr>
+            <w:tcW w:type="dxa" w:w="1656"/>
+            <w:vAlign w:val="center"/>
+            <w:tcMar>
+              <w:top w:w="80" w:type="dxa"/>
+              <w:start w:w="120" w:type="dxa"/>
+              <w:bottom w:w="80" w:type="dxa"/>
+              <w:end w:w="120" w:type="dxa"/>
+            </w:tcMar>
+          </w:tcPr>
+          <w:p>
+            <w:pPr>
+              <w:spacing w:after="0" w:line="276" w:lineRule="auto"/>
+            </w:pPr>
+            <w:r/>
+            <w:r>
+              <w:rPr>
+                <w:rFonts w:ascii="Calibri" w:hAnsi="Calibri"/>
+                <w:b w:val="0"/>
+                <w:color w:val="1F2937"/>
+                <w:sz w:val="18"/>
+              </w:rPr>
+              <w:t>Public disclosure lists starting lease benchmarks at $1,299/month for 48 months with 15,000 miles/year or $1,399/month for 48 months with 25,000 miles/year for well-qualified commercial customers; taxes, title, license, freight, and other fees due at delivery</w:t>
+            </w:r>
+          </w:p>
+        </w:tc>
+        <w:tc>
+          <w:tcPr>
+            <w:tcW w:type="dxa" w:w="1512"/>
+            <w:vAlign w:val="center"/>
+            <w:tcMar>
+              <w:top w:w="80" w:type="dxa"/>
+              <w:start w:w="120" w:type="dxa"/>
+              <w:bottom w:w="80" w:type="dxa"/>
+              <w:end w:w="120" w:type="dxa"/>
+            </w:tcMar>
+          </w:tcPr>
+          <w:p>
+            <w:pPr>
+              <w:spacing w:after="0" w:line="276" w:lineRule="auto"/>
+            </w:pPr>
+            <w:r/>
+            <w:r>
+              <w:rPr>
+                <w:rFonts w:ascii="Calibri" w:hAnsi="Calibri"/>
+                <w:b w:val="0"/>
+                <w:color w:val="1F2937"/>
+                <w:sz w:val="18"/>
+              </w:rPr>
+              <w:t>Lease/preapproval path if commercial credit, insurance, authority, and delivery timing line up by August 9</w:t>
+            </w:r>
+          </w:p>
+        </w:tc>
+        <w:tc>
+          <w:tcPr>
+            <w:tcW w:type="dxa" w:w="1656"/>
+            <w:vAlign w:val="center"/>
+            <w:tcMar>
+              <w:top w:w="80" w:type="dxa"/>
+              <w:start w:w="120" w:type="dxa"/>
+              <w:bottom w:w="80" w:type="dxa"/>
+              <w:end w:w="120" w:type="dxa"/>
+            </w:tcMar>
+          </w:tcPr>
+          <w:p>
+            <w:pPr>
+              <w:spacing w:after="0" w:line="276" w:lineRule="auto"/>
+            </w:pPr>
+            <w:r/>
+            <w:r>
+              <w:rPr>
+                <w:rFonts w:ascii="Calibri" w:hAnsi="Calibri"/>
+                <w:b w:val="0"/>
+                <w:color w:val="1F2937"/>
+                <w:sz w:val="18"/>
+              </w:rPr>
+              <w:t>Ask MobilityWorks Commercial for current Ford Transit lease availability, total due at delivery, passenger seating/securement, and Wyoming use timing.</w:t>
+            </w:r>
+          </w:p>
+        </w:tc>
+      </w:tr>
+      <w:tr>
+        <w:tc>
+          <w:tcPr>
+            <w:tcW w:type="dxa" w:w="792"/>
+            <w:vAlign w:val="center"/>
+            <w:tcMar>
+              <w:top w:w="80" w:type="dxa"/>
+              <w:start w:w="120" w:type="dxa"/>
+              <w:bottom w:w="80" w:type="dxa"/>
+              <w:end w:w="120" w:type="dxa"/>
+            </w:tcMar>
+          </w:tcPr>
+          <w:p>
+            <w:pPr>
+              <w:spacing w:after="0" w:line="276" w:lineRule="auto"/>
+            </w:pPr>
+            <w:r/>
+            <w:r>
+              <w:rPr>
+                <w:rFonts w:ascii="Calibri" w:hAnsi="Calibri"/>
+                <w:b w:val="0"/>
+                <w:color w:val="1F2937"/>
+                <w:sz w:val="18"/>
+              </w:rPr>
               <w:t>3</w:t>
             </w:r>
           </w:p>
@@ -3001,7 +3466,7 @@
                 <w:color w:val="1F2937"/>
                 <w:sz w:val="18"/>
               </w:rPr>
-              <w:t>Rates require quote; public page states business/commercial entities can rent with additional insurance requirements</w:t>
+              <w:t>Rates require quote; public rental page lists CO-Denver/Aurora contact path, rental number (877) 275-4915, side-entry/rear-entry accessible vans, tie-downs, and 150 free miles per day</w:t>
             </w:r>
           </w:p>
         </w:tc>
@@ -3055,7 +3520,7 @@
                 <w:color w:val="1F2937"/>
                 <w:sz w:val="18"/>
               </w:rPr>
-              <w:t>Call rental team for August 10-15 availability, business-use rules, insurance requirements, mileage, and pickup/delivery timing.</w:t>
+              <w:t>Call rental team for August 10-15 availability, business-use rules, insurance requirements, mileage, total cost, and pickup/delivery timing.</w:t>
             </w:r>
           </w:p>
         </w:tc>

</xml_diff>

<commit_message>
Add authority and insurance sprint packet
</commit_message>
<xml_diff>
--- a/output/docx/VCC_Vehicle_Funding_Close_Packet_DRAFT.docx
+++ b/output/docx/VCC_Vehicle_Funding_Close_Packet_DRAFT.docx
@@ -569,6 +569,551 @@
                 <w:sz w:val="18"/>
               </w:rPr>
               <w:t>Applications, credit pulls, deposits, vehicle reservations, purchase/lease/rental agreements, insurance bind orders, authority filings, invoices, restricted funds, sponsor logo promises, public launch claims, or paid passenger service.</w:t>
+            </w:r>
+          </w:p>
+        </w:tc>
+      </w:tr>
+    </w:tbl>
+    <w:p>
+      <w:pPr>
+        <w:pStyle w:val="Heading1"/>
+        <w:spacing w:before="360" w:after="200"/>
+      </w:pPr>
+      <w:r>
+        <w:rPr>
+          <w:rFonts w:ascii="Calibri" w:hAnsi="Calibri"/>
+          <w:b/>
+          <w:color w:val="2E74B5"/>
+          <w:sz w:val="32"/>
+        </w:rPr>
+        <w:t>Authority And Insurance Evidence</w:t>
+      </w:r>
+    </w:p>
+    <w:tbl>
+      <w:tblPr>
+        <w:tblStyle w:val="TableGrid"/>
+        <w:tblW w:type="auto" w:w="0"/>
+        <w:jc w:val="left"/>
+        <w:tblLayout w:type="fixed"/>
+        <w:tblLook w:firstColumn="1" w:firstRow="1" w:lastColumn="0" w:lastRow="0" w:noHBand="0" w:noVBand="1" w:val="04A0"/>
+      </w:tblPr>
+      <w:tblGrid>
+        <w:gridCol w:w="3120"/>
+        <w:gridCol w:w="3120"/>
+        <w:gridCol w:w="3120"/>
+      </w:tblGrid>
+      <w:tr>
+        <w:tc>
+          <w:tcPr>
+            <w:tcW w:type="dxa" w:w="1728"/>
+            <w:vAlign w:val="center"/>
+            <w:tcMar>
+              <w:top w:w="80" w:type="dxa"/>
+              <w:start w:w="120" w:type="dxa"/>
+              <w:bottom w:w="80" w:type="dxa"/>
+              <w:end w:w="120" w:type="dxa"/>
+            </w:tcMar>
+            <w:shd w:fill="E8EEF5"/>
+          </w:tcPr>
+          <w:p>
+            <w:pPr>
+              <w:spacing w:after="0" w:line="276" w:lineRule="auto"/>
+            </w:pPr>
+            <w:r/>
+            <w:r>
+              <w:rPr>
+                <w:rFonts w:ascii="Calibri" w:hAnsi="Calibri"/>
+                <w:b/>
+                <w:color w:val="1F2937"/>
+                <w:sz w:val="18"/>
+              </w:rPr>
+              <w:t>Lane</w:t>
+            </w:r>
+          </w:p>
+        </w:tc>
+        <w:tc>
+          <w:tcPr>
+            <w:tcW w:type="dxa" w:w="4680"/>
+            <w:vAlign w:val="center"/>
+            <w:tcMar>
+              <w:top w:w="80" w:type="dxa"/>
+              <w:start w:w="120" w:type="dxa"/>
+              <w:bottom w:w="80" w:type="dxa"/>
+              <w:end w:w="120" w:type="dxa"/>
+            </w:tcMar>
+            <w:shd w:fill="E8EEF5"/>
+          </w:tcPr>
+          <w:p>
+            <w:pPr>
+              <w:spacing w:after="0" w:line="276" w:lineRule="auto"/>
+            </w:pPr>
+            <w:r/>
+            <w:r>
+              <w:rPr>
+                <w:rFonts w:ascii="Calibri" w:hAnsi="Calibri"/>
+                <w:b/>
+                <w:color w:val="1F2937"/>
+                <w:sz w:val="18"/>
+              </w:rPr>
+              <w:t>Current evidence</w:t>
+            </w:r>
+          </w:p>
+        </w:tc>
+        <w:tc>
+          <w:tcPr>
+            <w:tcW w:type="dxa" w:w="2952"/>
+            <w:vAlign w:val="center"/>
+            <w:tcMar>
+              <w:top w:w="80" w:type="dxa"/>
+              <w:start w:w="120" w:type="dxa"/>
+              <w:bottom w:w="80" w:type="dxa"/>
+              <w:end w:w="120" w:type="dxa"/>
+            </w:tcMar>
+            <w:shd w:fill="E8EEF5"/>
+          </w:tcPr>
+          <w:p>
+            <w:pPr>
+              <w:spacing w:after="0" w:line="276" w:lineRule="auto"/>
+            </w:pPr>
+            <w:r/>
+            <w:r>
+              <w:rPr>
+                <w:rFonts w:ascii="Calibri" w:hAnsi="Calibri"/>
+                <w:b/>
+                <w:color w:val="1F2937"/>
+                <w:sz w:val="18"/>
+              </w:rPr>
+              <w:t>Sprint implication</w:t>
+            </w:r>
+          </w:p>
+        </w:tc>
+      </w:tr>
+      <w:tr>
+        <w:tc>
+          <w:tcPr>
+            <w:tcW w:type="dxa" w:w="1728"/>
+            <w:vAlign w:val="center"/>
+            <w:tcMar>
+              <w:top w:w="80" w:type="dxa"/>
+              <w:start w:w="120" w:type="dxa"/>
+              <w:bottom w:w="80" w:type="dxa"/>
+              <w:end w:w="120" w:type="dxa"/>
+            </w:tcMar>
+            <w:shd w:fill="FFF4E5"/>
+          </w:tcPr>
+          <w:p>
+            <w:pPr>
+              <w:spacing w:after="0" w:line="276" w:lineRule="auto"/>
+            </w:pPr>
+            <w:r/>
+            <w:r>
+              <w:rPr>
+                <w:rFonts w:ascii="Calibri" w:hAnsi="Calibri"/>
+                <w:b w:val="0"/>
+                <w:color w:val="1F2937"/>
+                <w:sz w:val="18"/>
+              </w:rPr>
+              <w:t>WYDOT authority</w:t>
+            </w:r>
+          </w:p>
+        </w:tc>
+        <w:tc>
+          <w:tcPr>
+            <w:tcW w:type="dxa" w:w="4680"/>
+            <w:vAlign w:val="center"/>
+            <w:tcMar>
+              <w:top w:w="80" w:type="dxa"/>
+              <w:start w:w="120" w:type="dxa"/>
+              <w:bottom w:w="80" w:type="dxa"/>
+              <w:end w:w="120" w:type="dxa"/>
+            </w:tcMar>
+            <w:shd w:fill="FFF4E5"/>
+          </w:tcPr>
+          <w:p>
+            <w:pPr>
+              <w:spacing w:after="0" w:line="276" w:lineRule="auto"/>
+            </w:pPr>
+            <w:r/>
+            <w:r>
+              <w:rPr>
+                <w:rFonts w:ascii="Calibri" w:hAnsi="Calibri"/>
+                <w:b w:val="0"/>
+                <w:color w:val="1F2937"/>
+                <w:sz w:val="18"/>
+              </w:rPr>
+              <w:t>WYDOT defines contract motor carrier as intrastate transportation of people or property for compensation; WYDOT lists 307-777-4850 for questions.</w:t>
+            </w:r>
+          </w:p>
+        </w:tc>
+        <w:tc>
+          <w:tcPr>
+            <w:tcW w:type="dxa" w:w="2952"/>
+            <w:vAlign w:val="center"/>
+            <w:tcMar>
+              <w:top w:w="80" w:type="dxa"/>
+              <w:start w:w="120" w:type="dxa"/>
+              <w:bottom w:w="80" w:type="dxa"/>
+              <w:end w:w="120" w:type="dxa"/>
+            </w:tcMar>
+            <w:shd w:fill="FFF4E5"/>
+          </w:tcPr>
+          <w:p>
+            <w:pPr>
+              <w:spacing w:after="0" w:line="276" w:lineRule="auto"/>
+            </w:pPr>
+            <w:r/>
+            <w:r>
+              <w:rPr>
+                <w:rFonts w:ascii="Calibri" w:hAnsi="Calibri"/>
+                <w:b w:val="0"/>
+                <w:color w:val="1F2937"/>
+                <w:sz w:val="18"/>
+              </w:rPr>
+              <w:t>Call or send the unsent authority question draft before relying on any paid passenger-service plan.</w:t>
+            </w:r>
+          </w:p>
+        </w:tc>
+      </w:tr>
+      <w:tr>
+        <w:tc>
+          <w:tcPr>
+            <w:tcW w:type="dxa" w:w="1728"/>
+            <w:vAlign w:val="center"/>
+            <w:tcMar>
+              <w:top w:w="80" w:type="dxa"/>
+              <w:start w:w="120" w:type="dxa"/>
+              <w:bottom w:w="80" w:type="dxa"/>
+              <w:end w:w="120" w:type="dxa"/>
+            </w:tcMar>
+            <w:shd w:fill="FFF4E5"/>
+          </w:tcPr>
+          <w:p>
+            <w:pPr>
+              <w:spacing w:after="0" w:line="276" w:lineRule="auto"/>
+            </w:pPr>
+            <w:r/>
+            <w:r>
+              <w:rPr>
+                <w:rFonts w:ascii="Calibri" w:hAnsi="Calibri"/>
+                <w:b w:val="0"/>
+                <w:color w:val="1F2937"/>
+                <w:sz w:val="18"/>
+              </w:rPr>
+              <w:t>MC-100 / Form E</w:t>
+            </w:r>
+          </w:p>
+        </w:tc>
+        <w:tc>
+          <w:tcPr>
+            <w:tcW w:type="dxa" w:w="4680"/>
+            <w:vAlign w:val="center"/>
+            <w:tcMar>
+              <w:top w:w="80" w:type="dxa"/>
+              <w:start w:w="120" w:type="dxa"/>
+              <w:bottom w:w="80" w:type="dxa"/>
+              <w:end w:w="120" w:type="dxa"/>
+            </w:tcMar>
+            <w:shd w:fill="FFF4E5"/>
+          </w:tcPr>
+          <w:p>
+            <w:pPr>
+              <w:spacing w:after="0" w:line="276" w:lineRule="auto"/>
+            </w:pPr>
+            <w:r/>
+            <w:r>
+              <w:rPr>
+                <w:rFonts w:ascii="Calibri" w:hAnsi="Calibri"/>
+                <w:b w:val="0"/>
+                <w:color w:val="1F2937"/>
+                <w:sz w:val="18"/>
+              </w:rPr>
+              <w:t>WYDOT MC-100 asks passenger carriers to list passenger count; Form E is required before contract carrier authority approval if applicable.</w:t>
+            </w:r>
+          </w:p>
+        </w:tc>
+        <w:tc>
+          <w:tcPr>
+            <w:tcW w:type="dxa" w:w="2952"/>
+            <w:vAlign w:val="center"/>
+            <w:tcMar>
+              <w:top w:w="80" w:type="dxa"/>
+              <w:start w:w="120" w:type="dxa"/>
+              <w:bottom w:w="80" w:type="dxa"/>
+              <w:end w:w="120" w:type="dxa"/>
+            </w:tcMar>
+            <w:shd w:fill="FFF4E5"/>
+          </w:tcPr>
+          <w:p>
+            <w:pPr>
+              <w:spacing w:after="0" w:line="276" w:lineRule="auto"/>
+            </w:pPr>
+            <w:r/>
+            <w:r>
+              <w:rPr>
+                <w:rFonts w:ascii="Calibri" w:hAnsi="Calibri"/>
+                <w:b w:val="0"/>
+                <w:color w:val="1F2937"/>
+                <w:sz w:val="18"/>
+              </w:rPr>
+              <w:t>Insurance conversations must ask whether the carrier can issue Wyoming Form E.</w:t>
+            </w:r>
+          </w:p>
+        </w:tc>
+      </w:tr>
+      <w:tr>
+        <w:tc>
+          <w:tcPr>
+            <w:tcW w:type="dxa" w:w="1728"/>
+            <w:vAlign w:val="center"/>
+            <w:tcMar>
+              <w:top w:w="80" w:type="dxa"/>
+              <w:start w:w="120" w:type="dxa"/>
+              <w:bottom w:w="80" w:type="dxa"/>
+              <w:end w:w="120" w:type="dxa"/>
+            </w:tcMar>
+            <w:shd w:fill="FFF4E5"/>
+          </w:tcPr>
+          <w:p>
+            <w:pPr>
+              <w:spacing w:after="0" w:line="276" w:lineRule="auto"/>
+            </w:pPr>
+            <w:r/>
+            <w:r>
+              <w:rPr>
+                <w:rFonts w:ascii="Calibri" w:hAnsi="Calibri"/>
+                <w:b w:val="0"/>
+                <w:color w:val="1F2937"/>
+                <w:sz w:val="18"/>
+              </w:rPr>
+              <w:t>Coverage threshold</w:t>
+            </w:r>
+          </w:p>
+        </w:tc>
+        <w:tc>
+          <w:tcPr>
+            <w:tcW w:type="dxa" w:w="4680"/>
+            <w:vAlign w:val="center"/>
+            <w:tcMar>
+              <w:top w:w="80" w:type="dxa"/>
+              <w:start w:w="120" w:type="dxa"/>
+              <w:bottom w:w="80" w:type="dxa"/>
+              <w:end w:w="120" w:type="dxa"/>
+            </w:tcMar>
+            <w:shd w:fill="FFF4E5"/>
+          </w:tcPr>
+          <w:p>
+            <w:pPr>
+              <w:spacing w:after="0" w:line="276" w:lineRule="auto"/>
+            </w:pPr>
+            <w:r/>
+            <w:r>
+              <w:rPr>
+                <w:rFonts w:ascii="Calibri" w:hAnsi="Calibri"/>
+                <w:b w:val="0"/>
+                <w:color w:val="1F2937"/>
+                <w:sz w:val="18"/>
+              </w:rPr>
+              <w:t>WYDOT MC-100 lists $750,000 combined single limit for contract carrier liability filings.</w:t>
+            </w:r>
+          </w:p>
+        </w:tc>
+        <w:tc>
+          <w:tcPr>
+            <w:tcW w:type="dxa" w:w="2952"/>
+            <w:vAlign w:val="center"/>
+            <w:tcMar>
+              <w:top w:w="80" w:type="dxa"/>
+              <w:start w:w="120" w:type="dxa"/>
+              <w:bottom w:w="80" w:type="dxa"/>
+              <w:end w:w="120" w:type="dxa"/>
+            </w:tcMar>
+            <w:shd w:fill="FFF4E5"/>
+          </w:tcPr>
+          <w:p>
+            <w:pPr>
+              <w:spacing w:after="0" w:line="276" w:lineRule="auto"/>
+            </w:pPr>
+            <w:r/>
+            <w:r>
+              <w:rPr>
+                <w:rFonts w:ascii="Calibri" w:hAnsi="Calibri"/>
+                <w:b w:val="0"/>
+                <w:color w:val="1F2937"/>
+                <w:sz w:val="18"/>
+              </w:rPr>
+              <w:t>Quote conversations should test at least this threshold if the authority path applies.</w:t>
+            </w:r>
+          </w:p>
+        </w:tc>
+      </w:tr>
+      <w:tr>
+        <w:tc>
+          <w:tcPr>
+            <w:tcW w:type="dxa" w:w="1728"/>
+            <w:vAlign w:val="center"/>
+            <w:tcMar>
+              <w:top w:w="80" w:type="dxa"/>
+              <w:start w:w="120" w:type="dxa"/>
+              <w:bottom w:w="80" w:type="dxa"/>
+              <w:end w:w="120" w:type="dxa"/>
+            </w:tcMar>
+            <w:shd w:fill="FFF4E5"/>
+          </w:tcPr>
+          <w:p>
+            <w:pPr>
+              <w:spacing w:after="0" w:line="276" w:lineRule="auto"/>
+            </w:pPr>
+            <w:r/>
+            <w:r>
+              <w:rPr>
+                <w:rFonts w:ascii="Calibri" w:hAnsi="Calibri"/>
+                <w:b w:val="0"/>
+                <w:color w:val="1F2937"/>
+                <w:sz w:val="18"/>
+              </w:rPr>
+              <w:t>USDOT trigger</w:t>
+            </w:r>
+          </w:p>
+        </w:tc>
+        <w:tc>
+          <w:tcPr>
+            <w:tcW w:type="dxa" w:w="4680"/>
+            <w:vAlign w:val="center"/>
+            <w:tcMar>
+              <w:top w:w="80" w:type="dxa"/>
+              <w:start w:w="120" w:type="dxa"/>
+              <w:bottom w:w="80" w:type="dxa"/>
+              <w:end w:w="120" w:type="dxa"/>
+            </w:tcMar>
+            <w:shd w:fill="FFF4E5"/>
+          </w:tcPr>
+          <w:p>
+            <w:pPr>
+              <w:spacing w:after="0" w:line="276" w:lineRule="auto"/>
+            </w:pPr>
+            <w:r/>
+            <w:r>
+              <w:rPr>
+                <w:rFonts w:ascii="Calibri" w:hAnsi="Calibri"/>
+                <w:b w:val="0"/>
+                <w:color w:val="1F2937"/>
+                <w:sz w:val="18"/>
+              </w:rPr>
+              <w:t>WYDOT MC-100 states more than 9 passengers, including the driver, must have a USDOT number.</w:t>
+            </w:r>
+          </w:p>
+        </w:tc>
+        <w:tc>
+          <w:tcPr>
+            <w:tcW w:type="dxa" w:w="2952"/>
+            <w:vAlign w:val="center"/>
+            <w:tcMar>
+              <w:top w:w="80" w:type="dxa"/>
+              <w:start w:w="120" w:type="dxa"/>
+              <w:bottom w:w="80" w:type="dxa"/>
+              <w:end w:w="120" w:type="dxa"/>
+            </w:tcMar>
+            <w:shd w:fill="FFF4E5"/>
+          </w:tcPr>
+          <w:p>
+            <w:pPr>
+              <w:spacing w:after="0" w:line="276" w:lineRule="auto"/>
+            </w:pPr>
+            <w:r/>
+            <w:r>
+              <w:rPr>
+                <w:rFonts w:ascii="Calibri" w:hAnsi="Calibri"/>
+                <w:b w:val="0"/>
+                <w:color w:val="1F2937"/>
+                <w:sz w:val="18"/>
+              </w:rPr>
+              <w:t>Keep the first vehicle below that threshold unless VCC intentionally opens the USDOT path.</w:t>
+            </w:r>
+          </w:p>
+        </w:tc>
+      </w:tr>
+      <w:tr>
+        <w:tc>
+          <w:tcPr>
+            <w:tcW w:type="dxa" w:w="1728"/>
+            <w:vAlign w:val="center"/>
+            <w:tcMar>
+              <w:top w:w="80" w:type="dxa"/>
+              <w:start w:w="120" w:type="dxa"/>
+              <w:bottom w:w="80" w:type="dxa"/>
+              <w:end w:w="120" w:type="dxa"/>
+            </w:tcMar>
+            <w:shd w:fill="FFF4E5"/>
+          </w:tcPr>
+          <w:p>
+            <w:pPr>
+              <w:spacing w:after="0" w:line="276" w:lineRule="auto"/>
+            </w:pPr>
+            <w:r/>
+            <w:r>
+              <w:rPr>
+                <w:rFonts w:ascii="Calibri" w:hAnsi="Calibri"/>
+                <w:b w:val="0"/>
+                <w:color w:val="1F2937"/>
+                <w:sz w:val="18"/>
+              </w:rPr>
+              <w:t>Insurance quote paths</w:t>
+            </w:r>
+          </w:p>
+        </w:tc>
+        <w:tc>
+          <w:tcPr>
+            <w:tcW w:type="dxa" w:w="4680"/>
+            <w:vAlign w:val="center"/>
+            <w:tcMar>
+              <w:top w:w="80" w:type="dxa"/>
+              <w:start w:w="120" w:type="dxa"/>
+              <w:bottom w:w="80" w:type="dxa"/>
+              <w:end w:w="120" w:type="dxa"/>
+            </w:tcMar>
+            <w:shd w:fill="FFF4E5"/>
+          </w:tcPr>
+          <w:p>
+            <w:pPr>
+              <w:spacing w:after="0" w:line="276" w:lineRule="auto"/>
+            </w:pPr>
+            <w:r/>
+            <w:r>
+              <w:rPr>
+                <w:rFonts w:ascii="Calibri" w:hAnsi="Calibri"/>
+                <w:b w:val="0"/>
+                <w:color w:val="1F2937"/>
+                <w:sz w:val="18"/>
+              </w:rPr>
+              <w:t>Insureon lists NEMT/paratransit quote support at 800-688-1984; Progressive lists NEMT quote support at 1-888-806-9598 in select states.</w:t>
+            </w:r>
+          </w:p>
+        </w:tc>
+        <w:tc>
+          <w:tcPr>
+            <w:tcW w:type="dxa" w:w="2952"/>
+            <w:vAlign w:val="center"/>
+            <w:tcMar>
+              <w:top w:w="80" w:type="dxa"/>
+              <w:start w:w="120" w:type="dxa"/>
+              <w:bottom w:w="80" w:type="dxa"/>
+              <w:end w:w="120" w:type="dxa"/>
+            </w:tcMar>
+            <w:shd w:fill="FFF4E5"/>
+          </w:tcPr>
+          <w:p>
+            <w:pPr>
+              <w:spacing w:after="0" w:line="276" w:lineRule="auto"/>
+            </w:pPr>
+            <w:r/>
+            <w:r>
+              <w:rPr>
+                <w:rFonts w:ascii="Calibri" w:hAnsi="Calibri"/>
+                <w:b w:val="0"/>
+                <w:color w:val="1F2937"/>
+                <w:sz w:val="18"/>
+              </w:rPr>
+              <w:t>Use both as eligibility and bindability checks, not as binding applications.</w:t>
             </w:r>
           </w:p>
         </w:tc>

</xml_diff>

<commit_message>
Surface vehicle funding proof gate
</commit_message>
<xml_diff>
--- a/output/docx/VCC_Vehicle_Funding_Close_Packet_DRAFT.docx
+++ b/output/docx/VCC_Vehicle_Funding_Close_Packet_DRAFT.docx
@@ -569,6 +569,536 @@
                 <w:sz w:val="18"/>
               </w:rPr>
               <w:t>Applications, credit pulls, deposits, vehicle reservations, purchase/lease/rental agreements, insurance bind orders, authority filings, invoices, restricted funds, sponsor logo promises, public launch claims, or paid passenger service.</w:t>
+            </w:r>
+          </w:p>
+        </w:tc>
+      </w:tr>
+      <w:tr>
+        <w:tc>
+          <w:tcPr>
+            <w:tcW w:type="dxa" w:w="4536"/>
+            <w:vAlign w:val="center"/>
+            <w:tcMar>
+              <w:top w:w="80" w:type="dxa"/>
+              <w:start w:w="120" w:type="dxa"/>
+              <w:bottom w:w="80" w:type="dxa"/>
+              <w:end w:w="120" w:type="dxa"/>
+            </w:tcMar>
+            <w:shd w:fill="FFF4E5"/>
+          </w:tcPr>
+          <w:p>
+            <w:pPr>
+              <w:spacing w:after="0" w:line="276" w:lineRule="auto"/>
+            </w:pPr>
+            <w:r/>
+            <w:r>
+              <w:rPr>
+                <w:rFonts w:ascii="Calibri" w:hAnsi="Calibri"/>
+                <w:b w:val="0"/>
+                <w:color w:val="1F2937"/>
+                <w:sz w:val="18"/>
+              </w:rPr>
+              <w:t>Response logging in 49_External_Response_Evidence_Log_2026-08-02.csv and 52_Vehicle_Funding_Quote_Intake_Scorecard_2026-08-02.csv.</w:t>
+            </w:r>
+          </w:p>
+        </w:tc>
+        <w:tc>
+          <w:tcPr>
+            <w:tcW w:type="dxa" w:w="4824"/>
+            <w:vAlign w:val="center"/>
+            <w:tcMar>
+              <w:top w:w="80" w:type="dxa"/>
+              <w:start w:w="120" w:type="dxa"/>
+              <w:bottom w:w="80" w:type="dxa"/>
+              <w:end w:w="120" w:type="dxa"/>
+            </w:tcMar>
+            <w:shd w:fill="FFF4E5"/>
+          </w:tcPr>
+          <w:p>
+            <w:pPr>
+              <w:spacing w:after="0" w:line="276" w:lineRule="auto"/>
+            </w:pPr>
+            <w:r/>
+            <w:r>
+              <w:rPr>
+                <w:rFonts w:ascii="Calibri" w:hAnsi="Calibri"/>
+                <w:b w:val="0"/>
+                <w:color w:val="1F2937"/>
+                <w:sz w:val="18"/>
+              </w:rPr>
+              <w:t>Treating a conversation, public listing, or draft as funding proof or vehicle readiness proof.</w:t>
+            </w:r>
+          </w:p>
+        </w:tc>
+      </w:tr>
+    </w:tbl>
+    <w:p>
+      <w:pPr>
+        <w:pStyle w:val="Heading1"/>
+        <w:spacing w:before="360" w:after="200"/>
+      </w:pPr>
+      <w:r>
+        <w:rPr>
+          <w:rFonts w:ascii="Calibri" w:hAnsi="Calibri"/>
+          <w:b/>
+          <w:color w:val="2E74B5"/>
+          <w:sz w:val="32"/>
+        </w:rPr>
+        <w:t>Controlled Contact Authorization</w:t>
+      </w:r>
+    </w:p>
+    <w:p>
+      <w:pPr>
+        <w:spacing w:after="120" w:line="300" w:lineRule="auto"/>
+      </w:pPr>
+      <w:r>
+        <w:rPr>
+          <w:rFonts w:ascii="Calibri" w:hAnsi="Calibri"/>
+          <w:b w:val="0"/>
+          <w:color w:val="1F2937"/>
+        </w:rPr>
+        <w:t>Use 51_Controlled_Contact_Authorization_Record_2026-08-02.md as the source-controlled approval record before any external call, email, form submission, quote request, insurance discussion, financing inquiry, or sponsor approach.</w:t>
+      </w:r>
+    </w:p>
+    <w:tbl>
+      <w:tblPr>
+        <w:tblStyle w:val="TableGrid"/>
+        <w:tblW w:type="auto" w:w="0"/>
+        <w:jc w:val="left"/>
+        <w:tblLayout w:type="fixed"/>
+        <w:tblLook w:firstColumn="1" w:firstRow="1" w:lastColumn="0" w:lastRow="0" w:noHBand="0" w:noVBand="1" w:val="04A0"/>
+      </w:tblPr>
+      <w:tblGrid>
+        <w:gridCol w:w="3120"/>
+        <w:gridCol w:w="3120"/>
+        <w:gridCol w:w="3120"/>
+      </w:tblGrid>
+      <w:tr>
+        <w:tc>
+          <w:tcPr>
+            <w:tcW w:type="dxa" w:w="1656"/>
+            <w:vAlign w:val="center"/>
+            <w:tcMar>
+              <w:top w:w="80" w:type="dxa"/>
+              <w:start w:w="120" w:type="dxa"/>
+              <w:bottom w:w="80" w:type="dxa"/>
+              <w:end w:w="120" w:type="dxa"/>
+            </w:tcMar>
+            <w:shd w:fill="E8EEF5"/>
+          </w:tcPr>
+          <w:p>
+            <w:pPr>
+              <w:spacing w:after="0" w:line="276" w:lineRule="auto"/>
+            </w:pPr>
+            <w:r/>
+            <w:r>
+              <w:rPr>
+                <w:rFonts w:ascii="Calibri" w:hAnsi="Calibri"/>
+                <w:b/>
+                <w:color w:val="1F2937"/>
+                <w:sz w:val="18"/>
+              </w:rPr>
+              <w:t>Authorization lane</w:t>
+            </w:r>
+          </w:p>
+        </w:tc>
+        <w:tc>
+          <w:tcPr>
+            <w:tcW w:type="dxa" w:w="4392"/>
+            <w:vAlign w:val="center"/>
+            <w:tcMar>
+              <w:top w:w="80" w:type="dxa"/>
+              <w:start w:w="120" w:type="dxa"/>
+              <w:bottom w:w="80" w:type="dxa"/>
+              <w:end w:w="120" w:type="dxa"/>
+            </w:tcMar>
+            <w:shd w:fill="E8EEF5"/>
+          </w:tcPr>
+          <w:p>
+            <w:pPr>
+              <w:spacing w:after="0" w:line="276" w:lineRule="auto"/>
+            </w:pPr>
+            <w:r/>
+            <w:r>
+              <w:rPr>
+                <w:rFonts w:ascii="Calibri" w:hAnsi="Calibri"/>
+                <w:b/>
+                <w:color w:val="1F2937"/>
+                <w:sz w:val="18"/>
+              </w:rPr>
+              <w:t>Permitted only if approved</w:t>
+            </w:r>
+          </w:p>
+        </w:tc>
+        <w:tc>
+          <w:tcPr>
+            <w:tcW w:type="dxa" w:w="3312"/>
+            <w:vAlign w:val="center"/>
+            <w:tcMar>
+              <w:top w:w="80" w:type="dxa"/>
+              <w:start w:w="120" w:type="dxa"/>
+              <w:bottom w:w="80" w:type="dxa"/>
+              <w:end w:w="120" w:type="dxa"/>
+            </w:tcMar>
+            <w:shd w:fill="E8EEF5"/>
+          </w:tcPr>
+          <w:p>
+            <w:pPr>
+              <w:spacing w:after="0" w:line="276" w:lineRule="auto"/>
+            </w:pPr>
+            <w:r/>
+            <w:r>
+              <w:rPr>
+                <w:rFonts w:ascii="Calibri" w:hAnsi="Calibri"/>
+                <w:b/>
+                <w:color w:val="1F2937"/>
+                <w:sz w:val="18"/>
+              </w:rPr>
+              <w:t>Still excluded</w:t>
+            </w:r>
+          </w:p>
+        </w:tc>
+      </w:tr>
+      <w:tr>
+        <w:tc>
+          <w:tcPr>
+            <w:tcW w:type="dxa" w:w="1656"/>
+            <w:vAlign w:val="center"/>
+            <w:tcMar>
+              <w:top w:w="80" w:type="dxa"/>
+              <w:start w:w="120" w:type="dxa"/>
+              <w:bottom w:w="80" w:type="dxa"/>
+              <w:end w:w="120" w:type="dxa"/>
+            </w:tcMar>
+            <w:shd w:fill="FFF4E5"/>
+          </w:tcPr>
+          <w:p>
+            <w:pPr>
+              <w:spacing w:after="0" w:line="276" w:lineRule="auto"/>
+            </w:pPr>
+            <w:r/>
+            <w:r>
+              <w:rPr>
+                <w:rFonts w:ascii="Calibri" w:hAnsi="Calibri"/>
+                <w:b w:val="0"/>
+                <w:color w:val="1F2937"/>
+                <w:sz w:val="18"/>
+              </w:rPr>
+              <w:t>Authority</w:t>
+            </w:r>
+          </w:p>
+        </w:tc>
+        <w:tc>
+          <w:tcPr>
+            <w:tcW w:type="dxa" w:w="4392"/>
+            <w:vAlign w:val="center"/>
+            <w:tcMar>
+              <w:top w:w="80" w:type="dxa"/>
+              <w:start w:w="120" w:type="dxa"/>
+              <w:bottom w:w="80" w:type="dxa"/>
+              <w:end w:w="120" w:type="dxa"/>
+            </w:tcMar>
+            <w:shd w:fill="FFF4E5"/>
+          </w:tcPr>
+          <w:p>
+            <w:pPr>
+              <w:spacing w:after="0" w:line="276" w:lineRule="auto"/>
+            </w:pPr>
+            <w:r/>
+            <w:r>
+              <w:rPr>
+                <w:rFonts w:ascii="Calibri" w:hAnsi="Calibri"/>
+                <w:b w:val="0"/>
+                <w:color w:val="1F2937"/>
+                <w:sz w:val="18"/>
+              </w:rPr>
+              <w:t>Non-binding WYDOT questions on MC-100, Form E, passenger capacity, USDOT, markings, registration, and pre-authority limits.</w:t>
+            </w:r>
+          </w:p>
+        </w:tc>
+        <w:tc>
+          <w:tcPr>
+            <w:tcW w:type="dxa" w:w="3312"/>
+            <w:vAlign w:val="center"/>
+            <w:tcMar>
+              <w:top w:w="80" w:type="dxa"/>
+              <w:start w:w="120" w:type="dxa"/>
+              <w:bottom w:w="80" w:type="dxa"/>
+              <w:end w:w="120" w:type="dxa"/>
+            </w:tcMar>
+            <w:shd w:fill="FFF4E5"/>
+          </w:tcPr>
+          <w:p>
+            <w:pPr>
+              <w:spacing w:after="0" w:line="276" w:lineRule="auto"/>
+            </w:pPr>
+            <w:r/>
+            <w:r>
+              <w:rPr>
+                <w:rFonts w:ascii="Calibri" w:hAnsi="Calibri"/>
+                <w:b w:val="0"/>
+                <w:color w:val="1F2937"/>
+                <w:sz w:val="18"/>
+              </w:rPr>
+              <w:t>Filing, fee payment, Form E filing, or authority representation.</w:t>
+            </w:r>
+          </w:p>
+        </w:tc>
+      </w:tr>
+      <w:tr>
+        <w:tc>
+          <w:tcPr>
+            <w:tcW w:type="dxa" w:w="1656"/>
+            <w:vAlign w:val="center"/>
+            <w:tcMar>
+              <w:top w:w="80" w:type="dxa"/>
+              <w:start w:w="120" w:type="dxa"/>
+              <w:bottom w:w="80" w:type="dxa"/>
+              <w:end w:w="120" w:type="dxa"/>
+            </w:tcMar>
+            <w:shd w:fill="FFF4E5"/>
+          </w:tcPr>
+          <w:p>
+            <w:pPr>
+              <w:spacing w:after="0" w:line="276" w:lineRule="auto"/>
+            </w:pPr>
+            <w:r/>
+            <w:r>
+              <w:rPr>
+                <w:rFonts w:ascii="Calibri" w:hAnsi="Calibri"/>
+                <w:b w:val="0"/>
+                <w:color w:val="1F2937"/>
+                <w:sz w:val="18"/>
+              </w:rPr>
+              <w:t>Insurance</w:t>
+            </w:r>
+          </w:p>
+        </w:tc>
+        <w:tc>
+          <w:tcPr>
+            <w:tcW w:type="dxa" w:w="4392"/>
+            <w:vAlign w:val="center"/>
+            <w:tcMar>
+              <w:top w:w="80" w:type="dxa"/>
+              <w:start w:w="120" w:type="dxa"/>
+              <w:bottom w:w="80" w:type="dxa"/>
+              <w:end w:w="120" w:type="dxa"/>
+            </w:tcMar>
+            <w:shd w:fill="FFF4E5"/>
+          </w:tcPr>
+          <w:p>
+            <w:pPr>
+              <w:spacing w:after="0" w:line="276" w:lineRule="auto"/>
+            </w:pPr>
+            <w:r/>
+            <w:r>
+              <w:rPr>
+                <w:rFonts w:ascii="Calibri" w:hAnsi="Calibri"/>
+                <w:b w:val="0"/>
+                <w:color w:val="1F2937"/>
+                <w:sz w:val="18"/>
+              </w:rPr>
+              <w:t>Eligibility, underwriting inputs, Form E capability, limits, driver/vehicle rules, and quote requirements.</w:t>
+            </w:r>
+          </w:p>
+        </w:tc>
+        <w:tc>
+          <w:tcPr>
+            <w:tcW w:type="dxa" w:w="3312"/>
+            <w:vAlign w:val="center"/>
+            <w:tcMar>
+              <w:top w:w="80" w:type="dxa"/>
+              <w:start w:w="120" w:type="dxa"/>
+              <w:bottom w:w="80" w:type="dxa"/>
+              <w:end w:w="120" w:type="dxa"/>
+            </w:tcMar>
+            <w:shd w:fill="FFF4E5"/>
+          </w:tcPr>
+          <w:p>
+            <w:pPr>
+              <w:spacing w:after="0" w:line="276" w:lineRule="auto"/>
+            </w:pPr>
+            <w:r/>
+            <w:r>
+              <w:rPr>
+                <w:rFonts w:ascii="Calibri" w:hAnsi="Calibri"/>
+                <w:b w:val="0"/>
+                <w:color w:val="1F2937"/>
+                <w:sz w:val="18"/>
+              </w:rPr>
+              <w:t>Paid application, coverage bind, or policy purchase.</w:t>
+            </w:r>
+          </w:p>
+        </w:tc>
+      </w:tr>
+      <w:tr>
+        <w:tc>
+          <w:tcPr>
+            <w:tcW w:type="dxa" w:w="1656"/>
+            <w:vAlign w:val="center"/>
+            <w:tcMar>
+              <w:top w:w="80" w:type="dxa"/>
+              <w:start w:w="120" w:type="dxa"/>
+              <w:bottom w:w="80" w:type="dxa"/>
+              <w:end w:w="120" w:type="dxa"/>
+            </w:tcMar>
+            <w:shd w:fill="FFF4E5"/>
+          </w:tcPr>
+          <w:p>
+            <w:pPr>
+              <w:spacing w:after="0" w:line="276" w:lineRule="auto"/>
+            </w:pPr>
+            <w:r/>
+            <w:r>
+              <w:rPr>
+                <w:rFonts w:ascii="Calibri" w:hAnsi="Calibri"/>
+                <w:b w:val="0"/>
+                <w:color w:val="1F2937"/>
+                <w:sz w:val="18"/>
+              </w:rPr>
+              <w:t>Vehicle/rental</w:t>
+            </w:r>
+          </w:p>
+        </w:tc>
+        <w:tc>
+          <w:tcPr>
+            <w:tcW w:type="dxa" w:w="4392"/>
+            <w:vAlign w:val="center"/>
+            <w:tcMar>
+              <w:top w:w="80" w:type="dxa"/>
+              <w:start w:w="120" w:type="dxa"/>
+              <w:bottom w:w="80" w:type="dxa"/>
+              <w:end w:w="120" w:type="dxa"/>
+            </w:tcMar>
+            <w:shd w:fill="FFF4E5"/>
+          </w:tcPr>
+          <w:p>
+            <w:pPr>
+              <w:spacing w:after="0" w:line="276" w:lineRule="auto"/>
+            </w:pPr>
+            <w:r/>
+            <w:r>
+              <w:rPr>
+                <w:rFonts w:ascii="Calibri" w:hAnsi="Calibri"/>
+                <w:b w:val="0"/>
+                <w:color w:val="1F2937"/>
+                <w:sz w:val="18"/>
+              </w:rPr>
+              <w:t>Availability, total due, business-use rules, pickup/delivery, insurance requirements, and written quote inputs.</w:t>
+            </w:r>
+          </w:p>
+        </w:tc>
+        <w:tc>
+          <w:tcPr>
+            <w:tcW w:type="dxa" w:w="3312"/>
+            <w:vAlign w:val="center"/>
+            <w:tcMar>
+              <w:top w:w="80" w:type="dxa"/>
+              <w:start w:w="120" w:type="dxa"/>
+              <w:bottom w:w="80" w:type="dxa"/>
+              <w:end w:w="120" w:type="dxa"/>
+            </w:tcMar>
+            <w:shd w:fill="FFF4E5"/>
+          </w:tcPr>
+          <w:p>
+            <w:pPr>
+              <w:spacing w:after="0" w:line="276" w:lineRule="auto"/>
+            </w:pPr>
+            <w:r/>
+            <w:r>
+              <w:rPr>
+                <w:rFonts w:ascii="Calibri" w:hAnsi="Calibri"/>
+                <w:b w:val="0"/>
+                <w:color w:val="1F2937"/>
+                <w:sz w:val="18"/>
+              </w:rPr>
+              <w:t>Reservation, deposit, payment, lease, rental, purchase, or passenger use.</w:t>
+            </w:r>
+          </w:p>
+        </w:tc>
+      </w:tr>
+      <w:tr>
+        <w:tc>
+          <w:tcPr>
+            <w:tcW w:type="dxa" w:w="1656"/>
+            <w:vAlign w:val="center"/>
+            <w:tcMar>
+              <w:top w:w="80" w:type="dxa"/>
+              <w:start w:w="120" w:type="dxa"/>
+              <w:bottom w:w="80" w:type="dxa"/>
+              <w:end w:w="120" w:type="dxa"/>
+            </w:tcMar>
+            <w:shd w:fill="FFF4E5"/>
+          </w:tcPr>
+          <w:p>
+            <w:pPr>
+              <w:spacing w:after="0" w:line="276" w:lineRule="auto"/>
+            </w:pPr>
+            <w:r/>
+            <w:r>
+              <w:rPr>
+                <w:rFonts w:ascii="Calibri" w:hAnsi="Calibri"/>
+                <w:b w:val="0"/>
+                <w:color w:val="1F2937"/>
+                <w:sz w:val="18"/>
+              </w:rPr>
+              <w:t>Funding</w:t>
+            </w:r>
+          </w:p>
+        </w:tc>
+        <w:tc>
+          <w:tcPr>
+            <w:tcW w:type="dxa" w:w="4392"/>
+            <w:vAlign w:val="center"/>
+            <w:tcMar>
+              <w:top w:w="80" w:type="dxa"/>
+              <w:start w:w="120" w:type="dxa"/>
+              <w:bottom w:w="80" w:type="dxa"/>
+              <w:end w:w="120" w:type="dxa"/>
+            </w:tcMar>
+            <w:shd w:fill="FFF4E5"/>
+          </w:tcPr>
+          <w:p>
+            <w:pPr>
+              <w:spacing w:after="0" w:line="276" w:lineRule="auto"/>
+            </w:pPr>
+            <w:r/>
+            <w:r>
+              <w:rPr>
+                <w:rFonts w:ascii="Calibri" w:hAnsi="Calibri"/>
+                <w:b w:val="0"/>
+                <w:color w:val="1F2937"/>
+                <w:sz w:val="18"/>
+              </w:rPr>
+              <w:t>Planning call, sponsor/readiness interest, pledge path, preliminary financing fit, and document checklist.</w:t>
+            </w:r>
+          </w:p>
+        </w:tc>
+        <w:tc>
+          <w:tcPr>
+            <w:tcW w:type="dxa" w:w="3312"/>
+            <w:vAlign w:val="center"/>
+            <w:tcMar>
+              <w:top w:w="80" w:type="dxa"/>
+              <w:start w:w="120" w:type="dxa"/>
+              <w:bottom w:w="80" w:type="dxa"/>
+              <w:end w:w="120" w:type="dxa"/>
+            </w:tcMar>
+            <w:shd w:fill="FFF4E5"/>
+          </w:tcPr>
+          <w:p>
+            <w:pPr>
+              <w:spacing w:after="0" w:line="276" w:lineRule="auto"/>
+            </w:pPr>
+            <w:r/>
+            <w:r>
+              <w:rPr>
+                <w:rFonts w:ascii="Calibri" w:hAnsi="Calibri"/>
+                <w:b w:val="0"/>
+                <w:color w:val="1F2937"/>
+                <w:sz w:val="18"/>
+              </w:rPr>
+              <w:t>Invoice, restricted funds, logo promise, credit pull, debt, guaranty, lien, or collateral pledge.</w:t>
             </w:r>
           </w:p>
         </w:tc>
@@ -2389,6 +2919,1686 @@
       </w:tr>
     </w:tbl>
     <w:p>
+      <w:pPr>
+        <w:pStyle w:val="Heading1"/>
+        <w:spacing w:before="360" w:after="200"/>
+      </w:pPr>
+      <w:r>
+        <w:rPr>
+          <w:rFonts w:ascii="Calibri" w:hAnsi="Calibri"/>
+          <w:b/>
+          <w:color w:val="2E74B5"/>
+          <w:sz w:val="32"/>
+        </w:rPr>
+        <w:t>Quote Intake Scorecard</w:t>
+      </w:r>
+    </w:p>
+    <w:tbl>
+      <w:tblPr>
+        <w:tblStyle w:val="TableGrid"/>
+        <w:tblW w:type="auto" w:w="0"/>
+        <w:jc w:val="left"/>
+        <w:tblLayout w:type="fixed"/>
+        <w:tblLook w:firstColumn="1" w:firstRow="1" w:lastColumn="0" w:lastRow="0" w:noHBand="0" w:noVBand="1" w:val="04A0"/>
+      </w:tblPr>
+      <w:tblGrid>
+        <w:gridCol w:w="1872"/>
+        <w:gridCol w:w="1872"/>
+        <w:gridCol w:w="1872"/>
+        <w:gridCol w:w="1872"/>
+        <w:gridCol w:w="1872"/>
+      </w:tblGrid>
+      <w:tr>
+        <w:tc>
+          <w:tcPr>
+            <w:tcW w:type="dxa" w:w="792"/>
+            <w:vAlign w:val="center"/>
+            <w:tcMar>
+              <w:top w:w="80" w:type="dxa"/>
+              <w:start w:w="120" w:type="dxa"/>
+              <w:bottom w:w="80" w:type="dxa"/>
+              <w:end w:w="120" w:type="dxa"/>
+            </w:tcMar>
+            <w:shd w:fill="E8EEF5"/>
+          </w:tcPr>
+          <w:p>
+            <w:pPr>
+              <w:spacing w:after="0" w:line="276" w:lineRule="auto"/>
+            </w:pPr>
+            <w:r/>
+            <w:r>
+              <w:rPr>
+                <w:rFonts w:ascii="Calibri" w:hAnsi="Calibri"/>
+                <w:b/>
+                <w:color w:val="1F2937"/>
+                <w:sz w:val="18"/>
+              </w:rPr>
+              <w:t>Priority</w:t>
+            </w:r>
+          </w:p>
+        </w:tc>
+        <w:tc>
+          <w:tcPr>
+            <w:tcW w:type="dxa" w:w="2088"/>
+            <w:vAlign w:val="center"/>
+            <w:tcMar>
+              <w:top w:w="80" w:type="dxa"/>
+              <w:start w:w="120" w:type="dxa"/>
+              <w:bottom w:w="80" w:type="dxa"/>
+              <w:end w:w="120" w:type="dxa"/>
+            </w:tcMar>
+            <w:shd w:fill="E8EEF5"/>
+          </w:tcPr>
+          <w:p>
+            <w:pPr>
+              <w:spacing w:after="0" w:line="276" w:lineRule="auto"/>
+            </w:pPr>
+            <w:r/>
+            <w:r>
+              <w:rPr>
+                <w:rFonts w:ascii="Calibri" w:hAnsi="Calibri"/>
+                <w:b/>
+                <w:color w:val="1F2937"/>
+                <w:sz w:val="18"/>
+              </w:rPr>
+              <w:t>Target</w:t>
+            </w:r>
+          </w:p>
+        </w:tc>
+        <w:tc>
+          <w:tcPr>
+            <w:tcW w:type="dxa" w:w="1440"/>
+            <w:vAlign w:val="center"/>
+            <w:tcMar>
+              <w:top w:w="80" w:type="dxa"/>
+              <w:start w:w="120" w:type="dxa"/>
+              <w:bottom w:w="80" w:type="dxa"/>
+              <w:end w:w="120" w:type="dxa"/>
+            </w:tcMar>
+            <w:shd w:fill="E8EEF5"/>
+          </w:tcPr>
+          <w:p>
+            <w:pPr>
+              <w:spacing w:after="0" w:line="276" w:lineRule="auto"/>
+            </w:pPr>
+            <w:r/>
+            <w:r>
+              <w:rPr>
+                <w:rFonts w:ascii="Calibri" w:hAnsi="Calibri"/>
+                <w:b/>
+                <w:color w:val="1F2937"/>
+                <w:sz w:val="18"/>
+              </w:rPr>
+              <w:t>Status</w:t>
+            </w:r>
+          </w:p>
+        </w:tc>
+        <w:tc>
+          <w:tcPr>
+            <w:tcW w:type="dxa" w:w="3024"/>
+            <w:vAlign w:val="center"/>
+            <w:tcMar>
+              <w:top w:w="80" w:type="dxa"/>
+              <w:start w:w="120" w:type="dxa"/>
+              <w:bottom w:w="80" w:type="dxa"/>
+              <w:end w:w="120" w:type="dxa"/>
+            </w:tcMar>
+            <w:shd w:fill="E8EEF5"/>
+          </w:tcPr>
+          <w:p>
+            <w:pPr>
+              <w:spacing w:after="0" w:line="276" w:lineRule="auto"/>
+            </w:pPr>
+            <w:r/>
+            <w:r>
+              <w:rPr>
+                <w:rFonts w:ascii="Calibri" w:hAnsi="Calibri"/>
+                <w:b/>
+                <w:color w:val="1F2937"/>
+                <w:sz w:val="18"/>
+              </w:rPr>
+              <w:t>Proof needed</w:t>
+            </w:r>
+          </w:p>
+        </w:tc>
+        <w:tc>
+          <w:tcPr>
+            <w:tcW w:type="dxa" w:w="2016"/>
+            <w:vAlign w:val="center"/>
+            <w:tcMar>
+              <w:top w:w="80" w:type="dxa"/>
+              <w:start w:w="120" w:type="dxa"/>
+              <w:bottom w:w="80" w:type="dxa"/>
+              <w:end w:w="120" w:type="dxa"/>
+            </w:tcMar>
+            <w:shd w:fill="E8EEF5"/>
+          </w:tcPr>
+          <w:p>
+            <w:pPr>
+              <w:spacing w:after="0" w:line="276" w:lineRule="auto"/>
+            </w:pPr>
+            <w:r/>
+            <w:r>
+              <w:rPr>
+                <w:rFonts w:ascii="Calibri" w:hAnsi="Calibri"/>
+                <w:b/>
+                <w:color w:val="1F2937"/>
+                <w:sz w:val="18"/>
+              </w:rPr>
+              <w:t>Next action</w:t>
+            </w:r>
+          </w:p>
+        </w:tc>
+      </w:tr>
+      <w:tr>
+        <w:tc>
+          <w:tcPr>
+            <w:tcW w:type="dxa" w:w="792"/>
+            <w:vAlign w:val="center"/>
+            <w:tcMar>
+              <w:top w:w="80" w:type="dxa"/>
+              <w:start w:w="120" w:type="dxa"/>
+              <w:bottom w:w="80" w:type="dxa"/>
+              <w:end w:w="120" w:type="dxa"/>
+            </w:tcMar>
+          </w:tcPr>
+          <w:p>
+            <w:pPr>
+              <w:spacing w:after="0" w:line="276" w:lineRule="auto"/>
+            </w:pPr>
+            <w:r/>
+            <w:r>
+              <w:rPr>
+                <w:rFonts w:ascii="Calibri" w:hAnsi="Calibri"/>
+                <w:b w:val="0"/>
+                <w:color w:val="1F2937"/>
+                <w:sz w:val="18"/>
+              </w:rPr>
+              <w:t>1</w:t>
+            </w:r>
+          </w:p>
+        </w:tc>
+        <w:tc>
+          <w:tcPr>
+            <w:tcW w:type="dxa" w:w="2088"/>
+            <w:vAlign w:val="center"/>
+            <w:tcMar>
+              <w:top w:w="80" w:type="dxa"/>
+              <w:start w:w="120" w:type="dxa"/>
+              <w:bottom w:w="80" w:type="dxa"/>
+              <w:end w:w="120" w:type="dxa"/>
+            </w:tcMar>
+          </w:tcPr>
+          <w:p>
+            <w:pPr>
+              <w:spacing w:after="0" w:line="276" w:lineRule="auto"/>
+            </w:pPr>
+            <w:r/>
+            <w:r>
+              <w:rPr>
+                <w:rFonts w:ascii="Calibri" w:hAnsi="Calibri"/>
+                <w:b w:val="0"/>
+                <w:color w:val="1F2937"/>
+                <w:sz w:val="18"/>
+              </w:rPr>
+              <w:t>WYDOT Regulatory Section / Motor Vehicle Services</w:t>
+            </w:r>
+          </w:p>
+        </w:tc>
+        <w:tc>
+          <w:tcPr>
+            <w:tcW w:type="dxa" w:w="1440"/>
+            <w:vAlign w:val="center"/>
+            <w:tcMar>
+              <w:top w:w="80" w:type="dxa"/>
+              <w:start w:w="120" w:type="dxa"/>
+              <w:bottom w:w="80" w:type="dxa"/>
+              <w:end w:w="120" w:type="dxa"/>
+            </w:tcMar>
+          </w:tcPr>
+          <w:p>
+            <w:pPr>
+              <w:spacing w:after="0" w:line="276" w:lineRule="auto"/>
+            </w:pPr>
+            <w:r/>
+            <w:r>
+              <w:rPr>
+                <w:rFonts w:ascii="Calibri" w:hAnsi="Calibri"/>
+                <w:b w:val="0"/>
+                <w:color w:val="1F2937"/>
+                <w:sz w:val="18"/>
+              </w:rPr>
+              <w:t>Not contacted</w:t>
+            </w:r>
+          </w:p>
+        </w:tc>
+        <w:tc>
+          <w:tcPr>
+            <w:tcW w:type="dxa" w:w="3024"/>
+            <w:vAlign w:val="center"/>
+            <w:tcMar>
+              <w:top w:w="80" w:type="dxa"/>
+              <w:start w:w="120" w:type="dxa"/>
+              <w:bottom w:w="80" w:type="dxa"/>
+              <w:end w:w="120" w:type="dxa"/>
+            </w:tcMar>
+          </w:tcPr>
+          <w:p>
+            <w:pPr>
+              <w:spacing w:after="0" w:line="276" w:lineRule="auto"/>
+            </w:pPr>
+            <w:r/>
+            <w:r>
+              <w:rPr>
+                <w:rFonts w:ascii="Calibri" w:hAnsi="Calibri"/>
+                <w:b w:val="0"/>
+                <w:color w:val="1F2937"/>
+                <w:sz w:val="18"/>
+              </w:rPr>
+              <w:t>Written response or dated call notes</w:t>
+            </w:r>
+          </w:p>
+        </w:tc>
+        <w:tc>
+          <w:tcPr>
+            <w:tcW w:type="dxa" w:w="2016"/>
+            <w:vAlign w:val="center"/>
+            <w:tcMar>
+              <w:top w:w="80" w:type="dxa"/>
+              <w:start w:w="120" w:type="dxa"/>
+              <w:bottom w:w="80" w:type="dxa"/>
+              <w:end w:w="120" w:type="dxa"/>
+            </w:tcMar>
+          </w:tcPr>
+          <w:p>
+            <w:pPr>
+              <w:spacing w:after="0" w:line="276" w:lineRule="auto"/>
+            </w:pPr>
+            <w:r/>
+            <w:r>
+              <w:rPr>
+                <w:rFonts w:ascii="Calibri" w:hAnsi="Calibri"/>
+                <w:b w:val="0"/>
+                <w:color w:val="1F2937"/>
+                <w:sz w:val="18"/>
+              </w:rPr>
+              <w:t>After approval, send/call and record authority notes</w:t>
+            </w:r>
+          </w:p>
+        </w:tc>
+      </w:tr>
+      <w:tr>
+        <w:tc>
+          <w:tcPr>
+            <w:tcW w:type="dxa" w:w="792"/>
+            <w:vAlign w:val="center"/>
+            <w:tcMar>
+              <w:top w:w="80" w:type="dxa"/>
+              <w:start w:w="120" w:type="dxa"/>
+              <w:bottom w:w="80" w:type="dxa"/>
+              <w:end w:w="120" w:type="dxa"/>
+            </w:tcMar>
+          </w:tcPr>
+          <w:p>
+            <w:pPr>
+              <w:spacing w:after="0" w:line="276" w:lineRule="auto"/>
+            </w:pPr>
+            <w:r/>
+            <w:r>
+              <w:rPr>
+                <w:rFonts w:ascii="Calibri" w:hAnsi="Calibri"/>
+                <w:b w:val="0"/>
+                <w:color w:val="1F2937"/>
+                <w:sz w:val="18"/>
+              </w:rPr>
+              <w:t>2</w:t>
+            </w:r>
+          </w:p>
+        </w:tc>
+        <w:tc>
+          <w:tcPr>
+            <w:tcW w:type="dxa" w:w="2088"/>
+            <w:vAlign w:val="center"/>
+            <w:tcMar>
+              <w:top w:w="80" w:type="dxa"/>
+              <w:start w:w="120" w:type="dxa"/>
+              <w:bottom w:w="80" w:type="dxa"/>
+              <w:end w:w="120" w:type="dxa"/>
+            </w:tcMar>
+          </w:tcPr>
+          <w:p>
+            <w:pPr>
+              <w:spacing w:after="0" w:line="276" w:lineRule="auto"/>
+            </w:pPr>
+            <w:r/>
+            <w:r>
+              <w:rPr>
+                <w:rFonts w:ascii="Calibri" w:hAnsi="Calibri"/>
+                <w:b w:val="0"/>
+                <w:color w:val="1F2937"/>
+                <w:sz w:val="18"/>
+              </w:rPr>
+              <w:t>Progressive Commercial</w:t>
+            </w:r>
+          </w:p>
+        </w:tc>
+        <w:tc>
+          <w:tcPr>
+            <w:tcW w:type="dxa" w:w="1440"/>
+            <w:vAlign w:val="center"/>
+            <w:tcMar>
+              <w:top w:w="80" w:type="dxa"/>
+              <w:start w:w="120" w:type="dxa"/>
+              <w:bottom w:w="80" w:type="dxa"/>
+              <w:end w:w="120" w:type="dxa"/>
+            </w:tcMar>
+          </w:tcPr>
+          <w:p>
+            <w:pPr>
+              <w:spacing w:after="0" w:line="276" w:lineRule="auto"/>
+            </w:pPr>
+            <w:r/>
+            <w:r>
+              <w:rPr>
+                <w:rFonts w:ascii="Calibri" w:hAnsi="Calibri"/>
+                <w:b w:val="0"/>
+                <w:color w:val="1F2937"/>
+                <w:sz w:val="18"/>
+              </w:rPr>
+              <w:t>Not contacted</w:t>
+            </w:r>
+          </w:p>
+        </w:tc>
+        <w:tc>
+          <w:tcPr>
+            <w:tcW w:type="dxa" w:w="3024"/>
+            <w:vAlign w:val="center"/>
+            <w:tcMar>
+              <w:top w:w="80" w:type="dxa"/>
+              <w:start w:w="120" w:type="dxa"/>
+              <w:bottom w:w="80" w:type="dxa"/>
+              <w:end w:w="120" w:type="dxa"/>
+            </w:tcMar>
+          </w:tcPr>
+          <w:p>
+            <w:pPr>
+              <w:spacing w:after="0" w:line="276" w:lineRule="auto"/>
+            </w:pPr>
+            <w:r/>
+            <w:r>
+              <w:rPr>
+                <w:rFonts w:ascii="Calibri" w:hAnsi="Calibri"/>
+                <w:b w:val="0"/>
+                <w:color w:val="1F2937"/>
+                <w:sz w:val="18"/>
+              </w:rPr>
+              <w:t>Agent notes or quote requirements</w:t>
+            </w:r>
+          </w:p>
+        </w:tc>
+        <w:tc>
+          <w:tcPr>
+            <w:tcW w:type="dxa" w:w="2016"/>
+            <w:vAlign w:val="center"/>
+            <w:tcMar>
+              <w:top w:w="80" w:type="dxa"/>
+              <w:start w:w="120" w:type="dxa"/>
+              <w:bottom w:w="80" w:type="dxa"/>
+              <w:end w:w="120" w:type="dxa"/>
+            </w:tcMar>
+          </w:tcPr>
+          <w:p>
+            <w:pPr>
+              <w:spacing w:after="0" w:line="276" w:lineRule="auto"/>
+            </w:pPr>
+            <w:r/>
+            <w:r>
+              <w:rPr>
+                <w:rFonts w:ascii="Calibri" w:hAnsi="Calibri"/>
+                <w:b w:val="0"/>
+                <w:color w:val="1F2937"/>
+                <w:sz w:val="18"/>
+              </w:rPr>
+              <w:t>After approval, ask eligibility and Form E questions only</w:t>
+            </w:r>
+          </w:p>
+        </w:tc>
+      </w:tr>
+      <w:tr>
+        <w:tc>
+          <w:tcPr>
+            <w:tcW w:type="dxa" w:w="792"/>
+            <w:vAlign w:val="center"/>
+            <w:tcMar>
+              <w:top w:w="80" w:type="dxa"/>
+              <w:start w:w="120" w:type="dxa"/>
+              <w:bottom w:w="80" w:type="dxa"/>
+              <w:end w:w="120" w:type="dxa"/>
+            </w:tcMar>
+          </w:tcPr>
+          <w:p>
+            <w:pPr>
+              <w:spacing w:after="0" w:line="276" w:lineRule="auto"/>
+            </w:pPr>
+            <w:r/>
+            <w:r>
+              <w:rPr>
+                <w:rFonts w:ascii="Calibri" w:hAnsi="Calibri"/>
+                <w:b w:val="0"/>
+                <w:color w:val="1F2937"/>
+                <w:sz w:val="18"/>
+              </w:rPr>
+              <w:t>3</w:t>
+            </w:r>
+          </w:p>
+        </w:tc>
+        <w:tc>
+          <w:tcPr>
+            <w:tcW w:type="dxa" w:w="2088"/>
+            <w:vAlign w:val="center"/>
+            <w:tcMar>
+              <w:top w:w="80" w:type="dxa"/>
+              <w:start w:w="120" w:type="dxa"/>
+              <w:bottom w:w="80" w:type="dxa"/>
+              <w:end w:w="120" w:type="dxa"/>
+            </w:tcMar>
+          </w:tcPr>
+          <w:p>
+            <w:pPr>
+              <w:spacing w:after="0" w:line="276" w:lineRule="auto"/>
+            </w:pPr>
+            <w:r/>
+            <w:r>
+              <w:rPr>
+                <w:rFonts w:ascii="Calibri" w:hAnsi="Calibri"/>
+                <w:b w:val="0"/>
+                <w:color w:val="1F2937"/>
+                <w:sz w:val="18"/>
+              </w:rPr>
+              <w:t>Insureon NEMT / paratransit</w:t>
+            </w:r>
+          </w:p>
+        </w:tc>
+        <w:tc>
+          <w:tcPr>
+            <w:tcW w:type="dxa" w:w="1440"/>
+            <w:vAlign w:val="center"/>
+            <w:tcMar>
+              <w:top w:w="80" w:type="dxa"/>
+              <w:start w:w="120" w:type="dxa"/>
+              <w:bottom w:w="80" w:type="dxa"/>
+              <w:end w:w="120" w:type="dxa"/>
+            </w:tcMar>
+          </w:tcPr>
+          <w:p>
+            <w:pPr>
+              <w:spacing w:after="0" w:line="276" w:lineRule="auto"/>
+            </w:pPr>
+            <w:r/>
+            <w:r>
+              <w:rPr>
+                <w:rFonts w:ascii="Calibri" w:hAnsi="Calibri"/>
+                <w:b w:val="0"/>
+                <w:color w:val="1F2937"/>
+                <w:sz w:val="18"/>
+              </w:rPr>
+              <w:t>Not contacted</w:t>
+            </w:r>
+          </w:p>
+        </w:tc>
+        <w:tc>
+          <w:tcPr>
+            <w:tcW w:type="dxa" w:w="3024"/>
+            <w:vAlign w:val="center"/>
+            <w:tcMar>
+              <w:top w:w="80" w:type="dxa"/>
+              <w:start w:w="120" w:type="dxa"/>
+              <w:bottom w:w="80" w:type="dxa"/>
+              <w:end w:w="120" w:type="dxa"/>
+            </w:tcMar>
+          </w:tcPr>
+          <w:p>
+            <w:pPr>
+              <w:spacing w:after="0" w:line="276" w:lineRule="auto"/>
+            </w:pPr>
+            <w:r/>
+            <w:r>
+              <w:rPr>
+                <w:rFonts w:ascii="Calibri" w:hAnsi="Calibri"/>
+                <w:b w:val="0"/>
+                <w:color w:val="1F2937"/>
+                <w:sz w:val="18"/>
+              </w:rPr>
+              <w:t>Agent notes or quote requirements</w:t>
+            </w:r>
+          </w:p>
+        </w:tc>
+        <w:tc>
+          <w:tcPr>
+            <w:tcW w:type="dxa" w:w="2016"/>
+            <w:vAlign w:val="center"/>
+            <w:tcMar>
+              <w:top w:w="80" w:type="dxa"/>
+              <w:start w:w="120" w:type="dxa"/>
+              <w:bottom w:w="80" w:type="dxa"/>
+              <w:end w:w="120" w:type="dxa"/>
+            </w:tcMar>
+          </w:tcPr>
+          <w:p>
+            <w:pPr>
+              <w:spacing w:after="0" w:line="276" w:lineRule="auto"/>
+            </w:pPr>
+            <w:r/>
+            <w:r>
+              <w:rPr>
+                <w:rFonts w:ascii="Calibri" w:hAnsi="Calibri"/>
+                <w:b w:val="0"/>
+                <w:color w:val="1F2937"/>
+                <w:sz w:val="18"/>
+              </w:rPr>
+              <w:t>After approval, ask coverage-path questions only</w:t>
+            </w:r>
+          </w:p>
+        </w:tc>
+      </w:tr>
+      <w:tr>
+        <w:tc>
+          <w:tcPr>
+            <w:tcW w:type="dxa" w:w="792"/>
+            <w:vAlign w:val="center"/>
+            <w:tcMar>
+              <w:top w:w="80" w:type="dxa"/>
+              <w:start w:w="120" w:type="dxa"/>
+              <w:bottom w:w="80" w:type="dxa"/>
+              <w:end w:w="120" w:type="dxa"/>
+            </w:tcMar>
+          </w:tcPr>
+          <w:p>
+            <w:pPr>
+              <w:spacing w:after="0" w:line="276" w:lineRule="auto"/>
+            </w:pPr>
+            <w:r/>
+            <w:r>
+              <w:rPr>
+                <w:rFonts w:ascii="Calibri" w:hAnsi="Calibri"/>
+                <w:b w:val="0"/>
+                <w:color w:val="1F2937"/>
+                <w:sz w:val="18"/>
+              </w:rPr>
+              <w:t>4</w:t>
+            </w:r>
+          </w:p>
+        </w:tc>
+        <w:tc>
+          <w:tcPr>
+            <w:tcW w:type="dxa" w:w="2088"/>
+            <w:vAlign w:val="center"/>
+            <w:tcMar>
+              <w:top w:w="80" w:type="dxa"/>
+              <w:start w:w="120" w:type="dxa"/>
+              <w:bottom w:w="80" w:type="dxa"/>
+              <w:end w:w="120" w:type="dxa"/>
+            </w:tcMar>
+          </w:tcPr>
+          <w:p>
+            <w:pPr>
+              <w:spacing w:after="0" w:line="276" w:lineRule="auto"/>
+            </w:pPr>
+            <w:r/>
+            <w:r>
+              <w:rPr>
+                <w:rFonts w:ascii="Calibri" w:hAnsi="Calibri"/>
+                <w:b w:val="0"/>
+                <w:color w:val="1F2937"/>
+                <w:sz w:val="18"/>
+              </w:rPr>
+              <w:t>Frontier Access &amp; Mobility Cheyenne</w:t>
+            </w:r>
+          </w:p>
+        </w:tc>
+        <w:tc>
+          <w:tcPr>
+            <w:tcW w:type="dxa" w:w="1440"/>
+            <w:vAlign w:val="center"/>
+            <w:tcMar>
+              <w:top w:w="80" w:type="dxa"/>
+              <w:start w:w="120" w:type="dxa"/>
+              <w:bottom w:w="80" w:type="dxa"/>
+              <w:end w:w="120" w:type="dxa"/>
+            </w:tcMar>
+          </w:tcPr>
+          <w:p>
+            <w:pPr>
+              <w:spacing w:after="0" w:line="276" w:lineRule="auto"/>
+            </w:pPr>
+            <w:r/>
+            <w:r>
+              <w:rPr>
+                <w:rFonts w:ascii="Calibri" w:hAnsi="Calibri"/>
+                <w:b w:val="0"/>
+                <w:color w:val="1F2937"/>
+                <w:sz w:val="18"/>
+              </w:rPr>
+              <w:t>Not contacted</w:t>
+            </w:r>
+          </w:p>
+        </w:tc>
+        <w:tc>
+          <w:tcPr>
+            <w:tcW w:type="dxa" w:w="3024"/>
+            <w:vAlign w:val="center"/>
+            <w:tcMar>
+              <w:top w:w="80" w:type="dxa"/>
+              <w:start w:w="120" w:type="dxa"/>
+              <w:bottom w:w="80" w:type="dxa"/>
+              <w:end w:w="120" w:type="dxa"/>
+            </w:tcMar>
+          </w:tcPr>
+          <w:p>
+            <w:pPr>
+              <w:spacing w:after="0" w:line="276" w:lineRule="auto"/>
+            </w:pPr>
+            <w:r/>
+            <w:r>
+              <w:rPr>
+                <w:rFonts w:ascii="Calibri" w:hAnsi="Calibri"/>
+                <w:b w:val="0"/>
+                <w:color w:val="1F2937"/>
+                <w:sz w:val="18"/>
+              </w:rPr>
+              <w:t>Rental availability response or dated call notes</w:t>
+            </w:r>
+          </w:p>
+        </w:tc>
+        <w:tc>
+          <w:tcPr>
+            <w:tcW w:type="dxa" w:w="2016"/>
+            <w:vAlign w:val="center"/>
+            <w:tcMar>
+              <w:top w:w="80" w:type="dxa"/>
+              <w:start w:w="120" w:type="dxa"/>
+              <w:bottom w:w="80" w:type="dxa"/>
+              <w:end w:w="120" w:type="dxa"/>
+            </w:tcMar>
+          </w:tcPr>
+          <w:p>
+            <w:pPr>
+              <w:spacing w:after="0" w:line="276" w:lineRule="auto"/>
+            </w:pPr>
+            <w:r/>
+            <w:r>
+              <w:rPr>
+                <w:rFonts w:ascii="Calibri" w:hAnsi="Calibri"/>
+                <w:b w:val="0"/>
+                <w:color w:val="1F2937"/>
+                <w:sz w:val="18"/>
+              </w:rPr>
+              <w:t>After approval, call Cheyenne first</w:t>
+            </w:r>
+          </w:p>
+        </w:tc>
+      </w:tr>
+      <w:tr>
+        <w:tc>
+          <w:tcPr>
+            <w:tcW w:type="dxa" w:w="792"/>
+            <w:vAlign w:val="center"/>
+            <w:tcMar>
+              <w:top w:w="80" w:type="dxa"/>
+              <w:start w:w="120" w:type="dxa"/>
+              <w:bottom w:w="80" w:type="dxa"/>
+              <w:end w:w="120" w:type="dxa"/>
+            </w:tcMar>
+          </w:tcPr>
+          <w:p>
+            <w:pPr>
+              <w:spacing w:after="0" w:line="276" w:lineRule="auto"/>
+            </w:pPr>
+            <w:r/>
+            <w:r>
+              <w:rPr>
+                <w:rFonts w:ascii="Calibri" w:hAnsi="Calibri"/>
+                <w:b w:val="0"/>
+                <w:color w:val="1F2937"/>
+                <w:sz w:val="18"/>
+              </w:rPr>
+              <w:t>5</w:t>
+            </w:r>
+          </w:p>
+        </w:tc>
+        <w:tc>
+          <w:tcPr>
+            <w:tcW w:type="dxa" w:w="2088"/>
+            <w:vAlign w:val="center"/>
+            <w:tcMar>
+              <w:top w:w="80" w:type="dxa"/>
+              <w:start w:w="120" w:type="dxa"/>
+              <w:bottom w:w="80" w:type="dxa"/>
+              <w:end w:w="120" w:type="dxa"/>
+            </w:tcMar>
+          </w:tcPr>
+          <w:p>
+            <w:pPr>
+              <w:spacing w:after="0" w:line="276" w:lineRule="auto"/>
+            </w:pPr>
+            <w:r/>
+            <w:r>
+              <w:rPr>
+                <w:rFonts w:ascii="Calibri" w:hAnsi="Calibri"/>
+                <w:b w:val="0"/>
+                <w:color w:val="1F2937"/>
+                <w:sz w:val="18"/>
+              </w:rPr>
+              <w:t>MobilityWorks Rental Team</w:t>
+            </w:r>
+          </w:p>
+        </w:tc>
+        <w:tc>
+          <w:tcPr>
+            <w:tcW w:type="dxa" w:w="1440"/>
+            <w:vAlign w:val="center"/>
+            <w:tcMar>
+              <w:top w:w="80" w:type="dxa"/>
+              <w:start w:w="120" w:type="dxa"/>
+              <w:bottom w:w="80" w:type="dxa"/>
+              <w:end w:w="120" w:type="dxa"/>
+            </w:tcMar>
+          </w:tcPr>
+          <w:p>
+            <w:pPr>
+              <w:spacing w:after="0" w:line="276" w:lineRule="auto"/>
+            </w:pPr>
+            <w:r/>
+            <w:r>
+              <w:rPr>
+                <w:rFonts w:ascii="Calibri" w:hAnsi="Calibri"/>
+                <w:b w:val="0"/>
+                <w:color w:val="1F2937"/>
+                <w:sz w:val="18"/>
+              </w:rPr>
+              <w:t>Not contacted</w:t>
+            </w:r>
+          </w:p>
+        </w:tc>
+        <w:tc>
+          <w:tcPr>
+            <w:tcW w:type="dxa" w:w="3024"/>
+            <w:vAlign w:val="center"/>
+            <w:tcMar>
+              <w:top w:w="80" w:type="dxa"/>
+              <w:start w:w="120" w:type="dxa"/>
+              <w:bottom w:w="80" w:type="dxa"/>
+              <w:end w:w="120" w:type="dxa"/>
+            </w:tcMar>
+          </w:tcPr>
+          <w:p>
+            <w:pPr>
+              <w:spacing w:after="0" w:line="276" w:lineRule="auto"/>
+            </w:pPr>
+            <w:r/>
+            <w:r>
+              <w:rPr>
+                <w:rFonts w:ascii="Calibri" w:hAnsi="Calibri"/>
+                <w:b w:val="0"/>
+                <w:color w:val="1F2937"/>
+                <w:sz w:val="18"/>
+              </w:rPr>
+              <w:t>Rental quote or dated call notes</w:t>
+            </w:r>
+          </w:p>
+        </w:tc>
+        <w:tc>
+          <w:tcPr>
+            <w:tcW w:type="dxa" w:w="2016"/>
+            <w:vAlign w:val="center"/>
+            <w:tcMar>
+              <w:top w:w="80" w:type="dxa"/>
+              <w:start w:w="120" w:type="dxa"/>
+              <w:bottom w:w="80" w:type="dxa"/>
+              <w:end w:w="120" w:type="dxa"/>
+            </w:tcMar>
+          </w:tcPr>
+          <w:p>
+            <w:pPr>
+              <w:spacing w:after="0" w:line="276" w:lineRule="auto"/>
+            </w:pPr>
+            <w:r/>
+            <w:r>
+              <w:rPr>
+                <w:rFonts w:ascii="Calibri" w:hAnsi="Calibri"/>
+                <w:b w:val="0"/>
+                <w:color w:val="1F2937"/>
+                <w:sz w:val="18"/>
+              </w:rPr>
+              <w:t>After approval, request availability and requirements only</w:t>
+            </w:r>
+          </w:p>
+        </w:tc>
+      </w:tr>
+      <w:tr>
+        <w:tc>
+          <w:tcPr>
+            <w:tcW w:type="dxa" w:w="792"/>
+            <w:vAlign w:val="center"/>
+            <w:tcMar>
+              <w:top w:w="80" w:type="dxa"/>
+              <w:start w:w="120" w:type="dxa"/>
+              <w:bottom w:w="80" w:type="dxa"/>
+              <w:end w:w="120" w:type="dxa"/>
+            </w:tcMar>
+          </w:tcPr>
+          <w:p>
+            <w:pPr>
+              <w:spacing w:after="0" w:line="276" w:lineRule="auto"/>
+            </w:pPr>
+            <w:r/>
+            <w:r>
+              <w:rPr>
+                <w:rFonts w:ascii="Calibri" w:hAnsi="Calibri"/>
+                <w:b w:val="0"/>
+                <w:color w:val="1F2937"/>
+                <w:sz w:val="18"/>
+              </w:rPr>
+              <w:t>6</w:t>
+            </w:r>
+          </w:p>
+        </w:tc>
+        <w:tc>
+          <w:tcPr>
+            <w:tcW w:type="dxa" w:w="2088"/>
+            <w:vAlign w:val="center"/>
+            <w:tcMar>
+              <w:top w:w="80" w:type="dxa"/>
+              <w:start w:w="120" w:type="dxa"/>
+              <w:bottom w:w="80" w:type="dxa"/>
+              <w:end w:w="120" w:type="dxa"/>
+            </w:tcMar>
+          </w:tcPr>
+          <w:p>
+            <w:pPr>
+              <w:spacing w:after="0" w:line="276" w:lineRule="auto"/>
+            </w:pPr>
+            <w:r/>
+            <w:r>
+              <w:rPr>
+                <w:rFonts w:ascii="Calibri" w:hAnsi="Calibri"/>
+                <w:b w:val="0"/>
+                <w:color w:val="1F2937"/>
+                <w:sz w:val="18"/>
+              </w:rPr>
+              <w:t>MobilityWorks Aurora KR692569A</w:t>
+            </w:r>
+          </w:p>
+        </w:tc>
+        <w:tc>
+          <w:tcPr>
+            <w:tcW w:type="dxa" w:w="1440"/>
+            <w:vAlign w:val="center"/>
+            <w:tcMar>
+              <w:top w:w="80" w:type="dxa"/>
+              <w:start w:w="120" w:type="dxa"/>
+              <w:bottom w:w="80" w:type="dxa"/>
+              <w:end w:w="120" w:type="dxa"/>
+            </w:tcMar>
+          </w:tcPr>
+          <w:p>
+            <w:pPr>
+              <w:spacing w:after="0" w:line="276" w:lineRule="auto"/>
+            </w:pPr>
+            <w:r/>
+            <w:r>
+              <w:rPr>
+                <w:rFonts w:ascii="Calibri" w:hAnsi="Calibri"/>
+                <w:b w:val="0"/>
+                <w:color w:val="1F2937"/>
+                <w:sz w:val="18"/>
+              </w:rPr>
+              <w:t>Not contacted</w:t>
+            </w:r>
+          </w:p>
+        </w:tc>
+        <w:tc>
+          <w:tcPr>
+            <w:tcW w:type="dxa" w:w="3024"/>
+            <w:vAlign w:val="center"/>
+            <w:tcMar>
+              <w:top w:w="80" w:type="dxa"/>
+              <w:start w:w="120" w:type="dxa"/>
+              <w:bottom w:w="80" w:type="dxa"/>
+              <w:end w:w="120" w:type="dxa"/>
+            </w:tcMar>
+          </w:tcPr>
+          <w:p>
+            <w:pPr>
+              <w:spacing w:after="0" w:line="276" w:lineRule="auto"/>
+            </w:pPr>
+            <w:r/>
+            <w:r>
+              <w:rPr>
+                <w:rFonts w:ascii="Calibri" w:hAnsi="Calibri"/>
+                <w:b w:val="0"/>
+                <w:color w:val="1F2937"/>
+                <w:sz w:val="18"/>
+              </w:rPr>
+              <w:t>Written vehicle quote or dated call notes</w:t>
+            </w:r>
+          </w:p>
+        </w:tc>
+        <w:tc>
+          <w:tcPr>
+            <w:tcW w:type="dxa" w:w="2016"/>
+            <w:vAlign w:val="center"/>
+            <w:tcMar>
+              <w:top w:w="80" w:type="dxa"/>
+              <w:start w:w="120" w:type="dxa"/>
+              <w:bottom w:w="80" w:type="dxa"/>
+              <w:end w:w="120" w:type="dxa"/>
+            </w:tcMar>
+          </w:tcPr>
+          <w:p>
+            <w:pPr>
+              <w:spacing w:after="0" w:line="276" w:lineRule="auto"/>
+            </w:pPr>
+            <w:r/>
+            <w:r>
+              <w:rPr>
+                <w:rFonts w:ascii="Calibri" w:hAnsi="Calibri"/>
+                <w:b w:val="0"/>
+                <w:color w:val="1F2937"/>
+                <w:sz w:val="18"/>
+              </w:rPr>
+              <w:t>After approval, confirm availability without deposit or application</w:t>
+            </w:r>
+          </w:p>
+        </w:tc>
+      </w:tr>
+      <w:tr>
+        <w:tc>
+          <w:tcPr>
+            <w:tcW w:type="dxa" w:w="792"/>
+            <w:vAlign w:val="center"/>
+            <w:tcMar>
+              <w:top w:w="80" w:type="dxa"/>
+              <w:start w:w="120" w:type="dxa"/>
+              <w:bottom w:w="80" w:type="dxa"/>
+              <w:end w:w="120" w:type="dxa"/>
+            </w:tcMar>
+          </w:tcPr>
+          <w:p>
+            <w:pPr>
+              <w:spacing w:after="0" w:line="276" w:lineRule="auto"/>
+            </w:pPr>
+            <w:r/>
+            <w:r>
+              <w:rPr>
+                <w:rFonts w:ascii="Calibri" w:hAnsi="Calibri"/>
+                <w:b w:val="0"/>
+                <w:color w:val="1F2937"/>
+                <w:sz w:val="18"/>
+              </w:rPr>
+              <w:t>7</w:t>
+            </w:r>
+          </w:p>
+        </w:tc>
+        <w:tc>
+          <w:tcPr>
+            <w:tcW w:type="dxa" w:w="2088"/>
+            <w:vAlign w:val="center"/>
+            <w:tcMar>
+              <w:top w:w="80" w:type="dxa"/>
+              <w:start w:w="120" w:type="dxa"/>
+              <w:bottom w:w="80" w:type="dxa"/>
+              <w:end w:w="120" w:type="dxa"/>
+            </w:tcMar>
+          </w:tcPr>
+          <w:p>
+            <w:pPr>
+              <w:spacing w:after="0" w:line="276" w:lineRule="auto"/>
+            </w:pPr>
+            <w:r/>
+            <w:r>
+              <w:rPr>
+                <w:rFonts w:ascii="Calibri" w:hAnsi="Calibri"/>
+                <w:b w:val="0"/>
+                <w:color w:val="1F2937"/>
+                <w:sz w:val="18"/>
+              </w:rPr>
+              <w:t>MobilityWorks Commercial</w:t>
+            </w:r>
+          </w:p>
+        </w:tc>
+        <w:tc>
+          <w:tcPr>
+            <w:tcW w:type="dxa" w:w="1440"/>
+            <w:vAlign w:val="center"/>
+            <w:tcMar>
+              <w:top w:w="80" w:type="dxa"/>
+              <w:start w:w="120" w:type="dxa"/>
+              <w:bottom w:w="80" w:type="dxa"/>
+              <w:end w:w="120" w:type="dxa"/>
+            </w:tcMar>
+          </w:tcPr>
+          <w:p>
+            <w:pPr>
+              <w:spacing w:after="0" w:line="276" w:lineRule="auto"/>
+            </w:pPr>
+            <w:r/>
+            <w:r>
+              <w:rPr>
+                <w:rFonts w:ascii="Calibri" w:hAnsi="Calibri"/>
+                <w:b w:val="0"/>
+                <w:color w:val="1F2937"/>
+                <w:sz w:val="18"/>
+              </w:rPr>
+              <w:t>Not contacted</w:t>
+            </w:r>
+          </w:p>
+        </w:tc>
+        <w:tc>
+          <w:tcPr>
+            <w:tcW w:type="dxa" w:w="3024"/>
+            <w:vAlign w:val="center"/>
+            <w:tcMar>
+              <w:top w:w="80" w:type="dxa"/>
+              <w:start w:w="120" w:type="dxa"/>
+              <w:bottom w:w="80" w:type="dxa"/>
+              <w:end w:w="120" w:type="dxa"/>
+            </w:tcMar>
+          </w:tcPr>
+          <w:p>
+            <w:pPr>
+              <w:spacing w:after="0" w:line="276" w:lineRule="auto"/>
+            </w:pPr>
+            <w:r/>
+            <w:r>
+              <w:rPr>
+                <w:rFonts w:ascii="Calibri" w:hAnsi="Calibri"/>
+                <w:b w:val="0"/>
+                <w:color w:val="1F2937"/>
+                <w:sz w:val="18"/>
+              </w:rPr>
+              <w:t>Lease availability response or dated call notes</w:t>
+            </w:r>
+          </w:p>
+        </w:tc>
+        <w:tc>
+          <w:tcPr>
+            <w:tcW w:type="dxa" w:w="2016"/>
+            <w:vAlign w:val="center"/>
+            <w:tcMar>
+              <w:top w:w="80" w:type="dxa"/>
+              <w:start w:w="120" w:type="dxa"/>
+              <w:bottom w:w="80" w:type="dxa"/>
+              <w:end w:w="120" w:type="dxa"/>
+            </w:tcMar>
+          </w:tcPr>
+          <w:p>
+            <w:pPr>
+              <w:spacing w:after="0" w:line="276" w:lineRule="auto"/>
+            </w:pPr>
+            <w:r/>
+            <w:r>
+              <w:rPr>
+                <w:rFonts w:ascii="Calibri" w:hAnsi="Calibri"/>
+                <w:b w:val="0"/>
+                <w:color w:val="1F2937"/>
+                <w:sz w:val="18"/>
+              </w:rPr>
+              <w:t>After approval, request preliminary fit only</w:t>
+            </w:r>
+          </w:p>
+        </w:tc>
+      </w:tr>
+      <w:tr>
+        <w:tc>
+          <w:tcPr>
+            <w:tcW w:type="dxa" w:w="792"/>
+            <w:vAlign w:val="center"/>
+            <w:tcMar>
+              <w:top w:w="80" w:type="dxa"/>
+              <w:start w:w="120" w:type="dxa"/>
+              <w:bottom w:w="80" w:type="dxa"/>
+              <w:end w:w="120" w:type="dxa"/>
+            </w:tcMar>
+          </w:tcPr>
+          <w:p>
+            <w:pPr>
+              <w:spacing w:after="0" w:line="276" w:lineRule="auto"/>
+            </w:pPr>
+            <w:r/>
+            <w:r>
+              <w:rPr>
+                <w:rFonts w:ascii="Calibri" w:hAnsi="Calibri"/>
+                <w:b w:val="0"/>
+                <w:color w:val="1F2937"/>
+                <w:sz w:val="18"/>
+              </w:rPr>
+              <w:t>8</w:t>
+            </w:r>
+          </w:p>
+        </w:tc>
+        <w:tc>
+          <w:tcPr>
+            <w:tcW w:type="dxa" w:w="2088"/>
+            <w:vAlign w:val="center"/>
+            <w:tcMar>
+              <w:top w:w="80" w:type="dxa"/>
+              <w:start w:w="120" w:type="dxa"/>
+              <w:bottom w:w="80" w:type="dxa"/>
+              <w:end w:w="120" w:type="dxa"/>
+            </w:tcMar>
+          </w:tcPr>
+          <w:p>
+            <w:pPr>
+              <w:spacing w:after="0" w:line="276" w:lineRule="auto"/>
+            </w:pPr>
+            <w:r/>
+            <w:r>
+              <w:rPr>
+                <w:rFonts w:ascii="Calibri" w:hAnsi="Calibri"/>
+                <w:b w:val="0"/>
+                <w:color w:val="1F2937"/>
+                <w:sz w:val="18"/>
+              </w:rPr>
+              <w:t>United Access</w:t>
+            </w:r>
+          </w:p>
+        </w:tc>
+        <w:tc>
+          <w:tcPr>
+            <w:tcW w:type="dxa" w:w="1440"/>
+            <w:vAlign w:val="center"/>
+            <w:tcMar>
+              <w:top w:w="80" w:type="dxa"/>
+              <w:start w:w="120" w:type="dxa"/>
+              <w:bottom w:w="80" w:type="dxa"/>
+              <w:end w:w="120" w:type="dxa"/>
+            </w:tcMar>
+          </w:tcPr>
+          <w:p>
+            <w:pPr>
+              <w:spacing w:after="0" w:line="276" w:lineRule="auto"/>
+            </w:pPr>
+            <w:r/>
+            <w:r>
+              <w:rPr>
+                <w:rFonts w:ascii="Calibri" w:hAnsi="Calibri"/>
+                <w:b w:val="0"/>
+                <w:color w:val="1F2937"/>
+                <w:sz w:val="18"/>
+              </w:rPr>
+              <w:t>Drafted not sent</w:t>
+            </w:r>
+          </w:p>
+        </w:tc>
+        <w:tc>
+          <w:tcPr>
+            <w:tcW w:type="dxa" w:w="3024"/>
+            <w:vAlign w:val="center"/>
+            <w:tcMar>
+              <w:top w:w="80" w:type="dxa"/>
+              <w:start w:w="120" w:type="dxa"/>
+              <w:bottom w:w="80" w:type="dxa"/>
+              <w:end w:w="120" w:type="dxa"/>
+            </w:tcMar>
+          </w:tcPr>
+          <w:p>
+            <w:pPr>
+              <w:spacing w:after="0" w:line="276" w:lineRule="auto"/>
+            </w:pPr>
+            <w:r/>
+            <w:r>
+              <w:rPr>
+                <w:rFonts w:ascii="Calibri" w:hAnsi="Calibri"/>
+                <w:b w:val="0"/>
+                <w:color w:val="1F2937"/>
+                <w:sz w:val="18"/>
+              </w:rPr>
+              <w:t>Written quote or timing response</w:t>
+            </w:r>
+          </w:p>
+        </w:tc>
+        <w:tc>
+          <w:tcPr>
+            <w:tcW w:type="dxa" w:w="2016"/>
+            <w:vAlign w:val="center"/>
+            <w:tcMar>
+              <w:top w:w="80" w:type="dxa"/>
+              <w:start w:w="120" w:type="dxa"/>
+              <w:bottom w:w="80" w:type="dxa"/>
+              <w:end w:w="120" w:type="dxa"/>
+            </w:tcMar>
+          </w:tcPr>
+          <w:p>
+            <w:pPr>
+              <w:spacing w:after="0" w:line="276" w:lineRule="auto"/>
+            </w:pPr>
+            <w:r/>
+            <w:r>
+              <w:rPr>
+                <w:rFonts w:ascii="Calibri" w:hAnsi="Calibri"/>
+                <w:b w:val="0"/>
+                <w:color w:val="1F2937"/>
+                <w:sz w:val="18"/>
+              </w:rPr>
+              <w:t>After approval, send exact draft or call for availability</w:t>
+            </w:r>
+          </w:p>
+        </w:tc>
+      </w:tr>
+      <w:tr>
+        <w:tc>
+          <w:tcPr>
+            <w:tcW w:type="dxa" w:w="792"/>
+            <w:vAlign w:val="center"/>
+            <w:tcMar>
+              <w:top w:w="80" w:type="dxa"/>
+              <w:start w:w="120" w:type="dxa"/>
+              <w:bottom w:w="80" w:type="dxa"/>
+              <w:end w:w="120" w:type="dxa"/>
+            </w:tcMar>
+          </w:tcPr>
+          <w:p>
+            <w:pPr>
+              <w:spacing w:after="0" w:line="276" w:lineRule="auto"/>
+            </w:pPr>
+            <w:r/>
+            <w:r>
+              <w:rPr>
+                <w:rFonts w:ascii="Calibri" w:hAnsi="Calibri"/>
+                <w:b w:val="0"/>
+                <w:color w:val="1F2937"/>
+                <w:sz w:val="18"/>
+              </w:rPr>
+              <w:t>9</w:t>
+            </w:r>
+          </w:p>
+        </w:tc>
+        <w:tc>
+          <w:tcPr>
+            <w:tcW w:type="dxa" w:w="2088"/>
+            <w:vAlign w:val="center"/>
+            <w:tcMar>
+              <w:top w:w="80" w:type="dxa"/>
+              <w:start w:w="120" w:type="dxa"/>
+              <w:bottom w:w="80" w:type="dxa"/>
+              <w:end w:w="120" w:type="dxa"/>
+            </w:tcMar>
+          </w:tcPr>
+          <w:p>
+            <w:pPr>
+              <w:spacing w:after="0" w:line="276" w:lineRule="auto"/>
+            </w:pPr>
+            <w:r/>
+            <w:r>
+              <w:rPr>
+                <w:rFonts w:ascii="Calibri" w:hAnsi="Calibri"/>
+                <w:b w:val="0"/>
+                <w:color w:val="1F2937"/>
+                <w:sz w:val="18"/>
+              </w:rPr>
+              <w:t>WyoMicro</w:t>
+            </w:r>
+          </w:p>
+        </w:tc>
+        <w:tc>
+          <w:tcPr>
+            <w:tcW w:type="dxa" w:w="1440"/>
+            <w:vAlign w:val="center"/>
+            <w:tcMar>
+              <w:top w:w="80" w:type="dxa"/>
+              <w:start w:w="120" w:type="dxa"/>
+              <w:bottom w:w="80" w:type="dxa"/>
+              <w:end w:w="120" w:type="dxa"/>
+            </w:tcMar>
+          </w:tcPr>
+          <w:p>
+            <w:pPr>
+              <w:spacing w:after="0" w:line="276" w:lineRule="auto"/>
+            </w:pPr>
+            <w:r/>
+            <w:r>
+              <w:rPr>
+                <w:rFonts w:ascii="Calibri" w:hAnsi="Calibri"/>
+                <w:b w:val="0"/>
+                <w:color w:val="1F2937"/>
+                <w:sz w:val="18"/>
+              </w:rPr>
+              <w:t>Drafted not sent</w:t>
+            </w:r>
+          </w:p>
+        </w:tc>
+        <w:tc>
+          <w:tcPr>
+            <w:tcW w:type="dxa" w:w="3024"/>
+            <w:vAlign w:val="center"/>
+            <w:tcMar>
+              <w:top w:w="80" w:type="dxa"/>
+              <w:start w:w="120" w:type="dxa"/>
+              <w:bottom w:w="80" w:type="dxa"/>
+              <w:end w:w="120" w:type="dxa"/>
+            </w:tcMar>
+          </w:tcPr>
+          <w:p>
+            <w:pPr>
+              <w:spacing w:after="0" w:line="276" w:lineRule="auto"/>
+            </w:pPr>
+            <w:r/>
+            <w:r>
+              <w:rPr>
+                <w:rFonts w:ascii="Calibri" w:hAnsi="Calibri"/>
+                <w:b w:val="0"/>
+                <w:color w:val="1F2937"/>
+                <w:sz w:val="18"/>
+              </w:rPr>
+              <w:t>Written preliminary fit response</w:t>
+            </w:r>
+          </w:p>
+        </w:tc>
+        <w:tc>
+          <w:tcPr>
+            <w:tcW w:type="dxa" w:w="2016"/>
+            <w:vAlign w:val="center"/>
+            <w:tcMar>
+              <w:top w:w="80" w:type="dxa"/>
+              <w:start w:w="120" w:type="dxa"/>
+              <w:bottom w:w="80" w:type="dxa"/>
+              <w:end w:w="120" w:type="dxa"/>
+            </w:tcMar>
+          </w:tcPr>
+          <w:p>
+            <w:pPr>
+              <w:spacing w:after="0" w:line="276" w:lineRule="auto"/>
+            </w:pPr>
+            <w:r/>
+            <w:r>
+              <w:rPr>
+                <w:rFonts w:ascii="Calibri" w:hAnsi="Calibri"/>
+                <w:b w:val="0"/>
+                <w:color w:val="1F2937"/>
+                <w:sz w:val="18"/>
+              </w:rPr>
+              <w:t>After approval, send exact fit question draft</w:t>
+            </w:r>
+          </w:p>
+        </w:tc>
+      </w:tr>
+      <w:tr>
+        <w:tc>
+          <w:tcPr>
+            <w:tcW w:type="dxa" w:w="792"/>
+            <w:vAlign w:val="center"/>
+            <w:tcMar>
+              <w:top w:w="80" w:type="dxa"/>
+              <w:start w:w="120" w:type="dxa"/>
+              <w:bottom w:w="80" w:type="dxa"/>
+              <w:end w:w="120" w:type="dxa"/>
+            </w:tcMar>
+          </w:tcPr>
+          <w:p>
+            <w:pPr>
+              <w:spacing w:after="0" w:line="276" w:lineRule="auto"/>
+            </w:pPr>
+            <w:r/>
+            <w:r>
+              <w:rPr>
+                <w:rFonts w:ascii="Calibri" w:hAnsi="Calibri"/>
+                <w:b w:val="0"/>
+                <w:color w:val="1F2937"/>
+                <w:sz w:val="18"/>
+              </w:rPr>
+              <w:t>10</w:t>
+            </w:r>
+          </w:p>
+        </w:tc>
+        <w:tc>
+          <w:tcPr>
+            <w:tcW w:type="dxa" w:w="2088"/>
+            <w:vAlign w:val="center"/>
+            <w:tcMar>
+              <w:top w:w="80" w:type="dxa"/>
+              <w:start w:w="120" w:type="dxa"/>
+              <w:bottom w:w="80" w:type="dxa"/>
+              <w:end w:w="120" w:type="dxa"/>
+            </w:tcMar>
+          </w:tcPr>
+          <w:p>
+            <w:pPr>
+              <w:spacing w:after="0" w:line="276" w:lineRule="auto"/>
+            </w:pPr>
+            <w:r/>
+            <w:r>
+              <w:rPr>
+                <w:rFonts w:ascii="Calibri" w:hAnsi="Calibri"/>
+                <w:b w:val="0"/>
+                <w:color w:val="1F2937"/>
+                <w:sz w:val="18"/>
+              </w:rPr>
+              <w:t>Platte County Chamber</w:t>
+            </w:r>
+          </w:p>
+        </w:tc>
+        <w:tc>
+          <w:tcPr>
+            <w:tcW w:type="dxa" w:w="1440"/>
+            <w:vAlign w:val="center"/>
+            <w:tcMar>
+              <w:top w:w="80" w:type="dxa"/>
+              <w:start w:w="120" w:type="dxa"/>
+              <w:bottom w:w="80" w:type="dxa"/>
+              <w:end w:w="120" w:type="dxa"/>
+            </w:tcMar>
+          </w:tcPr>
+          <w:p>
+            <w:pPr>
+              <w:spacing w:after="0" w:line="276" w:lineRule="auto"/>
+            </w:pPr>
+            <w:r/>
+            <w:r>
+              <w:rPr>
+                <w:rFonts w:ascii="Calibri" w:hAnsi="Calibri"/>
+                <w:b w:val="0"/>
+                <w:color w:val="1F2937"/>
+                <w:sz w:val="18"/>
+              </w:rPr>
+              <w:t>Drafted not sent</w:t>
+            </w:r>
+          </w:p>
+        </w:tc>
+        <w:tc>
+          <w:tcPr>
+            <w:tcW w:type="dxa" w:w="3024"/>
+            <w:vAlign w:val="center"/>
+            <w:tcMar>
+              <w:top w:w="80" w:type="dxa"/>
+              <w:start w:w="120" w:type="dxa"/>
+              <w:bottom w:w="80" w:type="dxa"/>
+              <w:end w:w="120" w:type="dxa"/>
+            </w:tcMar>
+          </w:tcPr>
+          <w:p>
+            <w:pPr>
+              <w:spacing w:after="0" w:line="276" w:lineRule="auto"/>
+            </w:pPr>
+            <w:r/>
+            <w:r>
+              <w:rPr>
+                <w:rFonts w:ascii="Calibri" w:hAnsi="Calibri"/>
+                <w:b w:val="0"/>
+                <w:color w:val="1F2937"/>
+                <w:sz w:val="18"/>
+              </w:rPr>
+              <w:t>Meeting response, pledge interest, or local introduction</w:t>
+            </w:r>
+          </w:p>
+        </w:tc>
+        <w:tc>
+          <w:tcPr>
+            <w:tcW w:type="dxa" w:w="2016"/>
+            <w:vAlign w:val="center"/>
+            <w:tcMar>
+              <w:top w:w="80" w:type="dxa"/>
+              <w:start w:w="120" w:type="dxa"/>
+              <w:bottom w:w="80" w:type="dxa"/>
+              <w:end w:w="120" w:type="dxa"/>
+            </w:tcMar>
+          </w:tcPr>
+          <w:p>
+            <w:pPr>
+              <w:spacing w:after="0" w:line="276" w:lineRule="auto"/>
+            </w:pPr>
+            <w:r/>
+            <w:r>
+              <w:rPr>
+                <w:rFonts w:ascii="Calibri" w:hAnsi="Calibri"/>
+                <w:b w:val="0"/>
+                <w:color w:val="1F2937"/>
+                <w:sz w:val="18"/>
+              </w:rPr>
+              <w:t>After approval, send exact planning-call draft</w:t>
+            </w:r>
+          </w:p>
+        </w:tc>
+      </w:tr>
+      <w:tr>
+        <w:tc>
+          <w:tcPr>
+            <w:tcW w:type="dxa" w:w="792"/>
+            <w:vAlign w:val="center"/>
+            <w:tcMar>
+              <w:top w:w="80" w:type="dxa"/>
+              <w:start w:w="120" w:type="dxa"/>
+              <w:bottom w:w="80" w:type="dxa"/>
+              <w:end w:w="120" w:type="dxa"/>
+            </w:tcMar>
+          </w:tcPr>
+          <w:p>
+            <w:pPr>
+              <w:spacing w:after="0" w:line="276" w:lineRule="auto"/>
+            </w:pPr>
+            <w:r/>
+            <w:r>
+              <w:rPr>
+                <w:rFonts w:ascii="Calibri" w:hAnsi="Calibri"/>
+                <w:b w:val="0"/>
+                <w:color w:val="1F2937"/>
+                <w:sz w:val="18"/>
+              </w:rPr>
+              <w:t>11</w:t>
+            </w:r>
+          </w:p>
+        </w:tc>
+        <w:tc>
+          <w:tcPr>
+            <w:tcW w:type="dxa" w:w="2088"/>
+            <w:vAlign w:val="center"/>
+            <w:tcMar>
+              <w:top w:w="80" w:type="dxa"/>
+              <w:start w:w="120" w:type="dxa"/>
+              <w:bottom w:w="80" w:type="dxa"/>
+              <w:end w:w="120" w:type="dxa"/>
+            </w:tcMar>
+          </w:tcPr>
+          <w:p>
+            <w:pPr>
+              <w:spacing w:after="0" w:line="276" w:lineRule="auto"/>
+            </w:pPr>
+            <w:r/>
+            <w:r>
+              <w:rPr>
+                <w:rFonts w:ascii="Calibri" w:hAnsi="Calibri"/>
+                <w:b w:val="0"/>
+                <w:color w:val="1F2937"/>
+                <w:sz w:val="18"/>
+              </w:rPr>
+              <w:t>Platte County Economic Development</w:t>
+            </w:r>
+          </w:p>
+        </w:tc>
+        <w:tc>
+          <w:tcPr>
+            <w:tcW w:type="dxa" w:w="1440"/>
+            <w:vAlign w:val="center"/>
+            <w:tcMar>
+              <w:top w:w="80" w:type="dxa"/>
+              <w:start w:w="120" w:type="dxa"/>
+              <w:bottom w:w="80" w:type="dxa"/>
+              <w:end w:w="120" w:type="dxa"/>
+            </w:tcMar>
+          </w:tcPr>
+          <w:p>
+            <w:pPr>
+              <w:spacing w:after="0" w:line="276" w:lineRule="auto"/>
+            </w:pPr>
+            <w:r/>
+            <w:r>
+              <w:rPr>
+                <w:rFonts w:ascii="Calibri" w:hAnsi="Calibri"/>
+                <w:b w:val="0"/>
+                <w:color w:val="1F2937"/>
+                <w:sz w:val="18"/>
+              </w:rPr>
+              <w:t>Drafted not sent</w:t>
+            </w:r>
+          </w:p>
+        </w:tc>
+        <w:tc>
+          <w:tcPr>
+            <w:tcW w:type="dxa" w:w="3024"/>
+            <w:vAlign w:val="center"/>
+            <w:tcMar>
+              <w:top w:w="80" w:type="dxa"/>
+              <w:start w:w="120" w:type="dxa"/>
+              <w:bottom w:w="80" w:type="dxa"/>
+              <w:end w:w="120" w:type="dxa"/>
+            </w:tcMar>
+          </w:tcPr>
+          <w:p>
+            <w:pPr>
+              <w:spacing w:after="0" w:line="276" w:lineRule="auto"/>
+            </w:pPr>
+            <w:r/>
+            <w:r>
+              <w:rPr>
+                <w:rFonts w:ascii="Calibri" w:hAnsi="Calibri"/>
+                <w:b w:val="0"/>
+                <w:color w:val="1F2937"/>
+                <w:sz w:val="18"/>
+              </w:rPr>
+              <w:t>Meeting response, pledge interest, or partner payment path</w:t>
+            </w:r>
+          </w:p>
+        </w:tc>
+        <w:tc>
+          <w:tcPr>
+            <w:tcW w:type="dxa" w:w="2016"/>
+            <w:vAlign w:val="center"/>
+            <w:tcMar>
+              <w:top w:w="80" w:type="dxa"/>
+              <w:start w:w="120" w:type="dxa"/>
+              <w:bottom w:w="80" w:type="dxa"/>
+              <w:end w:w="120" w:type="dxa"/>
+            </w:tcMar>
+          </w:tcPr>
+          <w:p>
+            <w:pPr>
+              <w:spacing w:after="0" w:line="276" w:lineRule="auto"/>
+            </w:pPr>
+            <w:r/>
+            <w:r>
+              <w:rPr>
+                <w:rFonts w:ascii="Calibri" w:hAnsi="Calibri"/>
+                <w:b w:val="0"/>
+                <w:color w:val="1F2937"/>
+                <w:sz w:val="18"/>
+              </w:rPr>
+              <w:t>After approval, send exact planning-call draft</w:t>
+            </w:r>
+          </w:p>
+        </w:tc>
+      </w:tr>
+    </w:tbl>
+    <w:p>
       <w:r>
         <w:br w:type="page"/>
       </w:r>
@@ -2699,7 +4909,7 @@
                 <w:color w:val="1F2937"/>
                 <w:sz w:val="18"/>
               </w:rPr>
-              <w:t>$32,991 public listing; coming soon</w:t>
+              <w:t>$32,991 public listing; public page showed in stock on August 2, 2026; $500 deposit path shown but not authorized</w:t>
             </w:r>
           </w:p>
         </w:tc>
@@ -2753,7 +4963,7 @@
                 <w:color w:val="1F2937"/>
                 <w:sz w:val="18"/>
               </w:rPr>
-              <w:t>Call MobilityWorks Aurora and ask whether KR692569A can be quoted for Wheatland business-use diligence.</w:t>
+              <w:t>Call MobilityWorks Aurora and ask whether KR692569A is still available for Wheatland business-use diligence, without deposit or application.</w:t>
             </w:r>
           </w:p>
         </w:tc>
@@ -4070,6 +6280,826 @@
           </w:p>
         </w:tc>
       </w:tr>
+      <w:tr>
+        <w:tc>
+          <w:tcPr>
+            <w:tcW w:type="dxa" w:w="792"/>
+            <w:vAlign w:val="center"/>
+            <w:tcMar>
+              <w:top w:w="80" w:type="dxa"/>
+              <w:start w:w="120" w:type="dxa"/>
+              <w:bottom w:w="80" w:type="dxa"/>
+              <w:end w:w="120" w:type="dxa"/>
+            </w:tcMar>
+          </w:tcPr>
+          <w:p>
+            <w:pPr>
+              <w:spacing w:after="0" w:line="276" w:lineRule="auto"/>
+            </w:pPr>
+            <w:r/>
+            <w:r>
+              <w:rPr>
+                <w:rFonts w:ascii="Calibri" w:hAnsi="Calibri"/>
+                <w:b w:val="0"/>
+                <w:color w:val="1F2937"/>
+                <w:sz w:val="18"/>
+              </w:rPr>
+              <w:t>8</w:t>
+            </w:r>
+          </w:p>
+        </w:tc>
+        <w:tc>
+          <w:tcPr>
+            <w:tcW w:type="dxa" w:w="1656"/>
+            <w:vAlign w:val="center"/>
+            <w:tcMar>
+              <w:top w:w="80" w:type="dxa"/>
+              <w:start w:w="120" w:type="dxa"/>
+              <w:bottom w:w="80" w:type="dxa"/>
+              <w:end w:w="120" w:type="dxa"/>
+            </w:tcMar>
+          </w:tcPr>
+          <w:p>
+            <w:pPr>
+              <w:spacing w:after="0" w:line="276" w:lineRule="auto"/>
+            </w:pPr>
+            <w:r/>
+            <w:r>
+              <w:rPr>
+                <w:rFonts w:ascii="Calibri" w:hAnsi="Calibri"/>
+                <w:b w:val="0"/>
+                <w:color w:val="1F2937"/>
+                <w:sz w:val="18"/>
+              </w:rPr>
+              <w:t>Frontier Access &amp; Mobility</w:t>
+            </w:r>
+          </w:p>
+        </w:tc>
+        <w:tc>
+          <w:tcPr>
+            <w:tcW w:type="dxa" w:w="2088"/>
+            <w:vAlign w:val="center"/>
+            <w:tcMar>
+              <w:top w:w="80" w:type="dxa"/>
+              <w:start w:w="120" w:type="dxa"/>
+              <w:bottom w:w="80" w:type="dxa"/>
+              <w:end w:w="120" w:type="dxa"/>
+            </w:tcMar>
+          </w:tcPr>
+          <w:p>
+            <w:pPr>
+              <w:spacing w:after="0" w:line="276" w:lineRule="auto"/>
+            </w:pPr>
+            <w:r/>
+            <w:r>
+              <w:rPr>
+                <w:rFonts w:ascii="Calibri" w:hAnsi="Calibri"/>
+                <w:b w:val="0"/>
+                <w:color w:val="1F2937"/>
+                <w:sz w:val="18"/>
+              </w:rPr>
+              <w:t>Cheyenne/Fort Collins accessible van rental or sale</w:t>
+            </w:r>
+          </w:p>
+        </w:tc>
+        <w:tc>
+          <w:tcPr>
+            <w:tcW w:type="dxa" w:w="1656"/>
+            <w:vAlign w:val="center"/>
+            <w:tcMar>
+              <w:top w:w="80" w:type="dxa"/>
+              <w:start w:w="120" w:type="dxa"/>
+              <w:bottom w:w="80" w:type="dxa"/>
+              <w:end w:w="120" w:type="dxa"/>
+            </w:tcMar>
+          </w:tcPr>
+          <w:p>
+            <w:pPr>
+              <w:spacing w:after="0" w:line="276" w:lineRule="auto"/>
+            </w:pPr>
+            <w:r/>
+            <w:r>
+              <w:rPr>
+                <w:rFonts w:ascii="Calibri" w:hAnsi="Calibri"/>
+                <w:b w:val="0"/>
+                <w:color w:val="1F2937"/>
+                <w:sz w:val="18"/>
+              </w:rPr>
+              <w:t>Public rental page lists $135/day up to 1 week, $770/week up to 1 month, $2,400/month up to 1 year; tax, delivery, and pickup fees excluded; availability requires call</w:t>
+            </w:r>
+          </w:p>
+        </w:tc>
+        <w:tc>
+          <w:tcPr>
+            <w:tcW w:type="dxa" w:w="1512"/>
+            <w:vAlign w:val="center"/>
+            <w:tcMar>
+              <w:top w:w="80" w:type="dxa"/>
+              <w:start w:w="120" w:type="dxa"/>
+              <w:bottom w:w="80" w:type="dxa"/>
+              <w:end w:w="120" w:type="dxa"/>
+            </w:tcMar>
+          </w:tcPr>
+          <w:p>
+            <w:pPr>
+              <w:spacing w:after="0" w:line="276" w:lineRule="auto"/>
+            </w:pPr>
+            <w:r/>
+            <w:r>
+              <w:rPr>
+                <w:rFonts w:ascii="Calibri" w:hAnsi="Calibri"/>
+                <w:b w:val="0"/>
+                <w:color w:val="1F2937"/>
+                <w:sz w:val="18"/>
+              </w:rPr>
+              <w:t>Rental, sale, service-support, or inspection path if primary MobilityWorks/United Access paths slip</w:t>
+            </w:r>
+          </w:p>
+        </w:tc>
+        <w:tc>
+          <w:tcPr>
+            <w:tcW w:type="dxa" w:w="1656"/>
+            <w:vAlign w:val="center"/>
+            <w:tcMar>
+              <w:top w:w="80" w:type="dxa"/>
+              <w:start w:w="120" w:type="dxa"/>
+              <w:bottom w:w="80" w:type="dxa"/>
+              <w:end w:w="120" w:type="dxa"/>
+            </w:tcMar>
+          </w:tcPr>
+          <w:p>
+            <w:pPr>
+              <w:spacing w:after="0" w:line="276" w:lineRule="auto"/>
+            </w:pPr>
+            <w:r/>
+            <w:r>
+              <w:rPr>
+                <w:rFonts w:ascii="Calibri" w:hAnsi="Calibri"/>
+                <w:b w:val="0"/>
+                <w:color w:val="1F2937"/>
+                <w:sz w:val="18"/>
+              </w:rPr>
+              <w:t>Call Cheyenne first for August 10-15 availability and business-use requirements.</w:t>
+            </w:r>
+          </w:p>
+        </w:tc>
+      </w:tr>
+      <w:tr>
+        <w:tc>
+          <w:tcPr>
+            <w:tcW w:type="dxa" w:w="792"/>
+            <w:vAlign w:val="center"/>
+            <w:tcMar>
+              <w:top w:w="80" w:type="dxa"/>
+              <w:start w:w="120" w:type="dxa"/>
+              <w:bottom w:w="80" w:type="dxa"/>
+              <w:end w:w="120" w:type="dxa"/>
+            </w:tcMar>
+          </w:tcPr>
+          <w:p>
+            <w:pPr>
+              <w:spacing w:after="0" w:line="276" w:lineRule="auto"/>
+            </w:pPr>
+            <w:r/>
+            <w:r>
+              <w:rPr>
+                <w:rFonts w:ascii="Calibri" w:hAnsi="Calibri"/>
+                <w:b w:val="0"/>
+                <w:color w:val="1F2937"/>
+                <w:sz w:val="18"/>
+              </w:rPr>
+              <w:t>9</w:t>
+            </w:r>
+          </w:p>
+        </w:tc>
+        <w:tc>
+          <w:tcPr>
+            <w:tcW w:type="dxa" w:w="1656"/>
+            <w:vAlign w:val="center"/>
+            <w:tcMar>
+              <w:top w:w="80" w:type="dxa"/>
+              <w:start w:w="120" w:type="dxa"/>
+              <w:bottom w:w="80" w:type="dxa"/>
+              <w:end w:w="120" w:type="dxa"/>
+            </w:tcMar>
+          </w:tcPr>
+          <w:p>
+            <w:pPr>
+              <w:spacing w:after="0" w:line="276" w:lineRule="auto"/>
+            </w:pPr>
+            <w:r/>
+            <w:r>
+              <w:rPr>
+                <w:rFonts w:ascii="Calibri" w:hAnsi="Calibri"/>
+                <w:b w:val="0"/>
+                <w:color w:val="1F2937"/>
+                <w:sz w:val="18"/>
+              </w:rPr>
+              <w:t>Wheelchair Getaways / Cheyenne path</w:t>
+            </w:r>
+          </w:p>
+        </w:tc>
+        <w:tc>
+          <w:tcPr>
+            <w:tcW w:type="dxa" w:w="2088"/>
+            <w:vAlign w:val="center"/>
+            <w:tcMar>
+              <w:top w:w="80" w:type="dxa"/>
+              <w:start w:w="120" w:type="dxa"/>
+              <w:bottom w:w="80" w:type="dxa"/>
+              <w:end w:w="120" w:type="dxa"/>
+            </w:tcMar>
+          </w:tcPr>
+          <w:p>
+            <w:pPr>
+              <w:spacing w:after="0" w:line="276" w:lineRule="auto"/>
+            </w:pPr>
+            <w:r/>
+            <w:r>
+              <w:rPr>
+                <w:rFonts w:ascii="Calibri" w:hAnsi="Calibri"/>
+                <w:b w:val="0"/>
+                <w:color w:val="1F2937"/>
+                <w:sz w:val="18"/>
+              </w:rPr>
+              <w:t>Cheyenne-area wheelchair-accessible van rental</w:t>
+            </w:r>
+          </w:p>
+        </w:tc>
+        <w:tc>
+          <w:tcPr>
+            <w:tcW w:type="dxa" w:w="1656"/>
+            <w:vAlign w:val="center"/>
+            <w:tcMar>
+              <w:top w:w="80" w:type="dxa"/>
+              <w:start w:w="120" w:type="dxa"/>
+              <w:bottom w:w="80" w:type="dxa"/>
+              <w:end w:w="120" w:type="dxa"/>
+            </w:tcMar>
+          </w:tcPr>
+          <w:p>
+            <w:pPr>
+              <w:spacing w:after="0" w:line="276" w:lineRule="auto"/>
+            </w:pPr>
+            <w:r/>
+            <w:r>
+              <w:rPr>
+                <w:rFonts w:ascii="Calibri" w:hAnsi="Calibri"/>
+                <w:b w:val="0"/>
+                <w:color w:val="1F2937"/>
+                <w:sz w:val="18"/>
+              </w:rPr>
+              <w:t>Rates and availability require quote; public Cheyenne page lists 866-224-1750 and references United Access rental availability in Wyoming area</w:t>
+            </w:r>
+          </w:p>
+        </w:tc>
+        <w:tc>
+          <w:tcPr>
+            <w:tcW w:type="dxa" w:w="1512"/>
+            <w:vAlign w:val="center"/>
+            <w:tcMar>
+              <w:top w:w="80" w:type="dxa"/>
+              <w:start w:w="120" w:type="dxa"/>
+              <w:bottom w:w="80" w:type="dxa"/>
+              <w:end w:w="120" w:type="dxa"/>
+            </w:tcMar>
+          </w:tcPr>
+          <w:p>
+            <w:pPr>
+              <w:spacing w:after="0" w:line="276" w:lineRule="auto"/>
+            </w:pPr>
+            <w:r/>
+            <w:r>
+              <w:rPr>
+                <w:rFonts w:ascii="Calibri" w:hAnsi="Calibri"/>
+                <w:b w:val="0"/>
+                <w:color w:val="1F2937"/>
+                <w:sz w:val="18"/>
+              </w:rPr>
+              <w:t>Rental availability path for readiness use if business-use terms allow</w:t>
+            </w:r>
+          </w:p>
+        </w:tc>
+        <w:tc>
+          <w:tcPr>
+            <w:tcW w:type="dxa" w:w="1656"/>
+            <w:vAlign w:val="center"/>
+            <w:tcMar>
+              <w:top w:w="80" w:type="dxa"/>
+              <w:start w:w="120" w:type="dxa"/>
+              <w:bottom w:w="80" w:type="dxa"/>
+              <w:end w:w="120" w:type="dxa"/>
+            </w:tcMar>
+          </w:tcPr>
+          <w:p>
+            <w:pPr>
+              <w:spacing w:after="0" w:line="276" w:lineRule="auto"/>
+            </w:pPr>
+            <w:r/>
+            <w:r>
+              <w:rPr>
+                <w:rFonts w:ascii="Calibri" w:hAnsi="Calibri"/>
+                <w:b w:val="0"/>
+                <w:color w:val="1F2937"/>
+                <w:sz w:val="18"/>
+              </w:rPr>
+              <w:t>Call/request only for availability, provider, total cost, and requirements.</w:t>
+            </w:r>
+          </w:p>
+        </w:tc>
+      </w:tr>
+      <w:tr>
+        <w:tc>
+          <w:tcPr>
+            <w:tcW w:type="dxa" w:w="792"/>
+            <w:vAlign w:val="center"/>
+            <w:tcMar>
+              <w:top w:w="80" w:type="dxa"/>
+              <w:start w:w="120" w:type="dxa"/>
+              <w:bottom w:w="80" w:type="dxa"/>
+              <w:end w:w="120" w:type="dxa"/>
+            </w:tcMar>
+          </w:tcPr>
+          <w:p>
+            <w:pPr>
+              <w:spacing w:after="0" w:line="276" w:lineRule="auto"/>
+            </w:pPr>
+            <w:r/>
+            <w:r>
+              <w:rPr>
+                <w:rFonts w:ascii="Calibri" w:hAnsi="Calibri"/>
+                <w:b w:val="0"/>
+                <w:color w:val="1F2937"/>
+                <w:sz w:val="18"/>
+              </w:rPr>
+              <w:t>10</w:t>
+            </w:r>
+          </w:p>
+        </w:tc>
+        <w:tc>
+          <w:tcPr>
+            <w:tcW w:type="dxa" w:w="1656"/>
+            <w:vAlign w:val="center"/>
+            <w:tcMar>
+              <w:top w:w="80" w:type="dxa"/>
+              <w:start w:w="120" w:type="dxa"/>
+              <w:bottom w:w="80" w:type="dxa"/>
+              <w:end w:w="120" w:type="dxa"/>
+            </w:tcMar>
+          </w:tcPr>
+          <w:p>
+            <w:pPr>
+              <w:spacing w:after="0" w:line="276" w:lineRule="auto"/>
+            </w:pPr>
+            <w:r/>
+            <w:r>
+              <w:rPr>
+                <w:rFonts w:ascii="Calibri" w:hAnsi="Calibri"/>
+                <w:b w:val="0"/>
+                <w:color w:val="1F2937"/>
+                <w:sz w:val="18"/>
+              </w:rPr>
+              <w:t>AMS Vans</w:t>
+            </w:r>
+          </w:p>
+        </w:tc>
+        <w:tc>
+          <w:tcPr>
+            <w:tcW w:type="dxa" w:w="2088"/>
+            <w:vAlign w:val="center"/>
+            <w:tcMar>
+              <w:top w:w="80" w:type="dxa"/>
+              <w:start w:w="120" w:type="dxa"/>
+              <w:bottom w:w="80" w:type="dxa"/>
+              <w:end w:w="120" w:type="dxa"/>
+            </w:tcMar>
+          </w:tcPr>
+          <w:p>
+            <w:pPr>
+              <w:spacing w:after="0" w:line="276" w:lineRule="auto"/>
+            </w:pPr>
+            <w:r/>
+            <w:r>
+              <w:rPr>
+                <w:rFonts w:ascii="Calibri" w:hAnsi="Calibri"/>
+                <w:b w:val="0"/>
+                <w:color w:val="1F2937"/>
+                <w:sz w:val="18"/>
+              </w:rPr>
+              <w:t>Wyoming delivery or long-term accessible rental option</w:t>
+            </w:r>
+          </w:p>
+        </w:tc>
+        <w:tc>
+          <w:tcPr>
+            <w:tcW w:type="dxa" w:w="1656"/>
+            <w:vAlign w:val="center"/>
+            <w:tcMar>
+              <w:top w:w="80" w:type="dxa"/>
+              <w:start w:w="120" w:type="dxa"/>
+              <w:bottom w:w="80" w:type="dxa"/>
+              <w:end w:w="120" w:type="dxa"/>
+            </w:tcMar>
+          </w:tcPr>
+          <w:p>
+            <w:pPr>
+              <w:spacing w:after="0" w:line="276" w:lineRule="auto"/>
+            </w:pPr>
+            <w:r/>
+            <w:r>
+              <w:rPr>
+                <w:rFonts w:ascii="Calibri" w:hAnsi="Calibri"/>
+                <w:b w:val="0"/>
+                <w:color w:val="1F2937"/>
+                <w:sz w:val="18"/>
+              </w:rPr>
+              <w:t>Rates require quote; public Wyoming page references sales, delivery, rentals and service; rental requirements page lists phone 888-880-8267 and driver/insurance requirements</w:t>
+            </w:r>
+          </w:p>
+        </w:tc>
+        <w:tc>
+          <w:tcPr>
+            <w:tcW w:type="dxa" w:w="1512"/>
+            <w:vAlign w:val="center"/>
+            <w:tcMar>
+              <w:top w:w="80" w:type="dxa"/>
+              <w:start w:w="120" w:type="dxa"/>
+              <w:bottom w:w="80" w:type="dxa"/>
+              <w:end w:w="120" w:type="dxa"/>
+            </w:tcMar>
+          </w:tcPr>
+          <w:p>
+            <w:pPr>
+              <w:spacing w:after="0" w:line="276" w:lineRule="auto"/>
+            </w:pPr>
+            <w:r/>
+            <w:r>
+              <w:rPr>
+                <w:rFonts w:ascii="Calibri" w:hAnsi="Calibri"/>
+                <w:b w:val="0"/>
+                <w:color w:val="1F2937"/>
+                <w:sz w:val="18"/>
+              </w:rPr>
+              <w:t>Rental/purchase fallback if total delivered cost and business-use rules are workable</w:t>
+            </w:r>
+          </w:p>
+        </w:tc>
+        <w:tc>
+          <w:tcPr>
+            <w:tcW w:type="dxa" w:w="1656"/>
+            <w:vAlign w:val="center"/>
+            <w:tcMar>
+              <w:top w:w="80" w:type="dxa"/>
+              <w:start w:w="120" w:type="dxa"/>
+              <w:bottom w:w="80" w:type="dxa"/>
+              <w:end w:w="120" w:type="dxa"/>
+            </w:tcMar>
+          </w:tcPr>
+          <w:p>
+            <w:pPr>
+              <w:spacing w:after="0" w:line="276" w:lineRule="auto"/>
+            </w:pPr>
+            <w:r/>
+            <w:r>
+              <w:rPr>
+                <w:rFonts w:ascii="Calibri" w:hAnsi="Calibri"/>
+                <w:b w:val="0"/>
+                <w:color w:val="1F2937"/>
+                <w:sz w:val="18"/>
+              </w:rPr>
+              <w:t>Call for Wyoming delivery timing, commercial-use rules, insurance requirements, and total delivered cost.</w:t>
+            </w:r>
+          </w:p>
+        </w:tc>
+      </w:tr>
+      <w:tr>
+        <w:tc>
+          <w:tcPr>
+            <w:tcW w:type="dxa" w:w="792"/>
+            <w:vAlign w:val="center"/>
+            <w:tcMar>
+              <w:top w:w="80" w:type="dxa"/>
+              <w:start w:w="120" w:type="dxa"/>
+              <w:bottom w:w="80" w:type="dxa"/>
+              <w:end w:w="120" w:type="dxa"/>
+            </w:tcMar>
+          </w:tcPr>
+          <w:p>
+            <w:pPr>
+              <w:spacing w:after="0" w:line="276" w:lineRule="auto"/>
+            </w:pPr>
+            <w:r/>
+            <w:r>
+              <w:rPr>
+                <w:rFonts w:ascii="Calibri" w:hAnsi="Calibri"/>
+                <w:b w:val="0"/>
+                <w:color w:val="1F2937"/>
+                <w:sz w:val="18"/>
+              </w:rPr>
+              <w:t>11</w:t>
+            </w:r>
+          </w:p>
+        </w:tc>
+        <w:tc>
+          <w:tcPr>
+            <w:tcW w:type="dxa" w:w="1656"/>
+            <w:vAlign w:val="center"/>
+            <w:tcMar>
+              <w:top w:w="80" w:type="dxa"/>
+              <w:start w:w="120" w:type="dxa"/>
+              <w:bottom w:w="80" w:type="dxa"/>
+              <w:end w:w="120" w:type="dxa"/>
+            </w:tcMar>
+          </w:tcPr>
+          <w:p>
+            <w:pPr>
+              <w:spacing w:after="0" w:line="276" w:lineRule="auto"/>
+            </w:pPr>
+            <w:r/>
+            <w:r>
+              <w:rPr>
+                <w:rFonts w:ascii="Calibri" w:hAnsi="Calibri"/>
+                <w:b w:val="0"/>
+                <w:color w:val="1F2937"/>
+                <w:sz w:val="18"/>
+              </w:rPr>
+              <w:t>Mobility Auto Group</w:t>
+            </w:r>
+          </w:p>
+        </w:tc>
+        <w:tc>
+          <w:tcPr>
+            <w:tcW w:type="dxa" w:w="2088"/>
+            <w:vAlign w:val="center"/>
+            <w:tcMar>
+              <w:top w:w="80" w:type="dxa"/>
+              <w:start w:w="120" w:type="dxa"/>
+              <w:bottom w:w="80" w:type="dxa"/>
+              <w:end w:w="120" w:type="dxa"/>
+            </w:tcMar>
+          </w:tcPr>
+          <w:p>
+            <w:pPr>
+              <w:spacing w:after="0" w:line="276" w:lineRule="auto"/>
+            </w:pPr>
+            <w:r/>
+            <w:r>
+              <w:rPr>
+                <w:rFonts w:ascii="Calibri" w:hAnsi="Calibri"/>
+                <w:b w:val="0"/>
+                <w:color w:val="1F2937"/>
+                <w:sz w:val="18"/>
+              </w:rPr>
+              <w:t>Denver/Littleton accessible van rental or sale</w:t>
+            </w:r>
+          </w:p>
+        </w:tc>
+        <w:tc>
+          <w:tcPr>
+            <w:tcW w:type="dxa" w:w="1656"/>
+            <w:vAlign w:val="center"/>
+            <w:tcMar>
+              <w:top w:w="80" w:type="dxa"/>
+              <w:start w:w="120" w:type="dxa"/>
+              <w:bottom w:w="80" w:type="dxa"/>
+              <w:end w:w="120" w:type="dxa"/>
+            </w:tcMar>
+          </w:tcPr>
+          <w:p>
+            <w:pPr>
+              <w:spacing w:after="0" w:line="276" w:lineRule="auto"/>
+            </w:pPr>
+            <w:r/>
+            <w:r>
+              <w:rPr>
+                <w:rFonts w:ascii="Calibri" w:hAnsi="Calibri"/>
+                <w:b w:val="0"/>
+                <w:color w:val="1F2937"/>
+                <w:sz w:val="18"/>
+              </w:rPr>
+              <w:t>Rates and inventory require quote; public pages list Denver and Littleton locations, rentals, sales, service, and contact@mobilityauto.com</w:t>
+            </w:r>
+          </w:p>
+        </w:tc>
+        <w:tc>
+          <w:tcPr>
+            <w:tcW w:type="dxa" w:w="1512"/>
+            <w:vAlign w:val="center"/>
+            <w:tcMar>
+              <w:top w:w="80" w:type="dxa"/>
+              <w:start w:w="120" w:type="dxa"/>
+              <w:bottom w:w="80" w:type="dxa"/>
+              <w:end w:w="120" w:type="dxa"/>
+            </w:tcMar>
+          </w:tcPr>
+          <w:p>
+            <w:pPr>
+              <w:spacing w:after="0" w:line="276" w:lineRule="auto"/>
+            </w:pPr>
+            <w:r/>
+            <w:r>
+              <w:rPr>
+                <w:rFonts w:ascii="Calibri" w:hAnsi="Calibri"/>
+                <w:b w:val="0"/>
+                <w:color w:val="1F2937"/>
+                <w:sz w:val="18"/>
+              </w:rPr>
+              <w:t>Rental/sale availability path if business-use terms and pickup timing work</w:t>
+            </w:r>
+          </w:p>
+        </w:tc>
+        <w:tc>
+          <w:tcPr>
+            <w:tcW w:type="dxa" w:w="1656"/>
+            <w:vAlign w:val="center"/>
+            <w:tcMar>
+              <w:top w:w="80" w:type="dxa"/>
+              <w:start w:w="120" w:type="dxa"/>
+              <w:bottom w:w="80" w:type="dxa"/>
+              <w:end w:w="120" w:type="dxa"/>
+            </w:tcMar>
+          </w:tcPr>
+          <w:p>
+            <w:pPr>
+              <w:spacing w:after="0" w:line="276" w:lineRule="auto"/>
+            </w:pPr>
+            <w:r/>
+            <w:r>
+              <w:rPr>
+                <w:rFonts w:ascii="Calibri" w:hAnsi="Calibri"/>
+                <w:b w:val="0"/>
+                <w:color w:val="1F2937"/>
+                <w:sz w:val="18"/>
+              </w:rPr>
+              <w:t>Call/email for August 10-15 rental or immediate purchase/lease alternatives.</w:t>
+            </w:r>
+          </w:p>
+        </w:tc>
+      </w:tr>
+      <w:tr>
+        <w:tc>
+          <w:tcPr>
+            <w:tcW w:type="dxa" w:w="792"/>
+            <w:vAlign w:val="center"/>
+            <w:tcMar>
+              <w:top w:w="80" w:type="dxa"/>
+              <w:start w:w="120" w:type="dxa"/>
+              <w:bottom w:w="80" w:type="dxa"/>
+              <w:end w:w="120" w:type="dxa"/>
+            </w:tcMar>
+          </w:tcPr>
+          <w:p>
+            <w:pPr>
+              <w:spacing w:after="0" w:line="276" w:lineRule="auto"/>
+            </w:pPr>
+            <w:r/>
+            <w:r>
+              <w:rPr>
+                <w:rFonts w:ascii="Calibri" w:hAnsi="Calibri"/>
+                <w:b w:val="0"/>
+                <w:color w:val="1F2937"/>
+                <w:sz w:val="18"/>
+              </w:rPr>
+              <w:t>12</w:t>
+            </w:r>
+          </w:p>
+        </w:tc>
+        <w:tc>
+          <w:tcPr>
+            <w:tcW w:type="dxa" w:w="1656"/>
+            <w:vAlign w:val="center"/>
+            <w:tcMar>
+              <w:top w:w="80" w:type="dxa"/>
+              <w:start w:w="120" w:type="dxa"/>
+              <w:bottom w:w="80" w:type="dxa"/>
+              <w:end w:w="120" w:type="dxa"/>
+            </w:tcMar>
+          </w:tcPr>
+          <w:p>
+            <w:pPr>
+              <w:spacing w:after="0" w:line="276" w:lineRule="auto"/>
+            </w:pPr>
+            <w:r/>
+            <w:r>
+              <w:rPr>
+                <w:rFonts w:ascii="Calibri" w:hAnsi="Calibri"/>
+                <w:b w:val="0"/>
+                <w:color w:val="1F2937"/>
+                <w:sz w:val="18"/>
+              </w:rPr>
+              <w:t>United Access Colorado Springs</w:t>
+            </w:r>
+          </w:p>
+        </w:tc>
+        <w:tc>
+          <w:tcPr>
+            <w:tcW w:type="dxa" w:w="2088"/>
+            <w:vAlign w:val="center"/>
+            <w:tcMar>
+              <w:top w:w="80" w:type="dxa"/>
+              <w:start w:w="120" w:type="dxa"/>
+              <w:bottom w:w="80" w:type="dxa"/>
+              <w:end w:w="120" w:type="dxa"/>
+            </w:tcMar>
+          </w:tcPr>
+          <w:p>
+            <w:pPr>
+              <w:spacing w:after="0" w:line="276" w:lineRule="auto"/>
+            </w:pPr>
+            <w:r/>
+            <w:r>
+              <w:rPr>
+                <w:rFonts w:ascii="Calibri" w:hAnsi="Calibri"/>
+                <w:b w:val="0"/>
+                <w:color w:val="1F2937"/>
+                <w:sz w:val="18"/>
+              </w:rPr>
+              <w:t>Accessible van rental or sale</w:t>
+            </w:r>
+          </w:p>
+        </w:tc>
+        <w:tc>
+          <w:tcPr>
+            <w:tcW w:type="dxa" w:w="1656"/>
+            <w:vAlign w:val="center"/>
+            <w:tcMar>
+              <w:top w:w="80" w:type="dxa"/>
+              <w:start w:w="120" w:type="dxa"/>
+              <w:bottom w:w="80" w:type="dxa"/>
+              <w:end w:w="120" w:type="dxa"/>
+            </w:tcMar>
+          </w:tcPr>
+          <w:p>
+            <w:pPr>
+              <w:spacing w:after="0" w:line="276" w:lineRule="auto"/>
+            </w:pPr>
+            <w:r/>
+            <w:r>
+              <w:rPr>
+                <w:rFonts w:ascii="Calibri" w:hAnsi="Calibri"/>
+                <w:b w:val="0"/>
+                <w:color w:val="1F2937"/>
+                <w:sz w:val="18"/>
+              </w:rPr>
+              <w:t>Rates and inventory require quote; public page lists Colorado Springs location, local phone 719-590-1400, toll-free 877-203-7817, and sale/rent services</w:t>
+            </w:r>
+          </w:p>
+        </w:tc>
+        <w:tc>
+          <w:tcPr>
+            <w:tcW w:type="dxa" w:w="1512"/>
+            <w:vAlign w:val="center"/>
+            <w:tcMar>
+              <w:top w:w="80" w:type="dxa"/>
+              <w:start w:w="120" w:type="dxa"/>
+              <w:bottom w:w="80" w:type="dxa"/>
+              <w:end w:w="120" w:type="dxa"/>
+            </w:tcMar>
+          </w:tcPr>
+          <w:p>
+            <w:pPr>
+              <w:spacing w:after="0" w:line="276" w:lineRule="auto"/>
+            </w:pPr>
+            <w:r/>
+            <w:r>
+              <w:rPr>
+                <w:rFonts w:ascii="Calibri" w:hAnsi="Calibri"/>
+                <w:b w:val="0"/>
+                <w:color w:val="1F2937"/>
+                <w:sz w:val="18"/>
+              </w:rPr>
+              <w:t>Rental/sale fallback if timing and pickup/delivery are workable</w:t>
+            </w:r>
+          </w:p>
+        </w:tc>
+        <w:tc>
+          <w:tcPr>
+            <w:tcW w:type="dxa" w:w="1656"/>
+            <w:vAlign w:val="center"/>
+            <w:tcMar>
+              <w:top w:w="80" w:type="dxa"/>
+              <w:start w:w="120" w:type="dxa"/>
+              <w:bottom w:w="80" w:type="dxa"/>
+              <w:end w:w="120" w:type="dxa"/>
+            </w:tcMar>
+          </w:tcPr>
+          <w:p>
+            <w:pPr>
+              <w:spacing w:after="0" w:line="276" w:lineRule="auto"/>
+            </w:pPr>
+            <w:r/>
+            <w:r>
+              <w:rPr>
+                <w:rFonts w:ascii="Calibri" w:hAnsi="Calibri"/>
+                <w:b w:val="0"/>
+                <w:color w:val="1F2937"/>
+                <w:sz w:val="18"/>
+              </w:rPr>
+              <w:t>Call for rental/sale availability and whether Wheatland pickup/delivery timing works.</w:t>
+            </w:r>
+          </w:p>
+        </w:tc>
+      </w:tr>
     </w:tbl>
     <w:p>
       <w:pPr>

</xml_diff>

<commit_message>
Add minimum funding cash trigger memo
</commit_message>
<xml_diff>
--- a/output/docx/VCC_Vehicle_Funding_Close_Packet_DRAFT.docx
+++ b/output/docx/VCC_Vehicle_Funding_Close_Packet_DRAFT.docx
@@ -627,6 +627,564 @@
                 <w:sz w:val="18"/>
               </w:rPr>
               <w:t>Treating a conversation, public listing, or draft as funding proof or vehicle readiness proof.</w:t>
+            </w:r>
+          </w:p>
+        </w:tc>
+      </w:tr>
+    </w:tbl>
+    <w:p>
+      <w:pPr>
+        <w:pStyle w:val="Heading1"/>
+        <w:spacing w:before="360" w:after="200"/>
+      </w:pPr>
+      <w:r>
+        <w:rPr>
+          <w:rFonts w:ascii="Calibri" w:hAnsi="Calibri"/>
+          <w:b/>
+          <w:color w:val="2E74B5"/>
+          <w:sz w:val="32"/>
+        </w:rPr>
+        <w:t>Minimum Funding Cash Triggers</w:t>
+      </w:r>
+    </w:p>
+    <w:p>
+      <w:pPr>
+        <w:spacing w:after="120" w:line="300" w:lineRule="auto"/>
+      </w:pPr>
+      <w:r>
+        <w:rPr>
+          <w:rFonts w:ascii="Calibri" w:hAnsi="Calibri"/>
+          <w:b w:val="0"/>
+          <w:color w:val="1F2937"/>
+        </w:rPr>
+        <w:t>Use 61_Minimum_Funding_Stack_And_Cash_Trigger_Memo_2026-08-02.md before calling the August 9 funding sprint closed. Public listings and rate pages support triage only; written proof and approval are still required.</w:t>
+      </w:r>
+    </w:p>
+    <w:tbl>
+      <w:tblPr>
+        <w:tblStyle w:val="TableGrid"/>
+        <w:tblW w:type="auto" w:w="0"/>
+        <w:jc w:val="left"/>
+        <w:tblLayout w:type="fixed"/>
+        <w:tblLook w:firstColumn="1" w:firstRow="1" w:lastColumn="0" w:lastRow="0" w:noHBand="0" w:noVBand="1" w:val="04A0"/>
+      </w:tblPr>
+      <w:tblGrid>
+        <w:gridCol w:w="3120"/>
+        <w:gridCol w:w="3120"/>
+        <w:gridCol w:w="3120"/>
+      </w:tblGrid>
+      <w:tr>
+        <w:tc>
+          <w:tcPr>
+            <w:tcW w:type="dxa" w:w="1800"/>
+            <w:vAlign w:val="center"/>
+            <w:tcMar>
+              <w:top w:w="80" w:type="dxa"/>
+              <w:start w:w="120" w:type="dxa"/>
+              <w:bottom w:w="80" w:type="dxa"/>
+              <w:end w:w="120" w:type="dxa"/>
+            </w:tcMar>
+            <w:shd w:fill="E8EEF5"/>
+          </w:tcPr>
+          <w:p>
+            <w:pPr>
+              <w:spacing w:after="0" w:line="276" w:lineRule="auto"/>
+            </w:pPr>
+            <w:r/>
+            <w:r>
+              <w:rPr>
+                <w:rFonts w:ascii="Calibri" w:hAnsi="Calibri"/>
+                <w:b/>
+                <w:color w:val="1F2937"/>
+                <w:sz w:val="18"/>
+              </w:rPr>
+              <w:t>Vehicle path</w:t>
+            </w:r>
+          </w:p>
+        </w:tc>
+        <w:tc>
+          <w:tcPr>
+            <w:tcW w:type="dxa" w:w="5112"/>
+            <w:vAlign w:val="center"/>
+            <w:tcMar>
+              <w:top w:w="80" w:type="dxa"/>
+              <w:start w:w="120" w:type="dxa"/>
+              <w:bottom w:w="80" w:type="dxa"/>
+              <w:end w:w="120" w:type="dxa"/>
+            </w:tcMar>
+            <w:shd w:fill="E8EEF5"/>
+          </w:tcPr>
+          <w:p>
+            <w:pPr>
+              <w:spacing w:after="0" w:line="276" w:lineRule="auto"/>
+            </w:pPr>
+            <w:r/>
+            <w:r>
+              <w:rPr>
+                <w:rFonts w:ascii="Calibri" w:hAnsi="Calibri"/>
+                <w:b/>
+                <w:color w:val="1F2937"/>
+                <w:sz w:val="18"/>
+              </w:rPr>
+              <w:t>Count by August 9 only if</w:t>
+            </w:r>
+          </w:p>
+        </w:tc>
+        <w:tc>
+          <w:tcPr>
+            <w:tcW w:type="dxa" w:w="2448"/>
+            <w:vAlign w:val="center"/>
+            <w:tcMar>
+              <w:top w:w="80" w:type="dxa"/>
+              <w:start w:w="120" w:type="dxa"/>
+              <w:bottom w:w="80" w:type="dxa"/>
+              <w:end w:w="120" w:type="dxa"/>
+            </w:tcMar>
+            <w:shd w:fill="E8EEF5"/>
+          </w:tcPr>
+          <w:p>
+            <w:pPr>
+              <w:spacing w:after="0" w:line="276" w:lineRule="auto"/>
+            </w:pPr>
+            <w:r/>
+            <w:r>
+              <w:rPr>
+                <w:rFonts w:ascii="Calibri" w:hAnsi="Calibri"/>
+                <w:b/>
+                <w:color w:val="1F2937"/>
+                <w:sz w:val="18"/>
+              </w:rPr>
+              <w:t>Internal cash trigger</w:t>
+            </w:r>
+          </w:p>
+        </w:tc>
+      </w:tr>
+      <w:tr>
+        <w:tc>
+          <w:tcPr>
+            <w:tcW w:type="dxa" w:w="1800"/>
+            <w:vAlign w:val="center"/>
+            <w:tcMar>
+              <w:top w:w="80" w:type="dxa"/>
+              <w:start w:w="120" w:type="dxa"/>
+              <w:bottom w:w="80" w:type="dxa"/>
+              <w:end w:w="120" w:type="dxa"/>
+            </w:tcMar>
+            <w:shd w:fill="FFF4E5"/>
+          </w:tcPr>
+          <w:p>
+            <w:pPr>
+              <w:spacing w:after="0" w:line="276" w:lineRule="auto"/>
+            </w:pPr>
+            <w:r/>
+            <w:r>
+              <w:rPr>
+                <w:rFonts w:ascii="Calibri" w:hAnsi="Calibri"/>
+                <w:b w:val="0"/>
+                <w:color w:val="1F2937"/>
+                <w:sz w:val="18"/>
+              </w:rPr>
+              <w:t>Rental bridge</w:t>
+            </w:r>
+          </w:p>
+        </w:tc>
+        <w:tc>
+          <w:tcPr>
+            <w:tcW w:type="dxa" w:w="5112"/>
+            <w:vAlign w:val="center"/>
+            <w:tcMar>
+              <w:top w:w="80" w:type="dxa"/>
+              <w:start w:w="120" w:type="dxa"/>
+              <w:bottom w:w="80" w:type="dxa"/>
+              <w:end w:w="120" w:type="dxa"/>
+            </w:tcMar>
+            <w:shd w:fill="FFF4E5"/>
+          </w:tcPr>
+          <w:p>
+            <w:pPr>
+              <w:spacing w:after="0" w:line="276" w:lineRule="auto"/>
+            </w:pPr>
+            <w:r/>
+            <w:r>
+              <w:rPr>
+                <w:rFonts w:ascii="Calibri" w:hAnsi="Calibri"/>
+                <w:b w:val="0"/>
+                <w:color w:val="1F2937"/>
+                <w:sz w:val="18"/>
+              </w:rPr>
+              <w:t>Written availability, total due, business/demo-use rules, insurance requirements, mileage, pickup/delivery, cancellation terms, and approval path.</w:t>
+            </w:r>
+          </w:p>
+        </w:tc>
+        <w:tc>
+          <w:tcPr>
+            <w:tcW w:type="dxa" w:w="2448"/>
+            <w:vAlign w:val="center"/>
+            <w:tcMar>
+              <w:top w:w="80" w:type="dxa"/>
+              <w:start w:w="120" w:type="dxa"/>
+              <w:bottom w:w="80" w:type="dxa"/>
+              <w:end w:w="120" w:type="dxa"/>
+            </w:tcMar>
+            <w:shd w:fill="FFF4E5"/>
+          </w:tcPr>
+          <w:p>
+            <w:pPr>
+              <w:spacing w:after="0" w:line="276" w:lineRule="auto"/>
+            </w:pPr>
+            <w:r/>
+            <w:r>
+              <w:rPr>
+                <w:rFonts w:ascii="Calibri" w:hAnsi="Calibri"/>
+                <w:b w:val="0"/>
+                <w:color w:val="1F2937"/>
+                <w:sz w:val="18"/>
+              </w:rPr>
+              <w:t>$5,000-$8,000 available or authorized</w:t>
+            </w:r>
+          </w:p>
+        </w:tc>
+      </w:tr>
+      <w:tr>
+        <w:tc>
+          <w:tcPr>
+            <w:tcW w:type="dxa" w:w="1800"/>
+            <w:vAlign w:val="center"/>
+            <w:tcMar>
+              <w:top w:w="80" w:type="dxa"/>
+              <w:start w:w="120" w:type="dxa"/>
+              <w:bottom w:w="80" w:type="dxa"/>
+              <w:end w:w="120" w:type="dxa"/>
+            </w:tcMar>
+            <w:shd w:fill="FFF4E5"/>
+          </w:tcPr>
+          <w:p>
+            <w:pPr>
+              <w:spacing w:after="0" w:line="276" w:lineRule="auto"/>
+            </w:pPr>
+            <w:r/>
+            <w:r>
+              <w:rPr>
+                <w:rFonts w:ascii="Calibri" w:hAnsi="Calibri"/>
+                <w:b w:val="0"/>
+                <w:color w:val="1F2937"/>
+                <w:sz w:val="18"/>
+              </w:rPr>
+              <w:t>Lease start</w:t>
+            </w:r>
+          </w:p>
+        </w:tc>
+        <w:tc>
+          <w:tcPr>
+            <w:tcW w:type="dxa" w:w="5112"/>
+            <w:vAlign w:val="center"/>
+            <w:tcMar>
+              <w:top w:w="80" w:type="dxa"/>
+              <w:start w:w="120" w:type="dxa"/>
+              <w:bottom w:w="80" w:type="dxa"/>
+              <w:end w:w="120" w:type="dxa"/>
+            </w:tcMar>
+            <w:shd w:fill="FFF4E5"/>
+          </w:tcPr>
+          <w:p>
+            <w:pPr>
+              <w:spacing w:after="0" w:line="276" w:lineRule="auto"/>
+            </w:pPr>
+            <w:r/>
+            <w:r>
+              <w:rPr>
+                <w:rFonts w:ascii="Calibri" w:hAnsi="Calibri"/>
+                <w:b w:val="0"/>
+                <w:color w:val="1F2937"/>
+                <w:sz w:val="18"/>
+              </w:rPr>
+              <w:t>Written lease/preapproval response with vehicle class or VIN, total due at delivery, term, mileage, guaranty, fees, and delivery timing.</w:t>
+            </w:r>
+          </w:p>
+        </w:tc>
+        <w:tc>
+          <w:tcPr>
+            <w:tcW w:type="dxa" w:w="2448"/>
+            <w:vAlign w:val="center"/>
+            <w:tcMar>
+              <w:top w:w="80" w:type="dxa"/>
+              <w:start w:w="120" w:type="dxa"/>
+              <w:bottom w:w="80" w:type="dxa"/>
+              <w:end w:w="120" w:type="dxa"/>
+            </w:tcMar>
+            <w:shd w:fill="FFF4E5"/>
+          </w:tcPr>
+          <w:p>
+            <w:pPr>
+              <w:spacing w:after="0" w:line="276" w:lineRule="auto"/>
+            </w:pPr>
+            <w:r/>
+            <w:r>
+              <w:rPr>
+                <w:rFonts w:ascii="Calibri" w:hAnsi="Calibri"/>
+                <w:b w:val="0"/>
+                <w:color w:val="1F2937"/>
+                <w:sz w:val="18"/>
+              </w:rPr>
+              <w:t>$8,000-$15,000 available or authorized</w:t>
+            </w:r>
+          </w:p>
+        </w:tc>
+      </w:tr>
+      <w:tr>
+        <w:tc>
+          <w:tcPr>
+            <w:tcW w:type="dxa" w:w="1800"/>
+            <w:vAlign w:val="center"/>
+            <w:tcMar>
+              <w:top w:w="80" w:type="dxa"/>
+              <w:start w:w="120" w:type="dxa"/>
+              <w:bottom w:w="80" w:type="dxa"/>
+              <w:end w:w="120" w:type="dxa"/>
+            </w:tcMar>
+            <w:shd w:fill="FFF4E5"/>
+          </w:tcPr>
+          <w:p>
+            <w:pPr>
+              <w:spacing w:after="0" w:line="276" w:lineRule="auto"/>
+            </w:pPr>
+            <w:r/>
+            <w:r>
+              <w:rPr>
+                <w:rFonts w:ascii="Calibri" w:hAnsi="Calibri"/>
+                <w:b w:val="0"/>
+                <w:color w:val="1F2937"/>
+                <w:sz w:val="18"/>
+              </w:rPr>
+              <w:t>Financed purchase</w:t>
+            </w:r>
+          </w:p>
+        </w:tc>
+        <w:tc>
+          <w:tcPr>
+            <w:tcW w:type="dxa" w:w="5112"/>
+            <w:vAlign w:val="center"/>
+            <w:tcMar>
+              <w:top w:w="80" w:type="dxa"/>
+              <w:start w:w="120" w:type="dxa"/>
+              <w:bottom w:w="80" w:type="dxa"/>
+              <w:end w:w="120" w:type="dxa"/>
+            </w:tcMar>
+            <w:shd w:fill="FFF4E5"/>
+          </w:tcPr>
+          <w:p>
+            <w:pPr>
+              <w:spacing w:after="0" w:line="276" w:lineRule="auto"/>
+            </w:pPr>
+            <w:r/>
+            <w:r>
+              <w:rPr>
+                <w:rFonts w:ascii="Calibri" w:hAnsi="Calibri"/>
+                <w:b w:val="0"/>
+                <w:color w:val="1F2937"/>
+                <w:sz w:val="18"/>
+              </w:rPr>
+              <w:t>Written quote, down-payment path, title/inspection/warranty status, insurance bindability, commercial-use permission, and approval sequence.</w:t>
+            </w:r>
+          </w:p>
+        </w:tc>
+        <w:tc>
+          <w:tcPr>
+            <w:tcW w:type="dxa" w:w="2448"/>
+            <w:vAlign w:val="center"/>
+            <w:tcMar>
+              <w:top w:w="80" w:type="dxa"/>
+              <w:start w:w="120" w:type="dxa"/>
+              <w:bottom w:w="80" w:type="dxa"/>
+              <w:end w:w="120" w:type="dxa"/>
+            </w:tcMar>
+            <w:shd w:fill="FFF4E5"/>
+          </w:tcPr>
+          <w:p>
+            <w:pPr>
+              <w:spacing w:after="0" w:line="276" w:lineRule="auto"/>
+            </w:pPr>
+            <w:r/>
+            <w:r>
+              <w:rPr>
+                <w:rFonts w:ascii="Calibri" w:hAnsi="Calibri"/>
+                <w:b w:val="0"/>
+                <w:color w:val="1F2937"/>
+                <w:sz w:val="18"/>
+              </w:rPr>
+              <w:t>$10,000-$20,000 bridge</w:t>
+            </w:r>
+          </w:p>
+        </w:tc>
+      </w:tr>
+      <w:tr>
+        <w:tc>
+          <w:tcPr>
+            <w:tcW w:type="dxa" w:w="1800"/>
+            <w:vAlign w:val="center"/>
+            <w:tcMar>
+              <w:top w:w="80" w:type="dxa"/>
+              <w:start w:w="120" w:type="dxa"/>
+              <w:bottom w:w="80" w:type="dxa"/>
+              <w:end w:w="120" w:type="dxa"/>
+            </w:tcMar>
+            <w:shd w:fill="FFF4E5"/>
+          </w:tcPr>
+          <w:p>
+            <w:pPr>
+              <w:spacing w:after="0" w:line="276" w:lineRule="auto"/>
+            </w:pPr>
+            <w:r/>
+            <w:r>
+              <w:rPr>
+                <w:rFonts w:ascii="Calibri" w:hAnsi="Calibri"/>
+                <w:b w:val="0"/>
+                <w:color w:val="1F2937"/>
+                <w:sz w:val="18"/>
+              </w:rPr>
+              <w:t>Cash purchase</w:t>
+            </w:r>
+          </w:p>
+        </w:tc>
+        <w:tc>
+          <w:tcPr>
+            <w:tcW w:type="dxa" w:w="5112"/>
+            <w:vAlign w:val="center"/>
+            <w:tcMar>
+              <w:top w:w="80" w:type="dxa"/>
+              <w:start w:w="120" w:type="dxa"/>
+              <w:bottom w:w="80" w:type="dxa"/>
+              <w:end w:w="120" w:type="dxa"/>
+            </w:tcMar>
+            <w:shd w:fill="FFF4E5"/>
+          </w:tcPr>
+          <w:p>
+            <w:pPr>
+              <w:spacing w:after="0" w:line="276" w:lineRule="auto"/>
+            </w:pPr>
+            <w:r/>
+            <w:r>
+              <w:rPr>
+                <w:rFonts w:ascii="Calibri" w:hAnsi="Calibri"/>
+                <w:b w:val="0"/>
+                <w:color w:val="1F2937"/>
+                <w:sz w:val="18"/>
+              </w:rPr>
+              <w:t>Written quote with all closing costs, insurance, registration, delivery, safety items, and reserve confirmed.</w:t>
+            </w:r>
+          </w:p>
+        </w:tc>
+        <w:tc>
+          <w:tcPr>
+            <w:tcW w:type="dxa" w:w="2448"/>
+            <w:vAlign w:val="center"/>
+            <w:tcMar>
+              <w:top w:w="80" w:type="dxa"/>
+              <w:start w:w="120" w:type="dxa"/>
+              <w:bottom w:w="80" w:type="dxa"/>
+              <w:end w:w="120" w:type="dxa"/>
+            </w:tcMar>
+            <w:shd w:fill="FFF4E5"/>
+          </w:tcPr>
+          <w:p>
+            <w:pPr>
+              <w:spacing w:after="0" w:line="276" w:lineRule="auto"/>
+            </w:pPr>
+            <w:r/>
+            <w:r>
+              <w:rPr>
+                <w:rFonts w:ascii="Calibri" w:hAnsi="Calibri"/>
+                <w:b w:val="0"/>
+                <w:color w:val="1F2937"/>
+                <w:sz w:val="18"/>
+              </w:rPr>
+              <w:t>$35,000-$45,000 close</w:t>
+            </w:r>
+          </w:p>
+        </w:tc>
+      </w:tr>
+      <w:tr>
+        <w:tc>
+          <w:tcPr>
+            <w:tcW w:type="dxa" w:w="1800"/>
+            <w:vAlign w:val="center"/>
+            <w:tcMar>
+              <w:top w:w="80" w:type="dxa"/>
+              <w:start w:w="120" w:type="dxa"/>
+              <w:bottom w:w="80" w:type="dxa"/>
+              <w:end w:w="120" w:type="dxa"/>
+            </w:tcMar>
+            <w:shd w:fill="FFF4E5"/>
+          </w:tcPr>
+          <w:p>
+            <w:pPr>
+              <w:spacing w:after="0" w:line="276" w:lineRule="auto"/>
+            </w:pPr>
+            <w:r/>
+            <w:r>
+              <w:rPr>
+                <w:rFonts w:ascii="Calibri" w:hAnsi="Calibri"/>
+                <w:b w:val="0"/>
+                <w:color w:val="1F2937"/>
+                <w:sz w:val="18"/>
+              </w:rPr>
+              <w:t>Partner vehicle</w:t>
+            </w:r>
+          </w:p>
+        </w:tc>
+        <w:tc>
+          <w:tcPr>
+            <w:tcW w:type="dxa" w:w="5112"/>
+            <w:vAlign w:val="center"/>
+            <w:tcMar>
+              <w:top w:w="80" w:type="dxa"/>
+              <w:start w:w="120" w:type="dxa"/>
+              <w:bottom w:w="80" w:type="dxa"/>
+              <w:end w:w="120" w:type="dxa"/>
+            </w:tcMar>
+            <w:shd w:fill="FFF4E5"/>
+          </w:tcPr>
+          <w:p>
+            <w:pPr>
+              <w:spacing w:after="0" w:line="276" w:lineRule="auto"/>
+            </w:pPr>
+            <w:r/>
+            <w:r>
+              <w:rPr>
+                <w:rFonts w:ascii="Calibri" w:hAnsi="Calibri"/>
+                <w:b w:val="0"/>
+                <w:color w:val="1F2937"/>
+                <w:sz w:val="18"/>
+              </w:rPr>
+              <w:t>Written partner capacity, authority/insurance proof, vehicle/driver controls, payment/data/liability terms, and MOU path.</w:t>
+            </w:r>
+          </w:p>
+        </w:tc>
+        <w:tc>
+          <w:tcPr>
+            <w:tcW w:type="dxa" w:w="2448"/>
+            <w:vAlign w:val="center"/>
+            <w:tcMar>
+              <w:top w:w="80" w:type="dxa"/>
+              <w:start w:w="120" w:type="dxa"/>
+              <w:bottom w:w="80" w:type="dxa"/>
+              <w:end w:w="120" w:type="dxa"/>
+            </w:tcMar>
+            <w:shd w:fill="FFF4E5"/>
+          </w:tcPr>
+          <w:p>
+            <w:pPr>
+              <w:spacing w:after="0" w:line="276" w:lineRule="auto"/>
+            </w:pPr>
+            <w:r/>
+            <w:r>
+              <w:rPr>
+                <w:rFonts w:ascii="Calibri" w:hAnsi="Calibri"/>
+                <w:b w:val="0"/>
+                <w:color w:val="1F2937"/>
+                <w:sz w:val="18"/>
+              </w:rPr>
+              <w:t>$2,500-$7,500 setup</w:t>
             </w:r>
           </w:p>
         </w:tc>
@@ -1845,6 +2403,143 @@
                 <w:color w:val="1F2937"/>
                 <w:sz w:val="18"/>
               </w:rPr>
+              <w:t>Path-specific cash trigger</w:t>
+            </w:r>
+          </w:p>
+        </w:tc>
+        <w:tc>
+          <w:tcPr>
+            <w:tcW w:type="dxa" w:w="1440"/>
+            <w:vAlign w:val="center"/>
+            <w:tcMar>
+              <w:top w:w="80" w:type="dxa"/>
+              <w:start w:w="120" w:type="dxa"/>
+              <w:bottom w:w="80" w:type="dxa"/>
+              <w:end w:w="120" w:type="dxa"/>
+            </w:tcMar>
+          </w:tcPr>
+          <w:p>
+            <w:pPr>
+              <w:spacing w:after="0" w:line="276" w:lineRule="auto"/>
+            </w:pPr>
+            <w:r/>
+            <w:r>
+              <w:rPr>
+                <w:rFonts w:ascii="Calibri" w:hAnsi="Calibri"/>
+                <w:b w:val="0"/>
+                <w:color w:val="1F2937"/>
+                <w:sz w:val="18"/>
+              </w:rPr>
+              <w:t>Rental bridge $5,000-$8,000; lease start $8,000-$15,000; financed purchase bridge $10,000-$20,000; cash purchase close $35,000-$45,000</w:t>
+            </w:r>
+          </w:p>
+        </w:tc>
+        <w:tc>
+          <w:tcPr>
+            <w:tcW w:type="dxa" w:w="2808"/>
+            <w:vAlign w:val="center"/>
+            <w:tcMar>
+              <w:top w:w="80" w:type="dxa"/>
+              <w:start w:w="120" w:type="dxa"/>
+              <w:bottom w:w="80" w:type="dxa"/>
+              <w:end w:w="120" w:type="dxa"/>
+            </w:tcMar>
+          </w:tcPr>
+          <w:p>
+            <w:pPr>
+              <w:spacing w:after="0" w:line="276" w:lineRule="auto"/>
+            </w:pPr>
+            <w:r/>
+            <w:r>
+              <w:rPr>
+                <w:rFonts w:ascii="Calibri" w:hAnsi="Calibri"/>
+                <w:b w:val="0"/>
+                <w:color w:val="1F2937"/>
+                <w:sz w:val="18"/>
+              </w:rPr>
+              <w:t>Written vehicle/rental/partner proof identifies the matching path, total due, permitted use, timing, insurance requirement, and approval sequence</w:t>
+            </w:r>
+          </w:p>
+        </w:tc>
+        <w:tc>
+          <w:tcPr>
+            <w:tcW w:type="dxa" w:w="1440"/>
+            <w:vAlign w:val="center"/>
+            <w:tcMar>
+              <w:top w:w="80" w:type="dxa"/>
+              <w:start w:w="120" w:type="dxa"/>
+              <w:bottom w:w="80" w:type="dxa"/>
+              <w:end w:w="120" w:type="dxa"/>
+            </w:tcMar>
+          </w:tcPr>
+          <w:p>
+            <w:pPr>
+              <w:spacing w:after="0" w:line="276" w:lineRule="auto"/>
+            </w:pPr>
+            <w:r/>
+            <w:r>
+              <w:rPr>
+                <w:rFonts w:ascii="Calibri" w:hAnsi="Calibri"/>
+                <w:b w:val="0"/>
+                <w:color w:val="1F2937"/>
+                <w:sz w:val="18"/>
+              </w:rPr>
+              <w:t>Prepared/not committed</w:t>
+            </w:r>
+          </w:p>
+        </w:tc>
+        <w:tc>
+          <w:tcPr>
+            <w:tcW w:type="dxa" w:w="1872"/>
+            <w:vAlign w:val="center"/>
+            <w:tcMar>
+              <w:top w:w="80" w:type="dxa"/>
+              <w:start w:w="120" w:type="dxa"/>
+              <w:bottom w:w="80" w:type="dxa"/>
+              <w:end w:w="120" w:type="dxa"/>
+            </w:tcMar>
+          </w:tcPr>
+          <w:p>
+            <w:pPr>
+              <w:spacing w:after="0" w:line="276" w:lineRule="auto"/>
+            </w:pPr>
+            <w:r/>
+            <w:r>
+              <w:rPr>
+                <w:rFonts w:ascii="Calibri" w:hAnsi="Calibri"/>
+                <w:b w:val="0"/>
+                <w:color w:val="1F2937"/>
+                <w:sz w:val="18"/>
+              </w:rPr>
+              <w:t>Use the cash trigger memo before counting any sponsor, bridge, lender, lease, purchase, or partner-vehicle path toward the August 9 close.</w:t>
+            </w:r>
+          </w:p>
+        </w:tc>
+      </w:tr>
+      <w:tr>
+        <w:tc>
+          <w:tcPr>
+            <w:tcW w:type="dxa" w:w="1800"/>
+            <w:vAlign w:val="center"/>
+            <w:tcMar>
+              <w:top w:w="80" w:type="dxa"/>
+              <w:start w:w="120" w:type="dxa"/>
+              <w:bottom w:w="80" w:type="dxa"/>
+              <w:end w:w="120" w:type="dxa"/>
+            </w:tcMar>
+          </w:tcPr>
+          <w:p>
+            <w:pPr>
+              <w:spacing w:after="0" w:line="276" w:lineRule="auto"/>
+            </w:pPr>
+            <w:r/>
+            <w:r>
+              <w:rPr>
+                <w:rFonts w:ascii="Calibri" w:hAnsi="Calibri"/>
+                <w:b w:val="0"/>
+                <w:color w:val="1F2937"/>
+                <w:sz w:val="18"/>
+              </w:rPr>
               <w:t>Vehicle readiness sponsor</w:t>
             </w:r>
           </w:p>
@@ -2474,7 +3169,7 @@
                 <w:color w:val="1F2937"/>
                 <w:sz w:val="18"/>
               </w:rPr>
-              <w:t>Open</w:t>
+              <w:t>Prepared/not committed</w:t>
             </w:r>
           </w:p>
         </w:tc>
@@ -2501,7 +3196,7 @@
                 <w:color w:val="1F2937"/>
                 <w:sz w:val="18"/>
               </w:rPr>
-              <w:t>Prepare bridge approval memo only if rental availability and insurance requirements are confirmed.</w:t>
+              <w:t>Use the bridge/readiness authorization draft only after rental availability, insurance requirements, and authority limits are confirmed.</w:t>
             </w:r>
           </w:p>
         </w:tc>
@@ -2919,6 +3614,11 @@
       </w:tr>
     </w:tbl>
     <w:p>
+      <w:r>
+        <w:br w:type="page"/>
+      </w:r>
+    </w:p>
+    <w:p>
       <w:pPr>
         <w:pStyle w:val="Heading1"/>
         <w:spacing w:before="360" w:after="200"/>
@@ -2942,11 +3642,10 @@
         <w:tblLook w:firstColumn="1" w:firstRow="1" w:lastColumn="0" w:lastRow="0" w:noHBand="0" w:noVBand="1" w:val="04A0"/>
       </w:tblPr>
       <w:tblGrid>
-        <w:gridCol w:w="1872"/>
-        <w:gridCol w:w="1872"/>
-        <w:gridCol w:w="1872"/>
-        <w:gridCol w:w="1872"/>
-        <w:gridCol w:w="1872"/>
+        <w:gridCol w:w="2340"/>
+        <w:gridCol w:w="2340"/>
+        <w:gridCol w:w="2340"/>
+        <w:gridCol w:w="2340"/>
       </w:tblGrid>
       <w:tr>
         <w:tc>
@@ -2979,7 +3678,7 @@
         </w:tc>
         <w:tc>
           <w:tcPr>
-            <w:tcW w:type="dxa" w:w="2088"/>
+            <w:tcW w:type="dxa" w:w="2232"/>
             <w:vAlign w:val="center"/>
             <w:tcMar>
               <w:top w:w="80" w:type="dxa"/>
@@ -3007,7 +3706,7 @@
         </w:tc>
         <w:tc>
           <w:tcPr>
-            <w:tcW w:type="dxa" w:w="1440"/>
+            <w:tcW w:type="dxa" w:w="1584"/>
             <w:vAlign w:val="center"/>
             <w:tcMar>
               <w:top w:w="80" w:type="dxa"/>
@@ -3035,7 +3734,7 @@
         </w:tc>
         <w:tc>
           <w:tcPr>
-            <w:tcW w:type="dxa" w:w="3024"/>
+            <w:tcW w:type="dxa" w:w="4752"/>
             <w:vAlign w:val="center"/>
             <w:tcMar>
               <w:top w:w="80" w:type="dxa"/>
@@ -3058,34 +3757,6 @@
                 <w:sz w:val="18"/>
               </w:rPr>
               <w:t>Proof needed</w:t>
-            </w:r>
-          </w:p>
-        </w:tc>
-        <w:tc>
-          <w:tcPr>
-            <w:tcW w:type="dxa" w:w="2016"/>
-            <w:vAlign w:val="center"/>
-            <w:tcMar>
-              <w:top w:w="80" w:type="dxa"/>
-              <w:start w:w="120" w:type="dxa"/>
-              <w:bottom w:w="80" w:type="dxa"/>
-              <w:end w:w="120" w:type="dxa"/>
-            </w:tcMar>
-            <w:shd w:fill="E8EEF5"/>
-          </w:tcPr>
-          <w:p>
-            <w:pPr>
-              <w:spacing w:after="0" w:line="276" w:lineRule="auto"/>
-            </w:pPr>
-            <w:r/>
-            <w:r>
-              <w:rPr>
-                <w:rFonts w:ascii="Calibri" w:hAnsi="Calibri"/>
-                <w:b/>
-                <w:color w:val="1F2937"/>
-                <w:sz w:val="18"/>
-              </w:rPr>
-              <w:t>Next action</w:t>
             </w:r>
           </w:p>
         </w:tc>
@@ -3120,7 +3791,7 @@
         </w:tc>
         <w:tc>
           <w:tcPr>
-            <w:tcW w:type="dxa" w:w="2088"/>
+            <w:tcW w:type="dxa" w:w="2232"/>
             <w:vAlign w:val="center"/>
             <w:tcMar>
               <w:top w:w="80" w:type="dxa"/>
@@ -3147,7 +3818,7 @@
         </w:tc>
         <w:tc>
           <w:tcPr>
-            <w:tcW w:type="dxa" w:w="1440"/>
+            <w:tcW w:type="dxa" w:w="1584"/>
             <w:vAlign w:val="center"/>
             <w:tcMar>
               <w:top w:w="80" w:type="dxa"/>
@@ -3168,13 +3839,13 @@
                 <w:color w:val="1F2937"/>
                 <w:sz w:val="18"/>
               </w:rPr>
-              <w:t>Not contacted</w:t>
+              <w:t>Public source refreshed; not contacted</w:t>
             </w:r>
           </w:p>
         </w:tc>
         <w:tc>
           <w:tcPr>
-            <w:tcW w:type="dxa" w:w="3024"/>
+            <w:tcW w:type="dxa" w:w="4752"/>
             <w:vAlign w:val="center"/>
             <w:tcMar>
               <w:top w:w="80" w:type="dxa"/>
@@ -3196,33 +3867,6 @@
                 <w:sz w:val="18"/>
               </w:rPr>
               <w:t>Written response or dated call notes</w:t>
-            </w:r>
-          </w:p>
-        </w:tc>
-        <w:tc>
-          <w:tcPr>
-            <w:tcW w:type="dxa" w:w="2016"/>
-            <w:vAlign w:val="center"/>
-            <w:tcMar>
-              <w:top w:w="80" w:type="dxa"/>
-              <w:start w:w="120" w:type="dxa"/>
-              <w:bottom w:w="80" w:type="dxa"/>
-              <w:end w:w="120" w:type="dxa"/>
-            </w:tcMar>
-          </w:tcPr>
-          <w:p>
-            <w:pPr>
-              <w:spacing w:after="0" w:line="276" w:lineRule="auto"/>
-            </w:pPr>
-            <w:r/>
-            <w:r>
-              <w:rPr>
-                <w:rFonts w:ascii="Calibri" w:hAnsi="Calibri"/>
-                <w:b w:val="0"/>
-                <w:color w:val="1F2937"/>
-                <w:sz w:val="18"/>
-              </w:rPr>
-              <w:t>After approval, send/call and record authority notes</w:t>
             </w:r>
           </w:p>
         </w:tc>
@@ -3257,7 +3901,7 @@
         </w:tc>
         <w:tc>
           <w:tcPr>
-            <w:tcW w:type="dxa" w:w="2088"/>
+            <w:tcW w:type="dxa" w:w="2232"/>
             <w:vAlign w:val="center"/>
             <w:tcMar>
               <w:top w:w="80" w:type="dxa"/>
@@ -3284,7 +3928,7 @@
         </w:tc>
         <w:tc>
           <w:tcPr>
-            <w:tcW w:type="dxa" w:w="1440"/>
+            <w:tcW w:type="dxa" w:w="1584"/>
             <w:vAlign w:val="center"/>
             <w:tcMar>
               <w:top w:w="80" w:type="dxa"/>
@@ -3305,13 +3949,13 @@
                 <w:color w:val="1F2937"/>
                 <w:sz w:val="18"/>
               </w:rPr>
-              <w:t>Not contacted</w:t>
+              <w:t>Public source refreshed; not contacted</w:t>
             </w:r>
           </w:p>
         </w:tc>
         <w:tc>
           <w:tcPr>
-            <w:tcW w:type="dxa" w:w="3024"/>
+            <w:tcW w:type="dxa" w:w="4752"/>
             <w:vAlign w:val="center"/>
             <w:tcMar>
               <w:top w:w="80" w:type="dxa"/>
@@ -3333,33 +3977,6 @@
                 <w:sz w:val="18"/>
               </w:rPr>
               <w:t>Agent notes or quote requirements</w:t>
-            </w:r>
-          </w:p>
-        </w:tc>
-        <w:tc>
-          <w:tcPr>
-            <w:tcW w:type="dxa" w:w="2016"/>
-            <w:vAlign w:val="center"/>
-            <w:tcMar>
-              <w:top w:w="80" w:type="dxa"/>
-              <w:start w:w="120" w:type="dxa"/>
-              <w:bottom w:w="80" w:type="dxa"/>
-              <w:end w:w="120" w:type="dxa"/>
-            </w:tcMar>
-          </w:tcPr>
-          <w:p>
-            <w:pPr>
-              <w:spacing w:after="0" w:line="276" w:lineRule="auto"/>
-            </w:pPr>
-            <w:r/>
-            <w:r>
-              <w:rPr>
-                <w:rFonts w:ascii="Calibri" w:hAnsi="Calibri"/>
-                <w:b w:val="0"/>
-                <w:color w:val="1F2937"/>
-                <w:sz w:val="18"/>
-              </w:rPr>
-              <w:t>After approval, ask eligibility and Form E questions only</w:t>
             </w:r>
           </w:p>
         </w:tc>
@@ -3394,7 +4011,7 @@
         </w:tc>
         <w:tc>
           <w:tcPr>
-            <w:tcW w:type="dxa" w:w="2088"/>
+            <w:tcW w:type="dxa" w:w="2232"/>
             <w:vAlign w:val="center"/>
             <w:tcMar>
               <w:top w:w="80" w:type="dxa"/>
@@ -3421,7 +4038,7 @@
         </w:tc>
         <w:tc>
           <w:tcPr>
-            <w:tcW w:type="dxa" w:w="1440"/>
+            <w:tcW w:type="dxa" w:w="1584"/>
             <w:vAlign w:val="center"/>
             <w:tcMar>
               <w:top w:w="80" w:type="dxa"/>
@@ -3448,7 +4065,7 @@
         </w:tc>
         <w:tc>
           <w:tcPr>
-            <w:tcW w:type="dxa" w:w="3024"/>
+            <w:tcW w:type="dxa" w:w="4752"/>
             <w:vAlign w:val="center"/>
             <w:tcMar>
               <w:top w:w="80" w:type="dxa"/>
@@ -3470,33 +4087,6 @@
                 <w:sz w:val="18"/>
               </w:rPr>
               <w:t>Agent notes or quote requirements</w:t>
-            </w:r>
-          </w:p>
-        </w:tc>
-        <w:tc>
-          <w:tcPr>
-            <w:tcW w:type="dxa" w:w="2016"/>
-            <w:vAlign w:val="center"/>
-            <w:tcMar>
-              <w:top w:w="80" w:type="dxa"/>
-              <w:start w:w="120" w:type="dxa"/>
-              <w:bottom w:w="80" w:type="dxa"/>
-              <w:end w:w="120" w:type="dxa"/>
-            </w:tcMar>
-          </w:tcPr>
-          <w:p>
-            <w:pPr>
-              <w:spacing w:after="0" w:line="276" w:lineRule="auto"/>
-            </w:pPr>
-            <w:r/>
-            <w:r>
-              <w:rPr>
-                <w:rFonts w:ascii="Calibri" w:hAnsi="Calibri"/>
-                <w:b w:val="0"/>
-                <w:color w:val="1F2937"/>
-                <w:sz w:val="18"/>
-              </w:rPr>
-              <w:t>After approval, ask coverage-path questions only</w:t>
             </w:r>
           </w:p>
         </w:tc>
@@ -3531,7 +4121,7 @@
         </w:tc>
         <w:tc>
           <w:tcPr>
-            <w:tcW w:type="dxa" w:w="2088"/>
+            <w:tcW w:type="dxa" w:w="2232"/>
             <w:vAlign w:val="center"/>
             <w:tcMar>
               <w:top w:w="80" w:type="dxa"/>
@@ -3558,7 +4148,7 @@
         </w:tc>
         <w:tc>
           <w:tcPr>
-            <w:tcW w:type="dxa" w:w="1440"/>
+            <w:tcW w:type="dxa" w:w="1584"/>
             <w:vAlign w:val="center"/>
             <w:tcMar>
               <w:top w:w="80" w:type="dxa"/>
@@ -3579,13 +4169,13 @@
                 <w:color w:val="1F2937"/>
                 <w:sz w:val="18"/>
               </w:rPr>
-              <w:t>Not contacted</w:t>
+              <w:t>Public source refreshed and triaged; not contacted</w:t>
             </w:r>
           </w:p>
         </w:tc>
         <w:tc>
           <w:tcPr>
-            <w:tcW w:type="dxa" w:w="3024"/>
+            <w:tcW w:type="dxa" w:w="4752"/>
             <w:vAlign w:val="center"/>
             <w:tcMar>
               <w:top w:w="80" w:type="dxa"/>
@@ -3607,33 +4197,6 @@
                 <w:sz w:val="18"/>
               </w:rPr>
               <w:t>Rental availability response or dated call notes</w:t>
-            </w:r>
-          </w:p>
-        </w:tc>
-        <w:tc>
-          <w:tcPr>
-            <w:tcW w:type="dxa" w:w="2016"/>
-            <w:vAlign w:val="center"/>
-            <w:tcMar>
-              <w:top w:w="80" w:type="dxa"/>
-              <w:start w:w="120" w:type="dxa"/>
-              <w:bottom w:w="80" w:type="dxa"/>
-              <w:end w:w="120" w:type="dxa"/>
-            </w:tcMar>
-          </w:tcPr>
-          <w:p>
-            <w:pPr>
-              <w:spacing w:after="0" w:line="276" w:lineRule="auto"/>
-            </w:pPr>
-            <w:r/>
-            <w:r>
-              <w:rPr>
-                <w:rFonts w:ascii="Calibri" w:hAnsi="Calibri"/>
-                <w:b w:val="0"/>
-                <w:color w:val="1F2937"/>
-                <w:sz w:val="18"/>
-              </w:rPr>
-              <w:t>After approval, call Cheyenne first</w:t>
             </w:r>
           </w:p>
         </w:tc>
@@ -3668,7 +4231,7 @@
         </w:tc>
         <w:tc>
           <w:tcPr>
-            <w:tcW w:type="dxa" w:w="2088"/>
+            <w:tcW w:type="dxa" w:w="2232"/>
             <w:vAlign w:val="center"/>
             <w:tcMar>
               <w:top w:w="80" w:type="dxa"/>
@@ -3695,7 +4258,7 @@
         </w:tc>
         <w:tc>
           <w:tcPr>
-            <w:tcW w:type="dxa" w:w="1440"/>
+            <w:tcW w:type="dxa" w:w="1584"/>
             <w:vAlign w:val="center"/>
             <w:tcMar>
               <w:top w:w="80" w:type="dxa"/>
@@ -3716,13 +4279,13 @@
                 <w:color w:val="1F2937"/>
                 <w:sz w:val="18"/>
               </w:rPr>
-              <w:t>Not contacted</w:t>
+              <w:t>Public source refreshed; not contacted</w:t>
             </w:r>
           </w:p>
         </w:tc>
         <w:tc>
           <w:tcPr>
-            <w:tcW w:type="dxa" w:w="3024"/>
+            <w:tcW w:type="dxa" w:w="4752"/>
             <w:vAlign w:val="center"/>
             <w:tcMar>
               <w:top w:w="80" w:type="dxa"/>
@@ -3744,33 +4307,6 @@
                 <w:sz w:val="18"/>
               </w:rPr>
               <w:t>Rental quote or dated call notes</w:t>
-            </w:r>
-          </w:p>
-        </w:tc>
-        <w:tc>
-          <w:tcPr>
-            <w:tcW w:type="dxa" w:w="2016"/>
-            <w:vAlign w:val="center"/>
-            <w:tcMar>
-              <w:top w:w="80" w:type="dxa"/>
-              <w:start w:w="120" w:type="dxa"/>
-              <w:bottom w:w="80" w:type="dxa"/>
-              <w:end w:w="120" w:type="dxa"/>
-            </w:tcMar>
-          </w:tcPr>
-          <w:p>
-            <w:pPr>
-              <w:spacing w:after="0" w:line="276" w:lineRule="auto"/>
-            </w:pPr>
-            <w:r/>
-            <w:r>
-              <w:rPr>
-                <w:rFonts w:ascii="Calibri" w:hAnsi="Calibri"/>
-                <w:b w:val="0"/>
-                <w:color w:val="1F2937"/>
-                <w:sz w:val="18"/>
-              </w:rPr>
-              <w:t>After approval, request availability and requirements only</w:t>
             </w:r>
           </w:p>
         </w:tc>
@@ -3805,7 +4341,7 @@
         </w:tc>
         <w:tc>
           <w:tcPr>
-            <w:tcW w:type="dxa" w:w="2088"/>
+            <w:tcW w:type="dxa" w:w="2232"/>
             <w:vAlign w:val="center"/>
             <w:tcMar>
               <w:top w:w="80" w:type="dxa"/>
@@ -3832,7 +4368,7 @@
         </w:tc>
         <w:tc>
           <w:tcPr>
-            <w:tcW w:type="dxa" w:w="1440"/>
+            <w:tcW w:type="dxa" w:w="1584"/>
             <w:vAlign w:val="center"/>
             <w:tcMar>
               <w:top w:w="80" w:type="dxa"/>
@@ -3853,13 +4389,13 @@
                 <w:color w:val="1F2937"/>
                 <w:sz w:val="18"/>
               </w:rPr>
-              <w:t>Not contacted</w:t>
+              <w:t>Public source refreshed and triaged; Coming Soon; not contacted</w:t>
             </w:r>
           </w:p>
         </w:tc>
         <w:tc>
           <w:tcPr>
-            <w:tcW w:type="dxa" w:w="3024"/>
+            <w:tcW w:type="dxa" w:w="4752"/>
             <w:vAlign w:val="center"/>
             <w:tcMar>
               <w:top w:w="80" w:type="dxa"/>
@@ -3881,33 +4417,6 @@
                 <w:sz w:val="18"/>
               </w:rPr>
               <w:t>Written vehicle quote or dated call notes</w:t>
-            </w:r>
-          </w:p>
-        </w:tc>
-        <w:tc>
-          <w:tcPr>
-            <w:tcW w:type="dxa" w:w="2016"/>
-            <w:vAlign w:val="center"/>
-            <w:tcMar>
-              <w:top w:w="80" w:type="dxa"/>
-              <w:start w:w="120" w:type="dxa"/>
-              <w:bottom w:w="80" w:type="dxa"/>
-              <w:end w:w="120" w:type="dxa"/>
-            </w:tcMar>
-          </w:tcPr>
-          <w:p>
-            <w:pPr>
-              <w:spacing w:after="0" w:line="276" w:lineRule="auto"/>
-            </w:pPr>
-            <w:r/>
-            <w:r>
-              <w:rPr>
-                <w:rFonts w:ascii="Calibri" w:hAnsi="Calibri"/>
-                <w:b w:val="0"/>
-                <w:color w:val="1F2937"/>
-                <w:sz w:val="18"/>
-              </w:rPr>
-              <w:t>After approval, confirm availability without deposit or application</w:t>
             </w:r>
           </w:p>
         </w:tc>
@@ -3942,7 +4451,7 @@
         </w:tc>
         <w:tc>
           <w:tcPr>
-            <w:tcW w:type="dxa" w:w="2088"/>
+            <w:tcW w:type="dxa" w:w="2232"/>
             <w:vAlign w:val="center"/>
             <w:tcMar>
               <w:top w:w="80" w:type="dxa"/>
@@ -3969,7 +4478,7 @@
         </w:tc>
         <w:tc>
           <w:tcPr>
-            <w:tcW w:type="dxa" w:w="1440"/>
+            <w:tcW w:type="dxa" w:w="1584"/>
             <w:vAlign w:val="center"/>
             <w:tcMar>
               <w:top w:w="80" w:type="dxa"/>
@@ -3990,13 +4499,13 @@
                 <w:color w:val="1F2937"/>
                 <w:sz w:val="18"/>
               </w:rPr>
-              <w:t>Not contacted</w:t>
+              <w:t>Public source refreshed; not contacted</w:t>
             </w:r>
           </w:p>
         </w:tc>
         <w:tc>
           <w:tcPr>
-            <w:tcW w:type="dxa" w:w="3024"/>
+            <w:tcW w:type="dxa" w:w="4752"/>
             <w:vAlign w:val="center"/>
             <w:tcMar>
               <w:top w:w="80" w:type="dxa"/>
@@ -4018,33 +4527,6 @@
                 <w:sz w:val="18"/>
               </w:rPr>
               <w:t>Lease availability response or dated call notes</w:t>
-            </w:r>
-          </w:p>
-        </w:tc>
-        <w:tc>
-          <w:tcPr>
-            <w:tcW w:type="dxa" w:w="2016"/>
-            <w:vAlign w:val="center"/>
-            <w:tcMar>
-              <w:top w:w="80" w:type="dxa"/>
-              <w:start w:w="120" w:type="dxa"/>
-              <w:bottom w:w="80" w:type="dxa"/>
-              <w:end w:w="120" w:type="dxa"/>
-            </w:tcMar>
-          </w:tcPr>
-          <w:p>
-            <w:pPr>
-              <w:spacing w:after="0" w:line="276" w:lineRule="auto"/>
-            </w:pPr>
-            <w:r/>
-            <w:r>
-              <w:rPr>
-                <w:rFonts w:ascii="Calibri" w:hAnsi="Calibri"/>
-                <w:b w:val="0"/>
-                <w:color w:val="1F2937"/>
-                <w:sz w:val="18"/>
-              </w:rPr>
-              <w:t>After approval, request preliminary fit only</w:t>
             </w:r>
           </w:p>
         </w:tc>
@@ -4079,7 +4561,7 @@
         </w:tc>
         <w:tc>
           <w:tcPr>
-            <w:tcW w:type="dxa" w:w="2088"/>
+            <w:tcW w:type="dxa" w:w="2232"/>
             <w:vAlign w:val="center"/>
             <w:tcMar>
               <w:top w:w="80" w:type="dxa"/>
@@ -4106,7 +4588,7 @@
         </w:tc>
         <w:tc>
           <w:tcPr>
-            <w:tcW w:type="dxa" w:w="1440"/>
+            <w:tcW w:type="dxa" w:w="1584"/>
             <w:vAlign w:val="center"/>
             <w:tcMar>
               <w:top w:w="80" w:type="dxa"/>
@@ -4127,13 +4609,13 @@
                 <w:color w:val="1F2937"/>
                 <w:sz w:val="18"/>
               </w:rPr>
-              <w:t>Drafted not sent</w:t>
+              <w:t>Public source refreshed; drafted not sent</w:t>
             </w:r>
           </w:p>
         </w:tc>
         <w:tc>
           <w:tcPr>
-            <w:tcW w:type="dxa" w:w="3024"/>
+            <w:tcW w:type="dxa" w:w="4752"/>
             <w:vAlign w:val="center"/>
             <w:tcMar>
               <w:top w:w="80" w:type="dxa"/>
@@ -4155,33 +4637,6 @@
                 <w:sz w:val="18"/>
               </w:rPr>
               <w:t>Written quote or timing response</w:t>
-            </w:r>
-          </w:p>
-        </w:tc>
-        <w:tc>
-          <w:tcPr>
-            <w:tcW w:type="dxa" w:w="2016"/>
-            <w:vAlign w:val="center"/>
-            <w:tcMar>
-              <w:top w:w="80" w:type="dxa"/>
-              <w:start w:w="120" w:type="dxa"/>
-              <w:bottom w:w="80" w:type="dxa"/>
-              <w:end w:w="120" w:type="dxa"/>
-            </w:tcMar>
-          </w:tcPr>
-          <w:p>
-            <w:pPr>
-              <w:spacing w:after="0" w:line="276" w:lineRule="auto"/>
-            </w:pPr>
-            <w:r/>
-            <w:r>
-              <w:rPr>
-                <w:rFonts w:ascii="Calibri" w:hAnsi="Calibri"/>
-                <w:b w:val="0"/>
-                <w:color w:val="1F2937"/>
-                <w:sz w:val="18"/>
-              </w:rPr>
-              <w:t>After approval, send exact draft or call for availability</w:t>
             </w:r>
           </w:p>
         </w:tc>
@@ -4216,7 +4671,7 @@
         </w:tc>
         <w:tc>
           <w:tcPr>
-            <w:tcW w:type="dxa" w:w="2088"/>
+            <w:tcW w:type="dxa" w:w="2232"/>
             <w:vAlign w:val="center"/>
             <w:tcMar>
               <w:top w:w="80" w:type="dxa"/>
@@ -4243,7 +4698,7 @@
         </w:tc>
         <w:tc>
           <w:tcPr>
-            <w:tcW w:type="dxa" w:w="1440"/>
+            <w:tcW w:type="dxa" w:w="1584"/>
             <w:vAlign w:val="center"/>
             <w:tcMar>
               <w:top w:w="80" w:type="dxa"/>
@@ -4264,13 +4719,13 @@
                 <w:color w:val="1F2937"/>
                 <w:sz w:val="18"/>
               </w:rPr>
-              <w:t>Drafted not sent</w:t>
+              <w:t>Public source refreshed; drafted not sent</w:t>
             </w:r>
           </w:p>
         </w:tc>
         <w:tc>
           <w:tcPr>
-            <w:tcW w:type="dxa" w:w="3024"/>
+            <w:tcW w:type="dxa" w:w="4752"/>
             <w:vAlign w:val="center"/>
             <w:tcMar>
               <w:top w:w="80" w:type="dxa"/>
@@ -4292,33 +4747,6 @@
                 <w:sz w:val="18"/>
               </w:rPr>
               <w:t>Written preliminary fit response</w:t>
-            </w:r>
-          </w:p>
-        </w:tc>
-        <w:tc>
-          <w:tcPr>
-            <w:tcW w:type="dxa" w:w="2016"/>
-            <w:vAlign w:val="center"/>
-            <w:tcMar>
-              <w:top w:w="80" w:type="dxa"/>
-              <w:start w:w="120" w:type="dxa"/>
-              <w:bottom w:w="80" w:type="dxa"/>
-              <w:end w:w="120" w:type="dxa"/>
-            </w:tcMar>
-          </w:tcPr>
-          <w:p>
-            <w:pPr>
-              <w:spacing w:after="0" w:line="276" w:lineRule="auto"/>
-            </w:pPr>
-            <w:r/>
-            <w:r>
-              <w:rPr>
-                <w:rFonts w:ascii="Calibri" w:hAnsi="Calibri"/>
-                <w:b w:val="0"/>
-                <w:color w:val="1F2937"/>
-                <w:sz w:val="18"/>
-              </w:rPr>
-              <w:t>After approval, send exact fit question draft</w:t>
             </w:r>
           </w:p>
         </w:tc>
@@ -4353,7 +4781,7 @@
         </w:tc>
         <w:tc>
           <w:tcPr>
-            <w:tcW w:type="dxa" w:w="2088"/>
+            <w:tcW w:type="dxa" w:w="2232"/>
             <w:vAlign w:val="center"/>
             <w:tcMar>
               <w:top w:w="80" w:type="dxa"/>
@@ -4380,7 +4808,7 @@
         </w:tc>
         <w:tc>
           <w:tcPr>
-            <w:tcW w:type="dxa" w:w="1440"/>
+            <w:tcW w:type="dxa" w:w="1584"/>
             <w:vAlign w:val="center"/>
             <w:tcMar>
               <w:top w:w="80" w:type="dxa"/>
@@ -4401,13 +4829,13 @@
                 <w:color w:val="1F2937"/>
                 <w:sz w:val="18"/>
               </w:rPr>
-              <w:t>Drafted not sent</w:t>
+              <w:t>Drafted not sent; stale attachment audit logged</w:t>
             </w:r>
           </w:p>
         </w:tc>
         <w:tc>
           <w:tcPr>
-            <w:tcW w:type="dxa" w:w="3024"/>
+            <w:tcW w:type="dxa" w:w="4752"/>
             <w:vAlign w:val="center"/>
             <w:tcMar>
               <w:top w:w="80" w:type="dxa"/>
@@ -4429,33 +4857,6 @@
                 <w:sz w:val="18"/>
               </w:rPr>
               <w:t>Meeting response, pledge interest, or local introduction</w:t>
-            </w:r>
-          </w:p>
-        </w:tc>
-        <w:tc>
-          <w:tcPr>
-            <w:tcW w:type="dxa" w:w="2016"/>
-            <w:vAlign w:val="center"/>
-            <w:tcMar>
-              <w:top w:w="80" w:type="dxa"/>
-              <w:start w:w="120" w:type="dxa"/>
-              <w:bottom w:w="80" w:type="dxa"/>
-              <w:end w:w="120" w:type="dxa"/>
-            </w:tcMar>
-          </w:tcPr>
-          <w:p>
-            <w:pPr>
-              <w:spacing w:after="0" w:line="276" w:lineRule="auto"/>
-            </w:pPr>
-            <w:r/>
-            <w:r>
-              <w:rPr>
-                <w:rFonts w:ascii="Calibri" w:hAnsi="Calibri"/>
-                <w:b w:val="0"/>
-                <w:color w:val="1F2937"/>
-                <w:sz w:val="18"/>
-              </w:rPr>
-              <w:t>After approval, send exact planning-call draft</w:t>
             </w:r>
           </w:p>
         </w:tc>
@@ -4490,7 +4891,7 @@
         </w:tc>
         <w:tc>
           <w:tcPr>
-            <w:tcW w:type="dxa" w:w="2088"/>
+            <w:tcW w:type="dxa" w:w="2232"/>
             <w:vAlign w:val="center"/>
             <w:tcMar>
               <w:top w:w="80" w:type="dxa"/>
@@ -4517,7 +4918,7 @@
         </w:tc>
         <w:tc>
           <w:tcPr>
-            <w:tcW w:type="dxa" w:w="1440"/>
+            <w:tcW w:type="dxa" w:w="1584"/>
             <w:vAlign w:val="center"/>
             <w:tcMar>
               <w:top w:w="80" w:type="dxa"/>
@@ -4538,13 +4939,13 @@
                 <w:color w:val="1F2937"/>
                 <w:sz w:val="18"/>
               </w:rPr>
-              <w:t>Drafted not sent</w:t>
+              <w:t>Drafted not sent; stale attachment audit logged</w:t>
             </w:r>
           </w:p>
         </w:tc>
         <w:tc>
           <w:tcPr>
-            <w:tcW w:type="dxa" w:w="3024"/>
+            <w:tcW w:type="dxa" w:w="4752"/>
             <w:vAlign w:val="center"/>
             <w:tcMar>
               <w:top w:w="80" w:type="dxa"/>
@@ -4566,33 +4967,6 @@
                 <w:sz w:val="18"/>
               </w:rPr>
               <w:t>Meeting response, pledge interest, or partner payment path</w:t>
-            </w:r>
-          </w:p>
-        </w:tc>
-        <w:tc>
-          <w:tcPr>
-            <w:tcW w:type="dxa" w:w="2016"/>
-            <w:vAlign w:val="center"/>
-            <w:tcMar>
-              <w:top w:w="80" w:type="dxa"/>
-              <w:start w:w="120" w:type="dxa"/>
-              <w:bottom w:w="80" w:type="dxa"/>
-              <w:end w:w="120" w:type="dxa"/>
-            </w:tcMar>
-          </w:tcPr>
-          <w:p>
-            <w:pPr>
-              <w:spacing w:after="0" w:line="276" w:lineRule="auto"/>
-            </w:pPr>
-            <w:r/>
-            <w:r>
-              <w:rPr>
-                <w:rFonts w:ascii="Calibri" w:hAnsi="Calibri"/>
-                <w:b w:val="0"/>
-                <w:color w:val="1F2937"/>
-                <w:sz w:val="18"/>
-              </w:rPr>
-              <w:t>After approval, send exact planning-call draft</w:t>
             </w:r>
           </w:p>
         </w:tc>
@@ -4828,7 +5202,7 @@
                 <w:color w:val="1F2937"/>
                 <w:sz w:val="18"/>
               </w:rPr>
-              <w:t>1</w:t>
+              <w:t>3</w:t>
             </w:r>
           </w:p>
         </w:tc>
@@ -4909,7 +5283,7 @@
                 <w:color w:val="1F2937"/>
                 <w:sz w:val="18"/>
               </w:rPr>
-              <w:t>$32,991 public listing; public page showed in stock on August 2, 2026; $500 deposit path shown but not authorized</w:t>
+              <w:t>$32,991 public listing; public page shows Coming Soon; public deposit/financing paths are not authorized</w:t>
             </w:r>
           </w:p>
         </w:tc>
@@ -4936,7 +5310,7 @@
                 <w:color w:val="1F2937"/>
                 <w:sz w:val="18"/>
               </w:rPr>
-              <w:t>Purchase/finance path only after written quote and insurance bindability</w:t>
+              <w:t>Purchase/finance path only after written quote, release timing, and insurance bindability</w:t>
             </w:r>
           </w:p>
         </w:tc>
@@ -4963,7 +5337,7 @@
                 <w:color w:val="1F2937"/>
                 <w:sz w:val="18"/>
               </w:rPr>
-              <w:t>Call MobilityWorks Aurora and ask whether KR692569A is still available for Wheatland business-use diligence, without deposit or application.</w:t>
+              <w:t>Call MobilityWorks Aurora and ask whether KR692569A can be released by August 15 for Wheatland business-use diligence, without deposit or application.</w:t>
             </w:r>
           </w:p>
         </w:tc>
@@ -4992,7 +5366,7 @@
                 <w:color w:val="1F2937"/>
                 <w:sz w:val="18"/>
               </w:rPr>
-              <w:t>2</w:t>
+              <w:t>6</w:t>
             </w:r>
           </w:p>
         </w:tc>
@@ -5073,7 +5447,7 @@
                 <w:color w:val="1F2937"/>
                 <w:sz w:val="18"/>
               </w:rPr>
-              <w:t>Request pricing</w:t>
+              <w:t>Request pricing; public page shows Coming Soon</w:t>
             </w:r>
           </w:p>
         </w:tc>
@@ -5100,7 +5474,7 @@
                 <w:color w:val="1F2937"/>
                 <w:sz w:val="18"/>
               </w:rPr>
-              <w:t>Commercial quote path after price, insurance, and inspection review</w:t>
+              <w:t>Commercial quote path after price, insurance, release timing, and inspection review</w:t>
             </w:r>
           </w:p>
         </w:tc>
@@ -5127,7 +5501,7 @@
                 <w:color w:val="1F2937"/>
                 <w:sz w:val="18"/>
               </w:rPr>
-              <w:t>Ask commercial team for price, commercial-use terms, securement details, inspection history, and delivery timing.</w:t>
+              <w:t>Ask commercial team for price, release timing, commercial-use terms, securement details, inspection history, and delivery timing.</w:t>
             </w:r>
           </w:p>
         </w:tc>
@@ -6140,7 +6514,7 @@
                 <w:color w:val="1F2937"/>
                 <w:sz w:val="18"/>
               </w:rPr>
-              <w:t>7</w:t>
+              <w:t>2</w:t>
             </w:r>
           </w:p>
         </w:tc>
@@ -6221,7 +6595,7 @@
                 <w:color w:val="1F2937"/>
                 <w:sz w:val="18"/>
               </w:rPr>
-              <w:t>Rates require quote; public rental page lists CO-Denver/Aurora contact path, rental number (877) 275-4915, side-entry/rear-entry accessible vans, tie-downs, and 150 free miles per day</w:t>
+              <w:t>Rates require quote; public rental page lists rental number (877) 275-4915, side-entry/rear-entry accessible vans, retractable tie-downs, 150 free miles per day, and weekly/monthly discounts</w:t>
             </w:r>
           </w:p>
         </w:tc>
@@ -6304,7 +6678,7 @@
                 <w:color w:val="1F2937"/>
                 <w:sz w:val="18"/>
               </w:rPr>
-              <w:t>8</w:t>
+              <w:t>1</w:t>
             </w:r>
           </w:p>
         </w:tc>
@@ -6385,7 +6759,7 @@
                 <w:color w:val="1F2937"/>
                 <w:sz w:val="18"/>
               </w:rPr>
-              <w:t>Public rental page lists $135/day up to 1 week, $770/week up to 1 month, $2,400/month up to 1 year; tax, delivery, and pickup fees excluded; availability requires call</w:t>
+              <w:t>Public pages list daily/weekly/monthly rental availability by call; prior rental page/rate snapshot listed $135/day, $770/week, and $2,400/month before tax/delivery/pickup fees; availability requires call</w:t>
             </w:r>
           </w:p>
         </w:tc>
@@ -6412,7 +6786,7 @@
                 <w:color w:val="1F2937"/>
                 <w:sz w:val="18"/>
               </w:rPr>
-              <w:t>Rental, sale, service-support, or inspection path if primary MobilityWorks/United Access paths slip</w:t>
+              <w:t>Rental, sale, service-support, or inspection path if business-use terms work</w:t>
             </w:r>
           </w:p>
         </w:tc>
@@ -6439,7 +6813,7 @@
                 <w:color w:val="1F2937"/>
                 <w:sz w:val="18"/>
               </w:rPr>
-              <w:t>Call Cheyenne first for August 10-15 availability and business-use requirements.</w:t>
+              <w:t>Call Cheyenne using 307-263-7662 first and 307-637-7663 as backup for August 10-15 availability and business-use requirements.</w:t>
             </w:r>
           </w:p>
         </w:tc>

</xml_diff>